<commit_message>
Prints the ticker under investigation with their category
</commit_message>
<xml_diff>
--- a/src/steps/docx_output/thesis.docx
+++ b/src/steps/docx_output/thesis.docx
@@ -23,6 +23,219 @@
     <w:p>
       <w:r>
         <w:t>3. Marubozu</w:t>
+      </w:r>
+    </w:p>
+    <w:p>
+      <w:pPr>
+        <w:pStyle w:val="Heading1"/>
+      </w:pPr>
+      <w:r>
+        <w:t>4.2 Sectors Under Investigation</w:t>
+      </w:r>
+    </w:p>
+    <w:p>
+      <w:pPr>
+        <w:pStyle w:val="Heading2"/>
+      </w:pPr>
+      <w:r>
+        <w:t>Banks</w:t>
+      </w:r>
+    </w:p>
+    <w:p>
+      <w:r>
+        <w:rPr>
+          <w:b/>
+        </w:rPr>
+        <w:t>Stocks:</w:t>
+      </w:r>
+    </w:p>
+    <w:p>
+      <w:r>
+        <w:t xml:space="preserve">  - NABIL</w:t>
+      </w:r>
+    </w:p>
+    <w:p>
+      <w:r>
+        <w:t xml:space="preserve">  - NIB</w:t>
+      </w:r>
+    </w:p>
+    <w:p>
+      <w:r>
+        <w:t xml:space="preserve">  - NICA</w:t>
+      </w:r>
+    </w:p>
+    <w:p>
+      <w:r>
+        <w:t xml:space="preserve">  - EBL</w:t>
+      </w:r>
+    </w:p>
+    <w:p>
+      <w:r>
+        <w:t xml:space="preserve">  - GBIME</w:t>
+      </w:r>
+    </w:p>
+    <w:p>
+      <w:pPr>
+        <w:pStyle w:val="Heading2"/>
+      </w:pPr>
+      <w:r>
+        <w:t>Hydro</w:t>
+      </w:r>
+    </w:p>
+    <w:p>
+      <w:r>
+        <w:rPr>
+          <w:b/>
+        </w:rPr>
+        <w:t>Stocks:</w:t>
+      </w:r>
+    </w:p>
+    <w:p>
+      <w:r>
+        <w:t xml:space="preserve">  - NHPC</w:t>
+      </w:r>
+    </w:p>
+    <w:p>
+      <w:r>
+        <w:t xml:space="preserve">  - BPCL</w:t>
+      </w:r>
+    </w:p>
+    <w:p>
+      <w:r>
+        <w:t xml:space="preserve">  - AHPC</w:t>
+      </w:r>
+    </w:p>
+    <w:p>
+      <w:r>
+        <w:t xml:space="preserve">  - CHCL</w:t>
+      </w:r>
+    </w:p>
+    <w:p>
+      <w:r>
+        <w:t xml:space="preserve">  - SHPC</w:t>
+      </w:r>
+    </w:p>
+    <w:p>
+      <w:pPr>
+        <w:pStyle w:val="Heading2"/>
+      </w:pPr>
+      <w:r>
+        <w:t>Microfinance</w:t>
+      </w:r>
+    </w:p>
+    <w:p>
+      <w:r>
+        <w:rPr>
+          <w:b/>
+        </w:rPr>
+        <w:t>Stocks:</w:t>
+      </w:r>
+    </w:p>
+    <w:p>
+      <w:r>
+        <w:t xml:space="preserve">  - NMBMF</w:t>
+      </w:r>
+    </w:p>
+    <w:p>
+      <w:r>
+        <w:t xml:space="preserve">  - CBBL</w:t>
+      </w:r>
+    </w:p>
+    <w:p>
+      <w:r>
+        <w:t xml:space="preserve">  - DDBL</w:t>
+      </w:r>
+    </w:p>
+    <w:p>
+      <w:r>
+        <w:t xml:space="preserve">  - SKBBL</w:t>
+      </w:r>
+    </w:p>
+    <w:p>
+      <w:r>
+        <w:t xml:space="preserve">  - SWBBL</w:t>
+      </w:r>
+    </w:p>
+    <w:p>
+      <w:pPr>
+        <w:pStyle w:val="Heading2"/>
+      </w:pPr>
+      <w:r>
+        <w:t>Expensive</w:t>
+      </w:r>
+    </w:p>
+    <w:p>
+      <w:r>
+        <w:rPr>
+          <w:b/>
+        </w:rPr>
+        <w:t>Stocks:</w:t>
+      </w:r>
+    </w:p>
+    <w:p>
+      <w:r>
+        <w:t xml:space="preserve">  - UNL</w:t>
+      </w:r>
+    </w:p>
+    <w:p>
+      <w:r>
+        <w:t xml:space="preserve">  - BNT</w:t>
+      </w:r>
+    </w:p>
+    <w:p>
+      <w:r>
+        <w:t xml:space="preserve">  - RBCL</w:t>
+      </w:r>
+    </w:p>
+    <w:p>
+      <w:r>
+        <w:t xml:space="preserve">  - STC</w:t>
+      </w:r>
+    </w:p>
+    <w:p>
+      <w:r>
+        <w:t xml:space="preserve">  - BBC</w:t>
+      </w:r>
+    </w:p>
+    <w:p>
+      <w:pPr>
+        <w:pStyle w:val="Heading2"/>
+      </w:pPr>
+      <w:r>
+        <w:t>Low Floating</w:t>
+      </w:r>
+    </w:p>
+    <w:p>
+      <w:r>
+        <w:rPr>
+          <w:b/>
+        </w:rPr>
+        <w:t>Stocks:</w:t>
+      </w:r>
+    </w:p>
+    <w:p>
+      <w:r>
+        <w:t xml:space="preserve">  - SAMAJ</w:t>
+      </w:r>
+    </w:p>
+    <w:p>
+      <w:r>
+        <w:t xml:space="preserve">  - DHPL</w:t>
+      </w:r>
+    </w:p>
+    <w:p>
+      <w:r>
+        <w:t xml:space="preserve">  - SSHL</w:t>
+      </w:r>
+    </w:p>
+    <w:p>
+      <w:r>
+        <w:t xml:space="preserve">  - NHPC</w:t>
+      </w:r>
+    </w:p>
+    <w:p>
+      <w:r>
+        <w:t xml:space="preserve">  - AKJCL</w:t>
       </w:r>
     </w:p>
     <w:sectPr>

</xml_diff>

<commit_message>
Add placeholder for tables
</commit_message>
<xml_diff>
--- a/src/steps/docx_output/thesis.docx
+++ b/src/steps/docx_output/thesis.docx
@@ -220,22 +220,375 @@
     </w:p>
     <w:p>
       <w:r>
-        <w:t xml:space="preserve">  - DHPL</w:t>
+        <w:t xml:space="preserve">  - SMH</w:t>
       </w:r>
     </w:p>
     <w:p>
       <w:r>
-        <w:t xml:space="preserve">  - SSHL</w:t>
+        <w:t xml:space="preserve">  - SPL</w:t>
       </w:r>
     </w:p>
     <w:p>
       <w:r>
-        <w:t xml:space="preserve">  - NHPC</w:t>
+        <w:t xml:space="preserve">  - KBSH</w:t>
       </w:r>
     </w:p>
     <w:p>
       <w:r>
-        <w:t xml:space="preserve">  - AKJCL</w:t>
+        <w:t xml:space="preserve">  - BHPL</w:t>
+      </w:r>
+    </w:p>
+    <w:p>
+      <w:pPr>
+        <w:pStyle w:val="Heading1"/>
+      </w:pPr>
+      <w:r>
+        <w:t>4.3 Longterm Trends Under Study:</w:t>
+      </w:r>
+    </w:p>
+    <w:p>
+      <w:r>
+        <w:t xml:space="preserve">  - Bullish</w:t>
+      </w:r>
+    </w:p>
+    <w:p>
+      <w:r>
+        <w:t xml:space="preserve">  - Bearish</w:t>
+      </w:r>
+    </w:p>
+    <w:p>
+      <w:pPr>
+        <w:pStyle w:val="Heading1"/>
+      </w:pPr>
+      <w:r>
+        <w:t>4.4 Shortterm Trends Under Study:</w:t>
+      </w:r>
+    </w:p>
+    <w:p>
+      <w:r>
+        <w:t xml:space="preserve">  - yes</w:t>
+      </w:r>
+    </w:p>
+    <w:p>
+      <w:r>
+        <w:t xml:space="preserve">  - no</w:t>
+      </w:r>
+    </w:p>
+    <w:p>
+      <w:pPr>
+        <w:pStyle w:val="Heading1"/>
+      </w:pPr>
+      <w:r>
+        <w:t>4.5 Criterias for Analysis:</w:t>
+      </w:r>
+    </w:p>
+    <w:p>
+      <w:r>
+        <w:t xml:space="preserve">  - Low/High</w:t>
+      </w:r>
+    </w:p>
+    <w:p>
+      <w:r>
+        <w:t xml:space="preserve">  - Close</w:t>
+      </w:r>
+    </w:p>
+    <w:p>
+      <w:pPr>
+        <w:pStyle w:val="Heading1"/>
+      </w:pPr>
+      <w:r>
+        <w:t>4.6 Observation Durations:</w:t>
+      </w:r>
+    </w:p>
+    <w:p>
+      <w:r>
+        <w:t xml:space="preserve">  - 2 Days</w:t>
+      </w:r>
+    </w:p>
+    <w:p>
+      <w:r>
+        <w:t xml:space="preserve">  - 4 Days</w:t>
+      </w:r>
+    </w:p>
+    <w:p>
+      <w:r>
+        <w:t xml:space="preserve">  - 8 Days</w:t>
+      </w:r>
+    </w:p>
+    <w:p>
+      <w:pPr>
+        <w:pStyle w:val="Heading1"/>
+      </w:pPr>
+      <w:r>
+        <w:t>4.7 Descriptive Analysis:</w:t>
+      </w:r>
+    </w:p>
+    <w:p>
+      <w:pPr>
+        <w:pStyle w:val="Heading1"/>
+      </w:pPr>
+      <w:r>
+        <w:t xml:space="preserve"> Image for Banks Stocks  in  Bullish Market</w:t>
+      </w:r>
+    </w:p>
+    <w:p>
+      <w:r>
+        <w:t>Table 1. Candles Observation for Banks Stocks in Bullish Market</w:t>
+      </w:r>
+    </w:p>
+    <w:p>
+      <w:pPr>
+        <w:pStyle w:val="Heading1"/>
+      </w:pPr>
+      <w:r>
+        <w:t xml:space="preserve"> Image for Hydro Stocks  in  Bullish Market</w:t>
+      </w:r>
+    </w:p>
+    <w:p>
+      <w:r>
+        <w:t>Table 2. Candles Observation for Hydro Stocks in Bullish Market</w:t>
+      </w:r>
+    </w:p>
+    <w:p>
+      <w:pPr>
+        <w:pStyle w:val="Heading1"/>
+      </w:pPr>
+      <w:r>
+        <w:t xml:space="preserve"> Image for Microfinance Stocks  in  Bullish Market</w:t>
+      </w:r>
+    </w:p>
+    <w:p>
+      <w:r>
+        <w:t>Table 3. Candles Observation for Microfinance Stocks in Bullish Market</w:t>
+      </w:r>
+    </w:p>
+    <w:p>
+      <w:pPr>
+        <w:pStyle w:val="Heading1"/>
+      </w:pPr>
+      <w:r>
+        <w:t xml:space="preserve"> Image for Expensive Stocks  in  Bullish Market</w:t>
+      </w:r>
+    </w:p>
+    <w:p>
+      <w:r>
+        <w:t>Table 4. Candles Observation for Expensive Stocks in Bullish Market</w:t>
+      </w:r>
+    </w:p>
+    <w:p>
+      <w:pPr>
+        <w:pStyle w:val="Heading1"/>
+      </w:pPr>
+      <w:r>
+        <w:t xml:space="preserve"> Image for Low Floating Stocks  in  Bullish Market</w:t>
+      </w:r>
+    </w:p>
+    <w:p>
+      <w:r>
+        <w:t>Table 5. Candles Observation for Low Floating Stocks in Bullish Market</w:t>
+      </w:r>
+    </w:p>
+    <w:p>
+      <w:pPr>
+        <w:pStyle w:val="Heading1"/>
+      </w:pPr>
+      <w:r>
+        <w:t xml:space="preserve"> Image for Banks Stocks  in  Bearish Market</w:t>
+      </w:r>
+    </w:p>
+    <w:p>
+      <w:r>
+        <w:t>Table 6. Candles Observation for Banks Stocks in Bearish Market</w:t>
+      </w:r>
+    </w:p>
+    <w:p>
+      <w:pPr>
+        <w:pStyle w:val="Heading1"/>
+      </w:pPr>
+      <w:r>
+        <w:t xml:space="preserve"> Image for Hydro Stocks  in  Bearish Market</w:t>
+      </w:r>
+    </w:p>
+    <w:p>
+      <w:r>
+        <w:t>Table 7. Candles Observation for Hydro Stocks in Bearish Market</w:t>
+      </w:r>
+    </w:p>
+    <w:p>
+      <w:pPr>
+        <w:pStyle w:val="Heading1"/>
+      </w:pPr>
+      <w:r>
+        <w:t xml:space="preserve"> Image for Microfinance Stocks  in  Bearish Market</w:t>
+      </w:r>
+    </w:p>
+    <w:p>
+      <w:r>
+        <w:t>Table 8. Candles Observation for Microfinance Stocks in Bearish Market</w:t>
+      </w:r>
+    </w:p>
+    <w:p>
+      <w:pPr>
+        <w:pStyle w:val="Heading1"/>
+      </w:pPr>
+      <w:r>
+        <w:t xml:space="preserve"> Image for Expensive Stocks  in  Bearish Market</w:t>
+      </w:r>
+    </w:p>
+    <w:p>
+      <w:r>
+        <w:t>Table 9. Candles Observation for Expensive Stocks in Bearish Market</w:t>
+      </w:r>
+    </w:p>
+    <w:p>
+      <w:pPr>
+        <w:pStyle w:val="Heading1"/>
+      </w:pPr>
+      <w:r>
+        <w:t xml:space="preserve"> Image for Low Floating Stocks  in  Bearish Market</w:t>
+      </w:r>
+    </w:p>
+    <w:p>
+      <w:r>
+        <w:t>Table 10. Candles Observation for Low Floating Stocks in Bearish Market</w:t>
+      </w:r>
+    </w:p>
+    <w:p>
+      <w:pPr>
+        <w:pStyle w:val="Heading1"/>
+      </w:pPr>
+      <w:r>
+        <w:t>4.8 Inferal Analysis:</w:t>
+      </w:r>
+    </w:p>
+    <w:p>
+      <w:pPr>
+        <w:pStyle w:val="Heading1"/>
+      </w:pPr>
+      <w:r>
+        <w:t xml:space="preserve"> Image for Banks Stocks  in  Bullish Market</w:t>
+      </w:r>
+    </w:p>
+    <w:p>
+      <w:r>
+        <w:t>Table 11. Chi-square test for Banks Stocks  in Bullish Market</w:t>
+      </w:r>
+    </w:p>
+    <w:p>
+      <w:pPr>
+        <w:pStyle w:val="Heading1"/>
+      </w:pPr>
+      <w:r>
+        <w:t xml:space="preserve"> Image for Hydro Stocks  in  Bullish Market</w:t>
+      </w:r>
+    </w:p>
+    <w:p>
+      <w:r>
+        <w:t>Table 12. Chi-square test for Hydro Stocks  in Bullish Market</w:t>
+      </w:r>
+    </w:p>
+    <w:p>
+      <w:pPr>
+        <w:pStyle w:val="Heading1"/>
+      </w:pPr>
+      <w:r>
+        <w:t xml:space="preserve"> Image for Microfinance Stocks  in  Bullish Market</w:t>
+      </w:r>
+    </w:p>
+    <w:p>
+      <w:r>
+        <w:t>Table 13. Chi-square test for Microfinance Stocks  in Bullish Market</w:t>
+      </w:r>
+    </w:p>
+    <w:p>
+      <w:pPr>
+        <w:pStyle w:val="Heading1"/>
+      </w:pPr>
+      <w:r>
+        <w:t xml:space="preserve"> Image for Expensive Stocks  in  Bullish Market</w:t>
+      </w:r>
+    </w:p>
+    <w:p>
+      <w:r>
+        <w:t>Table 14. Chi-square test for Expensive Stocks  in Bullish Market</w:t>
+      </w:r>
+    </w:p>
+    <w:p>
+      <w:pPr>
+        <w:pStyle w:val="Heading1"/>
+      </w:pPr>
+      <w:r>
+        <w:t xml:space="preserve"> Image for Low Floating Stocks  in  Bullish Market</w:t>
+      </w:r>
+    </w:p>
+    <w:p>
+      <w:r>
+        <w:t>Table 15. Chi-square test for Low Floating Stocks  in Bullish Market</w:t>
+      </w:r>
+    </w:p>
+    <w:p>
+      <w:pPr>
+        <w:pStyle w:val="Heading1"/>
+      </w:pPr>
+      <w:r>
+        <w:t xml:space="preserve"> Image for Banks Stocks  in  Bearish Market</w:t>
+      </w:r>
+    </w:p>
+    <w:p>
+      <w:r>
+        <w:t>Table 16. Chi-square test for Banks Stocks  in Bearish Market</w:t>
+      </w:r>
+    </w:p>
+    <w:p>
+      <w:pPr>
+        <w:pStyle w:val="Heading1"/>
+      </w:pPr>
+      <w:r>
+        <w:t xml:space="preserve"> Image for Hydro Stocks  in  Bearish Market</w:t>
+      </w:r>
+    </w:p>
+    <w:p>
+      <w:r>
+        <w:t>Table 17. Chi-square test for Hydro Stocks  in Bearish Market</w:t>
+      </w:r>
+    </w:p>
+    <w:p>
+      <w:pPr>
+        <w:pStyle w:val="Heading1"/>
+      </w:pPr>
+      <w:r>
+        <w:t xml:space="preserve"> Image for Microfinance Stocks  in  Bearish Market</w:t>
+      </w:r>
+    </w:p>
+    <w:p>
+      <w:r>
+        <w:t>Table 18. Chi-square test for Microfinance Stocks  in Bearish Market</w:t>
+      </w:r>
+    </w:p>
+    <w:p>
+      <w:pPr>
+        <w:pStyle w:val="Heading1"/>
+      </w:pPr>
+      <w:r>
+        <w:t xml:space="preserve"> Image for Expensive Stocks  in  Bearish Market</w:t>
+      </w:r>
+    </w:p>
+    <w:p>
+      <w:r>
+        <w:t>Table 19. Chi-square test for Expensive Stocks  in Bearish Market</w:t>
+      </w:r>
+    </w:p>
+    <w:p>
+      <w:pPr>
+        <w:pStyle w:val="Heading1"/>
+      </w:pPr>
+      <w:r>
+        <w:t xml:space="preserve"> Image for Low Floating Stocks  in  Bearish Market</w:t>
+      </w:r>
+    </w:p>
+    <w:p>
+      <w:r>
+        <w:t>Table 20. Chi-square test for Low Floating Stocks  in Bearish Market</w:t>
       </w:r>
     </w:p>
     <w:sectPr>

</xml_diff>

<commit_message>
updated stocks with stocks available in our db
</commit_message>
<xml_diff>
--- a/src/steps/docx_output/thesis.docx
+++ b/src/steps/docx_output/thesis.docx
@@ -2,6 +2,258 @@
 <file path=word/document.xml><?xml version="1.0" encoding="utf-8"?>
 <w:document xmlns:wpc="http://schemas.microsoft.com/office/word/2010/wordprocessingCanvas" xmlns:mo="http://schemas.microsoft.com/office/mac/office/2008/main" xmlns:mc="http://schemas.openxmlformats.org/markup-compatibility/2006" xmlns:mv="urn:schemas-microsoft-com:mac:vml" xmlns:o="urn:schemas-microsoft-com:office:office" xmlns:r="http://schemas.openxmlformats.org/officeDocument/2006/relationships" xmlns:m="http://schemas.openxmlformats.org/officeDocument/2006/math" xmlns:v="urn:schemas-microsoft-com:vml" xmlns:wp14="http://schemas.microsoft.com/office/word/2010/wordprocessingDrawing" xmlns:wp="http://schemas.openxmlformats.org/drawingml/2006/wordprocessingDrawing" xmlns:w10="urn:schemas-microsoft-com:office:word" xmlns:w="http://schemas.openxmlformats.org/wordprocessingml/2006/main" xmlns:w14="http://schemas.microsoft.com/office/word/2010/wordml" xmlns:wpg="http://schemas.microsoft.com/office/word/2010/wordprocessingGroup" xmlns:wpi="http://schemas.microsoft.com/office/word/2010/wordprocessingInk" xmlns:wne="http://schemas.microsoft.com/office/word/2006/wordml" xmlns:wps="http://schemas.microsoft.com/office/word/2010/wordprocessingShape" mc:Ignorable="w14 wp14">
   <w:body>
+    <w:p>
+      <w:pPr>
+        <w:pStyle w:val="Title"/>
+      </w:pPr>
+      <w:r>
+        <w:t>Document Title</w:t>
+      </w:r>
+    </w:p>
+    <w:p>
+      <w:r>
+        <w:t>This is a simple paragraph.</w:t>
+      </w:r>
+    </w:p>
+    <w:p>
+      <w:pPr>
+        <w:pStyle w:val="ListBullet"/>
+      </w:pPr>
+      <w:r>
+        <w:t>First item in the list</w:t>
+      </w:r>
+    </w:p>
+    <w:p>
+      <w:pPr>
+        <w:pStyle w:val="ListBullet"/>
+      </w:pPr>
+      <w:r>
+        <w:t>Second item in the list</w:t>
+      </w:r>
+    </w:p>
+    <w:p>
+      <w:pPr>
+        <w:pStyle w:val="ListNumber"/>
+      </w:pPr>
+      <w:r>
+        <w:t>First item in the numbered list</w:t>
+      </w:r>
+    </w:p>
+    <w:p>
+      <w:pPr>
+        <w:pStyle w:val="ListNumber"/>
+      </w:pPr>
+      <w:r>
+        <w:t>Second item in the numbered list</w:t>
+      </w:r>
+    </w:p>
+    <w:tbl>
+      <w:tblPr>
+        <w:tblStyle w:val="TableGrid"/>
+        <w:tblW w:type="auto" w:w="0"/>
+        <w:tblLook w:firstColumn="1" w:firstRow="1" w:lastColumn="0" w:lastRow="0" w:noHBand="0" w:noVBand="1" w:val="04A0"/>
+      </w:tblPr>
+      <w:tblGrid>
+        <w:gridCol w:w="4320"/>
+        <w:gridCol w:w="4320"/>
+      </w:tblGrid>
+      <w:tr>
+        <w:tc>
+          <w:tcPr>
+            <w:tcW w:type="dxa" w:w="4320"/>
+          </w:tcPr>
+          <w:p>
+            <w:r>
+              <w:rPr>
+                <w:b/>
+                <w:color w:val="0000FF"/>
+              </w:rPr>
+              <w:t>Name</w:t>
+            </w:r>
+          </w:p>
+        </w:tc>
+        <w:tc>
+          <w:tcPr>
+            <w:tcW w:type="dxa" w:w="4320"/>
+          </w:tcPr>
+          <w:p>
+            <w:r>
+              <w:rPr>
+                <w:b/>
+                <w:color w:val="0000FF"/>
+              </w:rPr>
+              <w:t>Age</w:t>
+            </w:r>
+          </w:p>
+        </w:tc>
+      </w:tr>
+      <w:tr>
+        <w:tc>
+          <w:tcPr>
+            <w:tcW w:type="dxa" w:w="4320"/>
+          </w:tcPr>
+          <w:p>
+            <w:r>
+              <w:t>John Doe</w:t>
+            </w:r>
+          </w:p>
+        </w:tc>
+        <w:tc>
+          <w:tcPr>
+            <w:tcW w:type="dxa" w:w="4320"/>
+          </w:tcPr>
+          <w:p>
+            <w:r>
+              <w:t>30</w:t>
+            </w:r>
+          </w:p>
+        </w:tc>
+      </w:tr>
+    </w:tbl>
+    <w:p>
+      <w:r>
+        <w:drawing>
+          <wp:inline xmlns:a="http://schemas.openxmlformats.org/drawingml/2006/main" xmlns:pic="http://schemas.openxmlformats.org/drawingml/2006/picture">
+            <wp:extent cx="3657600" cy="2743200"/>
+            <wp:docPr id="1" name="Picture 1"/>
+            <wp:cNvGraphicFramePr>
+              <a:graphicFrameLocks noChangeAspect="1"/>
+            </wp:cNvGraphicFramePr>
+            <a:graphic>
+              <a:graphicData uri="http://schemas.openxmlformats.org/drawingml/2006/picture">
+                <pic:pic>
+                  <pic:nvPicPr>
+                    <pic:cNvPr id="0" name="image.png"/>
+                    <pic:cNvPicPr/>
+                  </pic:nvPicPr>
+                  <pic:blipFill>
+                    <a:blip r:embed="rId9"/>
+                    <a:stretch>
+                      <a:fillRect/>
+                    </a:stretch>
+                  </pic:blipFill>
+                  <pic:spPr>
+                    <a:xfrm>
+                      <a:off x="0" y="0"/>
+                      <a:ext cx="3657600" cy="2743200"/>
+                    </a:xfrm>
+                    <a:prstGeom prst="rect"/>
+                  </pic:spPr>
+                </pic:pic>
+              </a:graphicData>
+            </a:graphic>
+          </wp:inline>
+        </w:drawing>
+      </w:r>
+    </w:p>
+    <w:p>
+      <w:r>
+        <w:drawing>
+          <wp:inline xmlns:a="http://schemas.openxmlformats.org/drawingml/2006/main" xmlns:pic="http://schemas.openxmlformats.org/drawingml/2006/picture">
+            <wp:extent cx="3657600" cy="2743200"/>
+            <wp:docPr id="2" name="Picture 2"/>
+            <wp:cNvGraphicFramePr>
+              <a:graphicFrameLocks noChangeAspect="1"/>
+            </wp:cNvGraphicFramePr>
+            <a:graphic>
+              <a:graphicData uri="http://schemas.openxmlformats.org/drawingml/2006/picture">
+                <pic:pic>
+                  <pic:nvPicPr>
+                    <pic:cNvPr id="0" name="image.png"/>
+                    <pic:cNvPicPr/>
+                  </pic:nvPicPr>
+                  <pic:blipFill>
+                    <a:blip r:embed="rId10"/>
+                    <a:stretch>
+                      <a:fillRect/>
+                    </a:stretch>
+                  </pic:blipFill>
+                  <pic:spPr>
+                    <a:xfrm>
+                      <a:off x="0" y="0"/>
+                      <a:ext cx="3657600" cy="2743200"/>
+                    </a:xfrm>
+                    <a:prstGeom prst="rect"/>
+                  </pic:spPr>
+                </pic:pic>
+              </a:graphicData>
+            </a:graphic>
+          </wp:inline>
+        </w:drawing>
+      </w:r>
+    </w:p>
+    <w:p>
+      <w:r>
+        <w:drawing>
+          <wp:inline xmlns:a="http://schemas.openxmlformats.org/drawingml/2006/main" xmlns:pic="http://schemas.openxmlformats.org/drawingml/2006/picture">
+            <wp:extent cx="3657600" cy="2743200"/>
+            <wp:docPr id="3" name="Picture 3"/>
+            <wp:cNvGraphicFramePr>
+              <a:graphicFrameLocks noChangeAspect="1"/>
+            </wp:cNvGraphicFramePr>
+            <a:graphic>
+              <a:graphicData uri="http://schemas.openxmlformats.org/drawingml/2006/picture">
+                <pic:pic>
+                  <pic:nvPicPr>
+                    <pic:cNvPr id="0" name="image.png"/>
+                    <pic:cNvPicPr/>
+                  </pic:nvPicPr>
+                  <pic:blipFill>
+                    <a:blip r:embed="rId11"/>
+                    <a:stretch>
+                      <a:fillRect/>
+                    </a:stretch>
+                  </pic:blipFill>
+                  <pic:spPr>
+                    <a:xfrm>
+                      <a:off x="0" y="0"/>
+                      <a:ext cx="3657600" cy="2743200"/>
+                    </a:xfrm>
+                    <a:prstGeom prst="rect"/>
+                  </pic:spPr>
+                </pic:pic>
+              </a:graphicData>
+            </a:graphic>
+          </wp:inline>
+        </w:drawing>
+      </w:r>
+    </w:p>
+    <w:p>
+      <w:r>
+        <w:drawing>
+          <wp:inline xmlns:a="http://schemas.openxmlformats.org/drawingml/2006/main" xmlns:pic="http://schemas.openxmlformats.org/drawingml/2006/picture">
+            <wp:extent cx="3657600" cy="2743200"/>
+            <wp:docPr id="4" name="Picture 4"/>
+            <wp:cNvGraphicFramePr>
+              <a:graphicFrameLocks noChangeAspect="1"/>
+            </wp:cNvGraphicFramePr>
+            <a:graphic>
+              <a:graphicData uri="http://schemas.openxmlformats.org/drawingml/2006/picture">
+                <pic:pic>
+                  <pic:nvPicPr>
+                    <pic:cNvPr id="0" name="image.png"/>
+                    <pic:cNvPicPr/>
+                  </pic:nvPicPr>
+                  <pic:blipFill>
+                    <a:blip r:embed="rId12"/>
+                    <a:stretch>
+                      <a:fillRect/>
+                    </a:stretch>
+                  </pic:blipFill>
+                  <pic:spPr>
+                    <a:xfrm>
+                      <a:off x="0" y="0"/>
+                      <a:ext cx="3657600" cy="2743200"/>
+                    </a:xfrm>
+                    <a:prstGeom prst="rect"/>
+                  </pic:spPr>
+                </pic:pic>
+              </a:graphicData>
+            </a:graphic>
+          </wp:inline>
+        </w:drawing>
+      </w:r>
+    </w:p>
     <w:p>
       <w:pPr>
         <w:pStyle w:val="Heading1"/>
@@ -112,7 +364,7 @@
     </w:p>
     <w:p>
       <w:r>
-        <w:t xml:space="preserve">  - BPCL - details of the ticker and reason of selection goes here</w:t>
+        <w:t xml:space="preserve">  - UPPER - details of the ticker and reason of selection goes here</w:t>
       </w:r>
     </w:p>
     <w:p>
@@ -122,7 +374,7 @@
     </w:p>
     <w:p>
       <w:r>
-        <w:t xml:space="preserve">  - CHCL - details of the ticker and reason of selection goes here</w:t>
+        <w:t xml:space="preserve">  - API - details of the ticker and reason of selection goes here</w:t>
       </w:r>
     </w:p>
     <w:p>
@@ -3470,7 +3722,7 @@
     </w:tbl>
     <w:p>
       <w:r>
-        <w:t>Table 2. Candles Observation for Hydro Stocks in Bullish Market</w:t>
+        <w:t>Table 2. Candles Observation for Banks Stocks in Bearish Market</w:t>
       </w:r>
     </w:p>
     <w:p>
@@ -5015,7 +5267,7 @@
     </w:tbl>
     <w:p>
       <w:r>
-        <w:t>Table 3. Candles Observation for Microfinance Stocks in Bullish Market</w:t>
+        <w:t>Table 3. Candles Observation for Hydro Stocks in Bullish Market</w:t>
       </w:r>
     </w:p>
     <w:p>
@@ -6560,7 +6812,7 @@
     </w:tbl>
     <w:p>
       <w:r>
-        <w:t>Table 4. Candles Observation for Expensive Stocks in Bullish Market</w:t>
+        <w:t>Table 4. Candles Observation for Hydro Stocks in Bearish Market</w:t>
       </w:r>
     </w:p>
     <w:p>
@@ -8105,7 +8357,7 @@
     </w:tbl>
     <w:p>
       <w:r>
-        <w:t>Table 5. Candles Observation for Low Floating Stocks in Bullish Market</w:t>
+        <w:t>Table 5. Candles Observation for Microfinance Stocks in Bullish Market</w:t>
       </w:r>
     </w:p>
     <w:p>
@@ -9650,7 +9902,7 @@
     </w:tbl>
     <w:p>
       <w:r>
-        <w:t>Table 6. Candles Observation for Banks Stocks in Bearish Market</w:t>
+        <w:t>Table 6. Candles Observation for Microfinance Stocks in Bearish Market</w:t>
       </w:r>
     </w:p>
     <w:p>
@@ -11195,7 +11447,7 @@
     </w:tbl>
     <w:p>
       <w:r>
-        <w:t>Table 7. Candles Observation for Hydro Stocks in Bearish Market</w:t>
+        <w:t>Table 7. Candles Observation for Expensive Stocks in Bullish Market</w:t>
       </w:r>
     </w:p>
     <w:p>
@@ -12740,7 +12992,7 @@
     </w:tbl>
     <w:p>
       <w:r>
-        <w:t>Table 8. Candles Observation for Microfinance Stocks in Bearish Market</w:t>
+        <w:t>Table 8. Candles Observation for Expensive Stocks in Bearish Market</w:t>
       </w:r>
     </w:p>
     <w:p>
@@ -14285,7 +14537,7 @@
     </w:tbl>
     <w:p>
       <w:r>
-        <w:t>Table 9. Candles Observation for Expensive Stocks in Bearish Market</w:t>
+        <w:t>Table 9. Candles Observation for Low Floating Stocks in Bullish Market</w:t>
       </w:r>
     </w:p>
     <w:p>
@@ -17664,7 +17916,7 @@
     </w:tbl>
     <w:p>
       <w:r>
-        <w:t>Table 12. Chi-square test for Hydro Stocks  in Bullish Market</w:t>
+        <w:t>Table 12. Chi-square test for Banks Stocks  in Bearish Market</w:t>
       </w:r>
     </w:p>
     <w:p>
@@ -18577,7 +18829,7 @@
     </w:tbl>
     <w:p>
       <w:r>
-        <w:t>Table 13. Chi-square test for Microfinance Stocks  in Bullish Market</w:t>
+        <w:t>Table 13. Chi-square test for Hydro Stocks  in Bullish Market</w:t>
       </w:r>
     </w:p>
     <w:p>
@@ -19490,7 +19742,7 @@
     </w:tbl>
     <w:p>
       <w:r>
-        <w:t>Table 14. Chi-square test for Expensive Stocks  in Bullish Market</w:t>
+        <w:t>Table 14. Chi-square test for Hydro Stocks  in Bearish Market</w:t>
       </w:r>
     </w:p>
     <w:p>
@@ -20403,7 +20655,7 @@
     </w:tbl>
     <w:p>
       <w:r>
-        <w:t>Table 15. Chi-square test for Low Floating Stocks  in Bullish Market</w:t>
+        <w:t>Table 15. Chi-square test for Microfinance Stocks  in Bullish Market</w:t>
       </w:r>
     </w:p>
     <w:p>
@@ -21316,7 +21568,7 @@
     </w:tbl>
     <w:p>
       <w:r>
-        <w:t>Table 16. Chi-square test for Banks Stocks  in Bearish Market</w:t>
+        <w:t>Table 16. Chi-square test for Microfinance Stocks  in Bearish Market</w:t>
       </w:r>
     </w:p>
     <w:p>
@@ -22229,7 +22481,7 @@
     </w:tbl>
     <w:p>
       <w:r>
-        <w:t>Table 17. Chi-square test for Hydro Stocks  in Bearish Market</w:t>
+        <w:t>Table 17. Chi-square test for Expensive Stocks  in Bullish Market</w:t>
       </w:r>
     </w:p>
     <w:p>
@@ -23142,7 +23394,7 @@
     </w:tbl>
     <w:p>
       <w:r>
-        <w:t>Table 18. Chi-square test for Microfinance Stocks  in Bearish Market</w:t>
+        <w:t>Table 18. Chi-square test for Expensive Stocks  in Bearish Market</w:t>
       </w:r>
     </w:p>
     <w:p>
@@ -24055,7 +24307,7 @@
     </w:tbl>
     <w:p>
       <w:r>
-        <w:t>Table 19. Chi-square test for Expensive Stocks  in Bearish Market</w:t>
+        <w:t>Table 19. Chi-square test for Low Floating Stocks  in Bullish Market</w:t>
       </w:r>
     </w:p>
     <w:p>
@@ -25092,6 +25344,493 @@
         <w:br/>
       </w:r>
     </w:p>
+    <w:sectPr>
+      <w:pgSz w:w="12240" w:h="15840"/>
+      <w:pgMar w:top="1440" w:right="1800" w:bottom="1440" w:left="1800" w:header="720" w:footer="720" w:gutter="0"/>
+      <w:cols w:space="720"/>
+      <w:docGrid w:linePitch="360"/>
+    </w:sectPr>
+    <w:tbl>
+      <w:tblPr>
+        <w:tblStyle w:val="TableGrid"/>
+        <w:tblW w:type="auto" w:w="0"/>
+        <w:tblLook w:firstColumn="1" w:firstRow="1" w:lastColumn="0" w:lastRow="0" w:noHBand="0" w:noVBand="1" w:val="04A0"/>
+      </w:tblPr>
+      <w:tblGrid>
+        <w:gridCol w:w="4320"/>
+        <w:gridCol w:w="4320"/>
+      </w:tblGrid>
+      <w:tr>
+        <w:tc>
+          <w:tcPr>
+            <w:tcW w:type="dxa" w:w="4320"/>
+          </w:tcPr>
+          <w:p>
+            <w:r>
+              <w:rPr>
+                <w:b/>
+                <w:color w:val="0000FF"/>
+              </w:rPr>
+              <w:t>Index</w:t>
+            </w:r>
+          </w:p>
+        </w:tc>
+        <w:tc>
+          <w:tcPr>
+            <w:tcW w:type="dxa" w:w="4320"/>
+          </w:tcPr>
+          <w:p>
+            <w:r>
+              <w:rPr>
+                <w:b/>
+                <w:color w:val="0000FF"/>
+              </w:rPr>
+              <w:t>Description</w:t>
+            </w:r>
+          </w:p>
+        </w:tc>
+      </w:tr>
+      <w:tr>
+        <w:tc>
+          <w:tcPr>
+            <w:tcW w:type="dxa" w:w="4320"/>
+          </w:tcPr>
+          <w:p>
+            <w:r>
+              <w:t>1</w:t>
+            </w:r>
+          </w:p>
+        </w:tc>
+        <w:tc>
+          <w:tcPr>
+            <w:tcW w:type="dxa" w:w="4320"/>
+          </w:tcPr>
+          <w:p>
+            <w:r>
+              <w:t>Description for item 1</w:t>
+            </w:r>
+          </w:p>
+        </w:tc>
+      </w:tr>
+      <w:tr>
+        <w:tc>
+          <w:tcPr>
+            <w:tcW w:type="dxa" w:w="4320"/>
+          </w:tcPr>
+          <w:p>
+            <w:r>
+              <w:t>2</w:t>
+            </w:r>
+          </w:p>
+        </w:tc>
+        <w:tc>
+          <w:tcPr>
+            <w:tcW w:type="dxa" w:w="4320"/>
+          </w:tcPr>
+          <w:p>
+            <w:r>
+              <w:t>Description for item 2</w:t>
+            </w:r>
+          </w:p>
+        </w:tc>
+      </w:tr>
+      <w:tr>
+        <w:tc>
+          <w:tcPr>
+            <w:tcW w:type="dxa" w:w="4320"/>
+          </w:tcPr>
+          <w:p>
+            <w:r>
+              <w:t>3</w:t>
+            </w:r>
+          </w:p>
+        </w:tc>
+        <w:tc>
+          <w:tcPr>
+            <w:tcW w:type="dxa" w:w="4320"/>
+          </w:tcPr>
+          <w:p>
+            <w:r>
+              <w:t>Description for item 3</w:t>
+            </w:r>
+          </w:p>
+        </w:tc>
+      </w:tr>
+      <w:tr>
+        <w:tc>
+          <w:tcPr>
+            <w:tcW w:type="dxa" w:w="4320"/>
+          </w:tcPr>
+          <w:p>
+            <w:r>
+              <w:t>4</w:t>
+            </w:r>
+          </w:p>
+        </w:tc>
+        <w:tc>
+          <w:tcPr>
+            <w:tcW w:type="dxa" w:w="4320"/>
+          </w:tcPr>
+          <w:p>
+            <w:r>
+              <w:t>Description for item 4</w:t>
+            </w:r>
+          </w:p>
+        </w:tc>
+      </w:tr>
+      <w:tr>
+        <w:tc>
+          <w:tcPr>
+            <w:tcW w:type="dxa" w:w="4320"/>
+          </w:tcPr>
+          <w:p>
+            <w:r>
+              <w:t>5</w:t>
+            </w:r>
+          </w:p>
+        </w:tc>
+        <w:tc>
+          <w:tcPr>
+            <w:tcW w:type="dxa" w:w="4320"/>
+          </w:tcPr>
+          <w:p>
+            <w:r>
+              <w:t>Description for item 5</w:t>
+            </w:r>
+          </w:p>
+        </w:tc>
+      </w:tr>
+      <w:tr>
+        <w:tc>
+          <w:tcPr>
+            <w:tcW w:type="dxa" w:w="4320"/>
+          </w:tcPr>
+          <w:p>
+            <w:r>
+              <w:t>6</w:t>
+            </w:r>
+          </w:p>
+        </w:tc>
+        <w:tc>
+          <w:tcPr>
+            <w:tcW w:type="dxa" w:w="4320"/>
+          </w:tcPr>
+          <w:p>
+            <w:r>
+              <w:t>Description for item 6</w:t>
+            </w:r>
+          </w:p>
+        </w:tc>
+      </w:tr>
+      <w:tr>
+        <w:tc>
+          <w:tcPr>
+            <w:tcW w:type="dxa" w:w="4320"/>
+          </w:tcPr>
+          <w:p>
+            <w:r>
+              <w:t>7</w:t>
+            </w:r>
+          </w:p>
+        </w:tc>
+        <w:tc>
+          <w:tcPr>
+            <w:tcW w:type="dxa" w:w="4320"/>
+          </w:tcPr>
+          <w:p>
+            <w:r>
+              <w:t>Description for item 7</w:t>
+            </w:r>
+          </w:p>
+        </w:tc>
+      </w:tr>
+      <w:tr>
+        <w:tc>
+          <w:tcPr>
+            <w:tcW w:type="dxa" w:w="4320"/>
+          </w:tcPr>
+          <w:p>
+            <w:r>
+              <w:t>8</w:t>
+            </w:r>
+          </w:p>
+        </w:tc>
+        <w:tc>
+          <w:tcPr>
+            <w:tcW w:type="dxa" w:w="4320"/>
+          </w:tcPr>
+          <w:p>
+            <w:r>
+              <w:t>Description for item 8</w:t>
+            </w:r>
+          </w:p>
+        </w:tc>
+      </w:tr>
+      <w:tr>
+        <w:tc>
+          <w:tcPr>
+            <w:tcW w:type="dxa" w:w="4320"/>
+          </w:tcPr>
+          <w:p>
+            <w:r>
+              <w:t>9</w:t>
+            </w:r>
+          </w:p>
+        </w:tc>
+        <w:tc>
+          <w:tcPr>
+            <w:tcW w:type="dxa" w:w="4320"/>
+          </w:tcPr>
+          <w:p>
+            <w:r>
+              <w:t>Description for item 9</w:t>
+            </w:r>
+          </w:p>
+        </w:tc>
+      </w:tr>
+      <w:tr>
+        <w:tc>
+          <w:tcPr>
+            <w:tcW w:type="dxa" w:w="4320"/>
+          </w:tcPr>
+          <w:p>
+            <w:r>
+              <w:t>10</w:t>
+            </w:r>
+          </w:p>
+        </w:tc>
+        <w:tc>
+          <w:tcPr>
+            <w:tcW w:type="dxa" w:w="4320"/>
+          </w:tcPr>
+          <w:p>
+            <w:r>
+              <w:t>Description for item 10</w:t>
+            </w:r>
+          </w:p>
+        </w:tc>
+      </w:tr>
+      <w:tr>
+        <w:tc>
+          <w:tcPr>
+            <w:tcW w:type="dxa" w:w="4320"/>
+          </w:tcPr>
+          <w:p>
+            <w:r>
+              <w:t>11</w:t>
+            </w:r>
+          </w:p>
+        </w:tc>
+        <w:tc>
+          <w:tcPr>
+            <w:tcW w:type="dxa" w:w="4320"/>
+          </w:tcPr>
+          <w:p>
+            <w:r>
+              <w:t>Description for item 11</w:t>
+            </w:r>
+          </w:p>
+        </w:tc>
+      </w:tr>
+      <w:tr>
+        <w:tc>
+          <w:tcPr>
+            <w:tcW w:type="dxa" w:w="4320"/>
+          </w:tcPr>
+          <w:p>
+            <w:r>
+              <w:t>12</w:t>
+            </w:r>
+          </w:p>
+        </w:tc>
+        <w:tc>
+          <w:tcPr>
+            <w:tcW w:type="dxa" w:w="4320"/>
+          </w:tcPr>
+          <w:p>
+            <w:r>
+              <w:t>Description for item 12</w:t>
+            </w:r>
+          </w:p>
+        </w:tc>
+      </w:tr>
+      <w:tr>
+        <w:tc>
+          <w:tcPr>
+            <w:tcW w:type="dxa" w:w="4320"/>
+          </w:tcPr>
+          <w:p>
+            <w:r>
+              <w:t>13</w:t>
+            </w:r>
+          </w:p>
+        </w:tc>
+        <w:tc>
+          <w:tcPr>
+            <w:tcW w:type="dxa" w:w="4320"/>
+          </w:tcPr>
+          <w:p>
+            <w:r>
+              <w:t>Description for item 13</w:t>
+            </w:r>
+          </w:p>
+        </w:tc>
+      </w:tr>
+      <w:tr>
+        <w:tc>
+          <w:tcPr>
+            <w:tcW w:type="dxa" w:w="4320"/>
+          </w:tcPr>
+          <w:p>
+            <w:r>
+              <w:t>14</w:t>
+            </w:r>
+          </w:p>
+        </w:tc>
+        <w:tc>
+          <w:tcPr>
+            <w:tcW w:type="dxa" w:w="4320"/>
+          </w:tcPr>
+          <w:p>
+            <w:r>
+              <w:t>Description for item 14</w:t>
+            </w:r>
+          </w:p>
+        </w:tc>
+      </w:tr>
+      <w:tr>
+        <w:tc>
+          <w:tcPr>
+            <w:tcW w:type="dxa" w:w="4320"/>
+          </w:tcPr>
+          <w:p>
+            <w:r>
+              <w:t>15</w:t>
+            </w:r>
+          </w:p>
+        </w:tc>
+        <w:tc>
+          <w:tcPr>
+            <w:tcW w:type="dxa" w:w="4320"/>
+          </w:tcPr>
+          <w:p>
+            <w:r>
+              <w:t>Description for item 15</w:t>
+            </w:r>
+          </w:p>
+        </w:tc>
+      </w:tr>
+      <w:tr>
+        <w:tc>
+          <w:tcPr>
+            <w:tcW w:type="dxa" w:w="4320"/>
+          </w:tcPr>
+          <w:p>
+            <w:r>
+              <w:t>16</w:t>
+            </w:r>
+          </w:p>
+        </w:tc>
+        <w:tc>
+          <w:tcPr>
+            <w:tcW w:type="dxa" w:w="4320"/>
+          </w:tcPr>
+          <w:p>
+            <w:r>
+              <w:t>Description for item 16</w:t>
+            </w:r>
+          </w:p>
+        </w:tc>
+      </w:tr>
+      <w:tr>
+        <w:tc>
+          <w:tcPr>
+            <w:tcW w:type="dxa" w:w="4320"/>
+          </w:tcPr>
+          <w:p>
+            <w:r>
+              <w:t>17</w:t>
+            </w:r>
+          </w:p>
+        </w:tc>
+        <w:tc>
+          <w:tcPr>
+            <w:tcW w:type="dxa" w:w="4320"/>
+          </w:tcPr>
+          <w:p>
+            <w:r>
+              <w:t>Description for item 17</w:t>
+            </w:r>
+          </w:p>
+        </w:tc>
+      </w:tr>
+      <w:tr>
+        <w:tc>
+          <w:tcPr>
+            <w:tcW w:type="dxa" w:w="4320"/>
+          </w:tcPr>
+          <w:p>
+            <w:r>
+              <w:t>18</w:t>
+            </w:r>
+          </w:p>
+        </w:tc>
+        <w:tc>
+          <w:tcPr>
+            <w:tcW w:type="dxa" w:w="4320"/>
+          </w:tcPr>
+          <w:p>
+            <w:r>
+              <w:t>Description for item 18</w:t>
+            </w:r>
+          </w:p>
+        </w:tc>
+      </w:tr>
+      <w:tr>
+        <w:tc>
+          <w:tcPr>
+            <w:tcW w:type="dxa" w:w="4320"/>
+          </w:tcPr>
+          <w:p>
+            <w:r>
+              <w:t>19</w:t>
+            </w:r>
+          </w:p>
+        </w:tc>
+        <w:tc>
+          <w:tcPr>
+            <w:tcW w:type="dxa" w:w="4320"/>
+          </w:tcPr>
+          <w:p>
+            <w:r>
+              <w:t>Description for item 19</w:t>
+            </w:r>
+          </w:p>
+        </w:tc>
+      </w:tr>
+      <w:tr>
+        <w:tc>
+          <w:tcPr>
+            <w:tcW w:type="dxa" w:w="4320"/>
+          </w:tcPr>
+          <w:p>
+            <w:r>
+              <w:t>20</w:t>
+            </w:r>
+          </w:p>
+        </w:tc>
+        <w:tc>
+          <w:tcPr>
+            <w:tcW w:type="dxa" w:w="4320"/>
+          </w:tcPr>
+          <w:p>
+            <w:r>
+              <w:t>Description for item 20</w:t>
+            </w:r>
+          </w:p>
+        </w:tc>
+      </w:tr>
+    </w:tbl>
     <w:sectPr>
       <w:pgSz w:w="12240" w:h="15840"/>
       <w:pgMar w:top="1440" w:right="1800" w:bottom="1440" w:left="1800" w:header="720" w:footer="720" w:gutter="0"/>

</xml_diff>

<commit_message>
Added stocks so that each sectors will have normally distributed data
</commit_message>
<xml_diff>
--- a/src/steps/docx_output/thesis.docx
+++ b/src/steps/docx_output/thesis.docx
@@ -274,12 +274,7 @@
     </w:p>
     <w:p>
       <w:r>
-        <w:t>2. Evening Star - details about the particular candlestick goes here</w:t>
-      </w:r>
-    </w:p>
-    <w:p>
-      <w:r>
-        <w:t>3. Marubozu - details about the particular candlestick goes here</w:t>
+        <w:t>2. Shooting Star - details about the particular candlestick goes here</w:t>
       </w:r>
     </w:p>
     <w:p>
@@ -313,27 +308,77 @@
     </w:p>
     <w:p>
       <w:r>
-        <w:t xml:space="preserve">  - NABIL - details of the ticker and reason of selection goes here</w:t>
+        <w:t xml:space="preserve">  - NABIL : Nabil Bank Limited - details of the ticker and reason of selection goes here</w:t>
       </w:r>
     </w:p>
     <w:p>
       <w:r>
-        <w:t xml:space="preserve">  - NIB - details of the ticker and reason of selection goes here</w:t>
+        <w:t xml:space="preserve">  - NICA : NIC Asia Bank Limited - details of the ticker and reason of selection goes here</w:t>
       </w:r>
     </w:p>
     <w:p>
       <w:r>
-        <w:t xml:space="preserve">  - NICA - details of the ticker and reason of selection goes here</w:t>
+        <w:t xml:space="preserve">  - SCB : Standard Chartered Bank Nepal - details of the ticker and reason of selection goes here</w:t>
       </w:r>
     </w:p>
     <w:p>
       <w:r>
-        <w:t xml:space="preserve">  - EBL - details of the ticker and reason of selection goes here</w:t>
+        <w:t xml:space="preserve">  - HBL : Himalayan Bank Limited - details of the ticker and reason of selection goes here</w:t>
       </w:r>
     </w:p>
     <w:p>
       <w:r>
-        <w:t xml:space="preserve">  - GBIME - details of the ticker and reason of selection goes here</w:t>
+        <w:t xml:space="preserve">  - EBL : Everest Bank Limited - details of the ticker and reason of selection goes here</w:t>
+      </w:r>
+    </w:p>
+    <w:p>
+      <w:r>
+        <w:t xml:space="preserve">  - GBIME : Global IME Bank Limited - details of the ticker and reason of selection goes here</w:t>
+      </w:r>
+    </w:p>
+    <w:p>
+      <w:r>
+        <w:t xml:space="preserve">  - MBL : Machhapuchchhre Bank Limited - details of the ticker and reason of selection goes here</w:t>
+      </w:r>
+    </w:p>
+    <w:p>
+      <w:r>
+        <w:t xml:space="preserve">  - SBL : Siddhartha Bank Limited - details of the ticker and reason of selection goes here</w:t>
+      </w:r>
+    </w:p>
+    <w:p>
+      <w:r>
+        <w:t xml:space="preserve">  - PRVU : Prabhu Bank Limited - details of the ticker and reason of selection goes here</w:t>
+      </w:r>
+    </w:p>
+    <w:p>
+      <w:r>
+        <w:t xml:space="preserve">  - CZBIL : Citizens Bank International Limited - details of the ticker and reason of selection goes here</w:t>
+      </w:r>
+    </w:p>
+    <w:p>
+      <w:r>
+        <w:t xml:space="preserve">  - LBL : Laxmi Bank Limited - details of the ticker and reason of selection goes here</w:t>
+      </w:r>
+    </w:p>
+    <w:p>
+      <w:r>
+        <w:t xml:space="preserve">  - ADBL : Agriculture Development Bank Limited - details of the ticker and reason of selection goes here</w:t>
+      </w:r>
+    </w:p>
+    <w:p>
+      <w:r>
+        <w:t xml:space="preserve">  - SBI : State Bank of India Nepal - details of the ticker and reason of selection goes here</w:t>
+      </w:r>
+    </w:p>
+    <w:p>
+      <w:r>
+        <w:t xml:space="preserve">  - SANIMA : Sanima Bank Limited - details of the ticker and reason of selection goes here</w:t>
+      </w:r>
+    </w:p>
+    <w:p>
+      <w:r>
+        <w:t xml:space="preserve">  - KBL : Kumari Bank Limited - details of the ticker and reason of selection goes here</w:t>
       </w:r>
     </w:p>
     <w:p>
@@ -359,27 +404,82 @@
     </w:p>
     <w:p>
       <w:r>
-        <w:t xml:space="preserve">  - NHPC - details of the ticker and reason of selection goes here</w:t>
+        <w:t xml:space="preserve">  - NHPC : National Hydropower Company Ltd. - details of the ticker and reason of selection goes here</w:t>
       </w:r>
     </w:p>
     <w:p>
       <w:r>
-        <w:t xml:space="preserve">  - UPPER - details of the ticker and reason of selection goes here</w:t>
+        <w:t xml:space="preserve">  - UPPER : Upper Tamakoshi Hydropower Ltd. - details of the ticker and reason of selection goes here</w:t>
       </w:r>
     </w:p>
     <w:p>
       <w:r>
-        <w:t xml:space="preserve">  - AHPC - details of the ticker and reason of selection goes here</w:t>
+        <w:t xml:space="preserve">  - AHPC : Arun Valley Hydropower Development Co. Ltd. - details of the ticker and reason of selection goes here</w:t>
       </w:r>
     </w:p>
     <w:p>
       <w:r>
-        <w:t xml:space="preserve">  - API - details of the ticker and reason of selection goes here</w:t>
+        <w:t xml:space="preserve">  - API : API Power Company Ltd. - details of the ticker and reason of selection goes here</w:t>
       </w:r>
     </w:p>
     <w:p>
       <w:r>
-        <w:t xml:space="preserve">  - SHPC - details of the ticker and reason of selection goes here</w:t>
+        <w:t xml:space="preserve">  - SHPC : Sanima Mai Hydropower Ltd. - details of the ticker and reason of selection goes here</w:t>
+      </w:r>
+    </w:p>
+    <w:p>
+      <w:r>
+        <w:t xml:space="preserve">  - NGPL : Ngadi Group Power Ltd. - details of the ticker and reason of selection goes here</w:t>
+      </w:r>
+    </w:p>
+    <w:p>
+      <w:r>
+        <w:t xml:space="preserve">  - HPPL : Himalayan Power Partner Ltd. - details of the ticker and reason of selection goes here</w:t>
+      </w:r>
+    </w:p>
+    <w:p>
+      <w:r>
+        <w:t xml:space="preserve">  - SIKLES : Sikles Hydropower Ltd. - details of the ticker and reason of selection goes here</w:t>
+      </w:r>
+    </w:p>
+    <w:p>
+      <w:r>
+        <w:t xml:space="preserve">  - RADHI : Radhi Bidyut Company Ltd. - details of the ticker and reason of selection goes here</w:t>
+      </w:r>
+    </w:p>
+    <w:p>
+      <w:r>
+        <w:t xml:space="preserve">  - AKJCL : Ankhukhola Hydropower Ltd. - details of the ticker and reason of selection goes here</w:t>
+      </w:r>
+    </w:p>
+    <w:p>
+      <w:r>
+        <w:t xml:space="preserve">  - MKHC : Mailung Khola Hydropower Ltd. - details of the ticker and reason of selection goes here</w:t>
+      </w:r>
+    </w:p>
+    <w:p>
+      <w:r>
+        <w:t xml:space="preserve">  - BARUN : Barun Hydropower Company Ltd. - details of the ticker and reason of selection goes here</w:t>
+      </w:r>
+    </w:p>
+    <w:p>
+      <w:r>
+        <w:t xml:space="preserve">  - TVCL : Trishuli Jal Vidhyut (Hydropower) - details of the ticker and reason of selection goes here</w:t>
+      </w:r>
+    </w:p>
+    <w:p>
+      <w:r>
+        <w:t xml:space="preserve">  - USHL : Upper Syange Hydropower - details of the ticker and reason of selection goes here</w:t>
+      </w:r>
+    </w:p>
+    <w:p>
+      <w:r>
+        <w:t xml:space="preserve">  - KBSH : Kutheli Bukhari Small Hydropower - details of the ticker and reason of selection goes here</w:t>
+      </w:r>
+    </w:p>
+    <w:p>
+      <w:r>
+        <w:t xml:space="preserve">  - SPL : Shuvam Power Limited - details of the ticker and reason of selection goes here</w:t>
       </w:r>
     </w:p>
     <w:p>
@@ -405,27 +505,77 @@
     </w:p>
     <w:p>
       <w:r>
-        <w:t xml:space="preserve">  - NMBMF - details of the ticker and reason of selection goes here</w:t>
+        <w:t xml:space="preserve">  - NMBMF : NMB Microfinance Bittiya Sanstha Ltd. - details of the ticker and reason of selection goes here</w:t>
       </w:r>
     </w:p>
     <w:p>
       <w:r>
-        <w:t xml:space="preserve">  - CBBL - details of the ticker and reason of selection goes here</w:t>
+        <w:t xml:space="preserve">  - CBBL : Chhimek Laghubitta Bittiya Sanstha Ltd. - details of the ticker and reason of selection goes here</w:t>
       </w:r>
     </w:p>
     <w:p>
       <w:r>
-        <w:t xml:space="preserve">  - DDBL - details of the ticker and reason of selection goes here</w:t>
+        <w:t xml:space="preserve">  - DDBL : Deprosc Laghubitta Bittiya Sanstha Ltd. - details of the ticker and reason of selection goes here</w:t>
       </w:r>
     </w:p>
     <w:p>
       <w:r>
-        <w:t xml:space="preserve">  - SKBBL - details of the ticker and reason of selection goes here</w:t>
+        <w:t xml:space="preserve">  - SKBBL : Sana Kisan Bikas Bank Ltd. - details of the ticker and reason of selection goes here</w:t>
       </w:r>
     </w:p>
     <w:p>
       <w:r>
-        <w:t xml:space="preserve">  - SWBBL - details of the ticker and reason of selection goes here</w:t>
+        <w:t xml:space="preserve">  - SWBBL : Swabalamban Laghubitta Bittiya Sanstha Ltd. - details of the ticker and reason of selection goes here</w:t>
+      </w:r>
+    </w:p>
+    <w:p>
+      <w:r>
+        <w:t xml:space="preserve">  - GRDBL : Grameen Bikas Laghubitta Ltd. - details of the ticker and reason of selection goes here</w:t>
+      </w:r>
+    </w:p>
+    <w:p>
+      <w:r>
+        <w:t xml:space="preserve">  - NUBL : Nerude Laghubitta Bittiya Sanstha Ltd. - details of the ticker and reason of selection goes here</w:t>
+      </w:r>
+    </w:p>
+    <w:p>
+      <w:r>
+        <w:t xml:space="preserve">  - MLBS : Manakamana Laghubitta Bittiya Sanstha Ltd. - details of the ticker and reason of selection goes here</w:t>
+      </w:r>
+    </w:p>
+    <w:p>
+      <w:r>
+        <w:t xml:space="preserve">  - FOWAD : Forward Microfinance Laghubitta Ltd. - details of the ticker and reason of selection goes here</w:t>
+      </w:r>
+    </w:p>
+    <w:p>
+      <w:r>
+        <w:t xml:space="preserve">  - SADBL : Siddhartha Laghubitta Bittiya Sanstha Ltd. - details of the ticker and reason of selection goes here</w:t>
+      </w:r>
+    </w:p>
+    <w:p>
+      <w:r>
+        <w:t xml:space="preserve">  - MERO : Mero Microfinance Bittiya Sanstha Ltd. - details of the ticker and reason of selection goes here</w:t>
+      </w:r>
+    </w:p>
+    <w:p>
+      <w:r>
+        <w:t xml:space="preserve">  - KMCDB : Kalika Microcredit Development Bank Ltd. - details of the ticker and reason of selection goes here</w:t>
+      </w:r>
+    </w:p>
+    <w:p>
+      <w:r>
+        <w:t xml:space="preserve">  - SLBBL : Samudayik Laghubitta Bittiya Sanstha Ltd. - details of the ticker and reason of selection goes here</w:t>
+      </w:r>
+    </w:p>
+    <w:p>
+      <w:r>
+        <w:t xml:space="preserve">  - MLBSL : Mahila Laghubitta Bittiya Sanstha Ltd. - details of the ticker and reason of selection goes here</w:t>
+      </w:r>
+    </w:p>
+    <w:p>
+      <w:r>
+        <w:t xml:space="preserve">  - JALPA : Jalpa Samudayik Laghubitta Bittiya Sanstha Ltd. - details of the ticker and reason of selection goes here</w:t>
       </w:r>
     </w:p>
     <w:p>
@@ -451,27 +601,77 @@
     </w:p>
     <w:p>
       <w:r>
-        <w:t xml:space="preserve">  - UNL - details of the ticker and reason of selection goes here</w:t>
+        <w:t xml:space="preserve">  - UNL : Unilever Nepal Ltd (Consumer Goods) - details of the ticker and reason of selection goes here</w:t>
       </w:r>
     </w:p>
     <w:p>
       <w:r>
-        <w:t xml:space="preserve">  - BNT - details of the ticker and reason of selection goes here</w:t>
+        <w:t xml:space="preserve">  - RBCL : Rastriya Beema Company Ltd (Insurance) - details of the ticker and reason of selection goes here</w:t>
       </w:r>
     </w:p>
     <w:p>
       <w:r>
-        <w:t xml:space="preserve">  - RBCL - details of the ticker and reason of selection goes here</w:t>
+        <w:t xml:space="preserve">  - BNT : Bottlers Nepal (Terai) Ltd (Beverages) - details of the ticker and reason of selection goes here</w:t>
       </w:r>
     </w:p>
     <w:p>
       <w:r>
-        <w:t xml:space="preserve">  - STC - details of the ticker and reason of selection goes here</w:t>
+        <w:t xml:space="preserve">  - STC : Salt Trading Corporation (Trading) - details of the ticker and reason of selection goes here</w:t>
       </w:r>
     </w:p>
     <w:p>
       <w:r>
-        <w:t xml:space="preserve">  - BBC - details of the ticker and reason of selection goes here</w:t>
+        <w:t xml:space="preserve">  - BBC : Bishal Bazar Company Ltd (Retail) - details of the ticker and reason of selection goes here</w:t>
+      </w:r>
+    </w:p>
+    <w:p>
+      <w:r>
+        <w:t xml:space="preserve">  - NLIC : Nepal Life Insurance Co. Ltd (Insurance) - details of the ticker and reason of selection goes here</w:t>
+      </w:r>
+    </w:p>
+    <w:p>
+      <w:r>
+        <w:t xml:space="preserve">  - NLICL : National Life Insurance Co. Ltd (Insurance) - details of the ticker and reason of selection goes here</w:t>
+      </w:r>
+    </w:p>
+    <w:p>
+      <w:r>
+        <w:t xml:space="preserve">  - SHIVM : Shivam Cements Ltd (Manufacturing) - details of the ticker and reason of selection goes here</w:t>
+      </w:r>
+    </w:p>
+    <w:p>
+      <w:r>
+        <w:t xml:space="preserve">  - NRIC : Nepal Reinsurance Company Ltd (Insurance) - details of the ticker and reason of selection goes here</w:t>
+      </w:r>
+    </w:p>
+    <w:p>
+      <w:r>
+        <w:t xml:space="preserve">  - SHL : Soaltee Hotel Ltd (Tourism/Hospitality) - details of the ticker and reason of selection goes here</w:t>
+      </w:r>
+    </w:p>
+    <w:p>
+      <w:r>
+        <w:t xml:space="preserve">  - NTC : Nepal Telecom (Telecom) - details of the ticker and reason of selection goes here</w:t>
+      </w:r>
+    </w:p>
+    <w:p>
+      <w:r>
+        <w:t xml:space="preserve">  - SICL : Shikhar Insurance Co. Ltd (Insurance) - details of the ticker and reason of selection goes here</w:t>
+      </w:r>
+    </w:p>
+    <w:p>
+      <w:r>
+        <w:t xml:space="preserve">  - BNL : Bottlers Nepal (Balaju) Ltd (Beverages) - details of the ticker and reason of selection goes here</w:t>
+      </w:r>
+    </w:p>
+    <w:p>
+      <w:r>
+        <w:t xml:space="preserve">  - ANLB : Aatmanirbhar Laghubitta (Microfinance) - details of the ticker and reason of selection goes here</w:t>
+      </w:r>
+    </w:p>
+    <w:p>
+      <w:r>
+        <w:t xml:space="preserve">  - MLBSL : Mahila Laghubitta Bittiya Sanstha (Microfinance) - details of the ticker and reason of selection goes here</w:t>
       </w:r>
     </w:p>
     <w:p>
@@ -497,27 +697,77 @@
     </w:p>
     <w:p>
       <w:r>
-        <w:t xml:space="preserve">  - SAMAJ - details of the ticker and reason of selection goes here</w:t>
+        <w:t xml:space="preserve">  - SAMAJ : Samaj Laghubitta (Microfinance, Paid-up: ₹2.28 crore) - details of the ticker and reason of selection goes here</w:t>
       </w:r>
     </w:p>
     <w:p>
       <w:r>
-        <w:t xml:space="preserve">  - SMH - details of the ticker and reason of selection goes here</w:t>
+        <w:t xml:space="preserve">  - SMH : Supermai Hydropower (Hydropower, Price: ~₹643) - details of the ticker and reason of selection goes here</w:t>
       </w:r>
     </w:p>
     <w:p>
       <w:r>
-        <w:t xml:space="preserve">  - SPL - details of the ticker and reason of selection goes here</w:t>
+        <w:t xml:space="preserve">  - SPL : Shuvam Power Limited (Hydropower, Paid-up: ₹20 crore) - details of the ticker and reason of selection goes here</w:t>
       </w:r>
     </w:p>
     <w:p>
       <w:r>
-        <w:t xml:space="preserve">  - KBSH - details of the ticker and reason of selection goes here</w:t>
+        <w:t xml:space="preserve">  - KBSH : Kutheli Bukhari Small Hydropower (Hydropower, Paid-up: ₹12.18 crore) - details of the ticker and reason of selection goes here</w:t>
       </w:r>
     </w:p>
     <w:p>
       <w:r>
-        <w:t xml:space="preserve">  - BHPL - details of the ticker and reason of selection goes here</w:t>
+        <w:t xml:space="preserve">  - BHPL : Barahi Hydropower (Hydropower, Paid-up: ₹25 crore) - details of the ticker and reason of selection goes here</w:t>
+      </w:r>
+    </w:p>
+    <w:p>
+      <w:r>
+        <w:t xml:space="preserve">  - ANLB : Aatmanirbhar Laghubitta (Microfinance, Paid-up: ₹6.85 crore) - details of the ticker and reason of selection goes here</w:t>
+      </w:r>
+    </w:p>
+    <w:p>
+      <w:r>
+        <w:t xml:space="preserve">  - WNLB : Wean Nepal Laghubitta (Microfinance, Paid-up: ₹7.92 crore) - details of the ticker and reason of selection goes here</w:t>
+      </w:r>
+    </w:p>
+    <w:p>
+      <w:r>
+        <w:t xml:space="preserve">  - DLBS : Dhaulagiri Laghubitta (Microfinance, Paid-up: ₹10.31 crore) - details of the ticker and reason of selection goes here</w:t>
+      </w:r>
+    </w:p>
+    <w:p>
+      <w:r>
+        <w:t xml:space="preserve">  - SMB : Support Laghubitta (Microfinance, Paid-up: ₹10.76 crore) - details of the ticker and reason of selection goes here</w:t>
+      </w:r>
+    </w:p>
+    <w:p>
+      <w:r>
+        <w:t xml:space="preserve">  - MLBS : Manushi Laghubitta (Microfinance, Paid-up: ₹10.93 crore) - details of the ticker and reason of selection goes here</w:t>
+      </w:r>
+    </w:p>
+    <w:p>
+      <w:r>
+        <w:t xml:space="preserve">  - SHLB : Shrijanshil Laghubitta (Microfinance, Paid-up: ₹10.93 crore) - details of the ticker and reason of selection goes here</w:t>
+      </w:r>
+    </w:p>
+    <w:p>
+      <w:r>
+        <w:t xml:space="preserve">  - SMFBS : Swabhimaan Laghubitta (Microfinance, Paid-up: ₹14.61 crore) - details of the ticker and reason of selection goes here</w:t>
+      </w:r>
+    </w:p>
+    <w:p>
+      <w:r>
+        <w:t xml:space="preserve">  - UNLB : Unique Nepal Laghubitta (Microfinance, Paid-up: ₹14.85 crore) - details of the ticker and reason of selection goes here</w:t>
+      </w:r>
+    </w:p>
+    <w:p>
+      <w:r>
+        <w:t xml:space="preserve">  - GMFBS : Ganapati Laghubitta (Microfinance, Paid-up: ₹15.15 crore) - details of the ticker and reason of selection goes here</w:t>
+      </w:r>
+    </w:p>
+    <w:p>
+      <w:r>
+        <w:t xml:space="preserve">  - JSLBB : Janautthan Samudayic Laghubitta (Microfinance, Paid-up: ₹17 crore) - details of the ticker and reason of selection goes here</w:t>
       </w:r>
     </w:p>
     <w:p>

</xml_diff>

<commit_message>
sample candles which have enough value
</commit_message>
<xml_diff>
--- a/src/steps/docx_output/thesis.docx
+++ b/src/steps/docx_output/thesis.docx
@@ -274,7 +274,17 @@
     </w:p>
     <w:p>
       <w:r>
-        <w:t>2. Shooting Star - details about the particular candlestick goes here</w:t>
+        <w:t>2. Inverted Hammer - details about the particular candlestick goes here</w:t>
+      </w:r>
+    </w:p>
+    <w:p>
+      <w:r>
+        <w:t>3. Hanging Man - details about the particular candlestick goes here</w:t>
+      </w:r>
+    </w:p>
+    <w:p>
+      <w:r>
+        <w:t>4. Shooting Star - details about the particular candlestick goes here</w:t>
       </w:r>
     </w:p>
     <w:p>

</xml_diff>

<commit_message>
Fixed the empty row
</commit_message>
<xml_diff>
--- a/src/steps/docx_output/thesis.docx
+++ b/src/steps/docx_output/thesis.docx
@@ -350,70 +350,6 @@
         <w:tc>
           <w:tcPr>
             <w:tcW w:type="dxa" w:w="864"/>
-            <w:vMerge/>
-          </w:tcPr>
-          <w:p/>
-        </w:tc>
-        <w:tc>
-          <w:tcPr>
-            <w:tcW w:type="dxa" w:w="864"/>
-            <w:vMerge/>
-          </w:tcPr>
-          <w:p/>
-        </w:tc>
-        <w:tc>
-          <w:tcPr>
-            <w:tcW w:type="dxa" w:w="864"/>
-          </w:tcPr>
-          <w:p/>
-        </w:tc>
-        <w:tc>
-          <w:tcPr>
-            <w:tcW w:type="dxa" w:w="864"/>
-          </w:tcPr>
-          <w:p/>
-        </w:tc>
-        <w:tc>
-          <w:tcPr>
-            <w:tcW w:type="dxa" w:w="864"/>
-          </w:tcPr>
-          <w:p/>
-        </w:tc>
-        <w:tc>
-          <w:tcPr>
-            <w:tcW w:type="dxa" w:w="864"/>
-          </w:tcPr>
-          <w:p/>
-        </w:tc>
-        <w:tc>
-          <w:tcPr>
-            <w:tcW w:type="dxa" w:w="864"/>
-          </w:tcPr>
-          <w:p/>
-        </w:tc>
-        <w:tc>
-          <w:tcPr>
-            <w:tcW w:type="dxa" w:w="864"/>
-          </w:tcPr>
-          <w:p/>
-        </w:tc>
-        <w:tc>
-          <w:tcPr>
-            <w:tcW w:type="dxa" w:w="864"/>
-          </w:tcPr>
-          <w:p/>
-        </w:tc>
-        <w:tc>
-          <w:tcPr>
-            <w:tcW w:type="dxa" w:w="864"/>
-          </w:tcPr>
-          <w:p/>
-        </w:tc>
-      </w:tr>
-      <w:tr>
-        <w:tc>
-          <w:tcPr>
-            <w:tcW w:type="dxa" w:w="864"/>
           </w:tcPr>
           <w:p>
             <w:pPr>
@@ -3525,6 +3461,68 @@
               <w:t>37.5</w:t>
             </w:r>
           </w:p>
+        </w:tc>
+      </w:tr>
+      <w:tr>
+        <w:tc>
+          <w:tcPr>
+            <w:tcW w:type="dxa" w:w="864"/>
+          </w:tcPr>
+          <w:p/>
+        </w:tc>
+        <w:tc>
+          <w:tcPr>
+            <w:tcW w:type="dxa" w:w="864"/>
+          </w:tcPr>
+          <w:p/>
+        </w:tc>
+        <w:tc>
+          <w:tcPr>
+            <w:tcW w:type="dxa" w:w="864"/>
+          </w:tcPr>
+          <w:p/>
+        </w:tc>
+        <w:tc>
+          <w:tcPr>
+            <w:tcW w:type="dxa" w:w="864"/>
+          </w:tcPr>
+          <w:p/>
+        </w:tc>
+        <w:tc>
+          <w:tcPr>
+            <w:tcW w:type="dxa" w:w="864"/>
+          </w:tcPr>
+          <w:p/>
+        </w:tc>
+        <w:tc>
+          <w:tcPr>
+            <w:tcW w:type="dxa" w:w="864"/>
+          </w:tcPr>
+          <w:p/>
+        </w:tc>
+        <w:tc>
+          <w:tcPr>
+            <w:tcW w:type="dxa" w:w="864"/>
+          </w:tcPr>
+          <w:p/>
+        </w:tc>
+        <w:tc>
+          <w:tcPr>
+            <w:tcW w:type="dxa" w:w="864"/>
+          </w:tcPr>
+          <w:p/>
+        </w:tc>
+        <w:tc>
+          <w:tcPr>
+            <w:tcW w:type="dxa" w:w="864"/>
+          </w:tcPr>
+          <w:p/>
+        </w:tc>
+        <w:tc>
+          <w:tcPr>
+            <w:tcW w:type="dxa" w:w="864"/>
+          </w:tcPr>
+          <w:p/>
         </w:tc>
       </w:tr>
     </w:tbl>
@@ -3873,70 +3871,6 @@
         <w:tc>
           <w:tcPr>
             <w:tcW w:type="dxa" w:w="864"/>
-            <w:vMerge/>
-          </w:tcPr>
-          <w:p/>
-        </w:tc>
-        <w:tc>
-          <w:tcPr>
-            <w:tcW w:type="dxa" w:w="864"/>
-            <w:vMerge/>
-          </w:tcPr>
-          <w:p/>
-        </w:tc>
-        <w:tc>
-          <w:tcPr>
-            <w:tcW w:type="dxa" w:w="864"/>
-          </w:tcPr>
-          <w:p/>
-        </w:tc>
-        <w:tc>
-          <w:tcPr>
-            <w:tcW w:type="dxa" w:w="864"/>
-          </w:tcPr>
-          <w:p/>
-        </w:tc>
-        <w:tc>
-          <w:tcPr>
-            <w:tcW w:type="dxa" w:w="864"/>
-          </w:tcPr>
-          <w:p/>
-        </w:tc>
-        <w:tc>
-          <w:tcPr>
-            <w:tcW w:type="dxa" w:w="864"/>
-          </w:tcPr>
-          <w:p/>
-        </w:tc>
-        <w:tc>
-          <w:tcPr>
-            <w:tcW w:type="dxa" w:w="864"/>
-          </w:tcPr>
-          <w:p/>
-        </w:tc>
-        <w:tc>
-          <w:tcPr>
-            <w:tcW w:type="dxa" w:w="864"/>
-          </w:tcPr>
-          <w:p/>
-        </w:tc>
-        <w:tc>
-          <w:tcPr>
-            <w:tcW w:type="dxa" w:w="864"/>
-          </w:tcPr>
-          <w:p/>
-        </w:tc>
-        <w:tc>
-          <w:tcPr>
-            <w:tcW w:type="dxa" w:w="864"/>
-          </w:tcPr>
-          <w:p/>
-        </w:tc>
-      </w:tr>
-      <w:tr>
-        <w:tc>
-          <w:tcPr>
-            <w:tcW w:type="dxa" w:w="864"/>
           </w:tcPr>
           <w:p>
             <w:pPr>
@@ -7048,6 +6982,68 @@
               <w:t>52.9</w:t>
             </w:r>
           </w:p>
+        </w:tc>
+      </w:tr>
+      <w:tr>
+        <w:tc>
+          <w:tcPr>
+            <w:tcW w:type="dxa" w:w="864"/>
+          </w:tcPr>
+          <w:p/>
+        </w:tc>
+        <w:tc>
+          <w:tcPr>
+            <w:tcW w:type="dxa" w:w="864"/>
+          </w:tcPr>
+          <w:p/>
+        </w:tc>
+        <w:tc>
+          <w:tcPr>
+            <w:tcW w:type="dxa" w:w="864"/>
+          </w:tcPr>
+          <w:p/>
+        </w:tc>
+        <w:tc>
+          <w:tcPr>
+            <w:tcW w:type="dxa" w:w="864"/>
+          </w:tcPr>
+          <w:p/>
+        </w:tc>
+        <w:tc>
+          <w:tcPr>
+            <w:tcW w:type="dxa" w:w="864"/>
+          </w:tcPr>
+          <w:p/>
+        </w:tc>
+        <w:tc>
+          <w:tcPr>
+            <w:tcW w:type="dxa" w:w="864"/>
+          </w:tcPr>
+          <w:p/>
+        </w:tc>
+        <w:tc>
+          <w:tcPr>
+            <w:tcW w:type="dxa" w:w="864"/>
+          </w:tcPr>
+          <w:p/>
+        </w:tc>
+        <w:tc>
+          <w:tcPr>
+            <w:tcW w:type="dxa" w:w="864"/>
+          </w:tcPr>
+          <w:p/>
+        </w:tc>
+        <w:tc>
+          <w:tcPr>
+            <w:tcW w:type="dxa" w:w="864"/>
+          </w:tcPr>
+          <w:p/>
+        </w:tc>
+        <w:tc>
+          <w:tcPr>
+            <w:tcW w:type="dxa" w:w="864"/>
+          </w:tcPr>
+          <w:p/>
         </w:tc>
       </w:tr>
     </w:tbl>
@@ -7396,70 +7392,6 @@
         <w:tc>
           <w:tcPr>
             <w:tcW w:type="dxa" w:w="864"/>
-            <w:vMerge/>
-          </w:tcPr>
-          <w:p/>
-        </w:tc>
-        <w:tc>
-          <w:tcPr>
-            <w:tcW w:type="dxa" w:w="864"/>
-            <w:vMerge/>
-          </w:tcPr>
-          <w:p/>
-        </w:tc>
-        <w:tc>
-          <w:tcPr>
-            <w:tcW w:type="dxa" w:w="864"/>
-          </w:tcPr>
-          <w:p/>
-        </w:tc>
-        <w:tc>
-          <w:tcPr>
-            <w:tcW w:type="dxa" w:w="864"/>
-          </w:tcPr>
-          <w:p/>
-        </w:tc>
-        <w:tc>
-          <w:tcPr>
-            <w:tcW w:type="dxa" w:w="864"/>
-          </w:tcPr>
-          <w:p/>
-        </w:tc>
-        <w:tc>
-          <w:tcPr>
-            <w:tcW w:type="dxa" w:w="864"/>
-          </w:tcPr>
-          <w:p/>
-        </w:tc>
-        <w:tc>
-          <w:tcPr>
-            <w:tcW w:type="dxa" w:w="864"/>
-          </w:tcPr>
-          <w:p/>
-        </w:tc>
-        <w:tc>
-          <w:tcPr>
-            <w:tcW w:type="dxa" w:w="864"/>
-          </w:tcPr>
-          <w:p/>
-        </w:tc>
-        <w:tc>
-          <w:tcPr>
-            <w:tcW w:type="dxa" w:w="864"/>
-          </w:tcPr>
-          <w:p/>
-        </w:tc>
-        <w:tc>
-          <w:tcPr>
-            <w:tcW w:type="dxa" w:w="864"/>
-          </w:tcPr>
-          <w:p/>
-        </w:tc>
-      </w:tr>
-      <w:tr>
-        <w:tc>
-          <w:tcPr>
-            <w:tcW w:type="dxa" w:w="864"/>
           </w:tcPr>
           <w:p>
             <w:pPr>
@@ -10571,6 +10503,68 @@
               <w:t>33.6</w:t>
             </w:r>
           </w:p>
+        </w:tc>
+      </w:tr>
+      <w:tr>
+        <w:tc>
+          <w:tcPr>
+            <w:tcW w:type="dxa" w:w="864"/>
+          </w:tcPr>
+          <w:p/>
+        </w:tc>
+        <w:tc>
+          <w:tcPr>
+            <w:tcW w:type="dxa" w:w="864"/>
+          </w:tcPr>
+          <w:p/>
+        </w:tc>
+        <w:tc>
+          <w:tcPr>
+            <w:tcW w:type="dxa" w:w="864"/>
+          </w:tcPr>
+          <w:p/>
+        </w:tc>
+        <w:tc>
+          <w:tcPr>
+            <w:tcW w:type="dxa" w:w="864"/>
+          </w:tcPr>
+          <w:p/>
+        </w:tc>
+        <w:tc>
+          <w:tcPr>
+            <w:tcW w:type="dxa" w:w="864"/>
+          </w:tcPr>
+          <w:p/>
+        </w:tc>
+        <w:tc>
+          <w:tcPr>
+            <w:tcW w:type="dxa" w:w="864"/>
+          </w:tcPr>
+          <w:p/>
+        </w:tc>
+        <w:tc>
+          <w:tcPr>
+            <w:tcW w:type="dxa" w:w="864"/>
+          </w:tcPr>
+          <w:p/>
+        </w:tc>
+        <w:tc>
+          <w:tcPr>
+            <w:tcW w:type="dxa" w:w="864"/>
+          </w:tcPr>
+          <w:p/>
+        </w:tc>
+        <w:tc>
+          <w:tcPr>
+            <w:tcW w:type="dxa" w:w="864"/>
+          </w:tcPr>
+          <w:p/>
+        </w:tc>
+        <w:tc>
+          <w:tcPr>
+            <w:tcW w:type="dxa" w:w="864"/>
+          </w:tcPr>
+          <w:p/>
         </w:tc>
       </w:tr>
     </w:tbl>
@@ -10919,70 +10913,6 @@
         <w:tc>
           <w:tcPr>
             <w:tcW w:type="dxa" w:w="864"/>
-            <w:vMerge/>
-          </w:tcPr>
-          <w:p/>
-        </w:tc>
-        <w:tc>
-          <w:tcPr>
-            <w:tcW w:type="dxa" w:w="864"/>
-            <w:vMerge/>
-          </w:tcPr>
-          <w:p/>
-        </w:tc>
-        <w:tc>
-          <w:tcPr>
-            <w:tcW w:type="dxa" w:w="864"/>
-          </w:tcPr>
-          <w:p/>
-        </w:tc>
-        <w:tc>
-          <w:tcPr>
-            <w:tcW w:type="dxa" w:w="864"/>
-          </w:tcPr>
-          <w:p/>
-        </w:tc>
-        <w:tc>
-          <w:tcPr>
-            <w:tcW w:type="dxa" w:w="864"/>
-          </w:tcPr>
-          <w:p/>
-        </w:tc>
-        <w:tc>
-          <w:tcPr>
-            <w:tcW w:type="dxa" w:w="864"/>
-          </w:tcPr>
-          <w:p/>
-        </w:tc>
-        <w:tc>
-          <w:tcPr>
-            <w:tcW w:type="dxa" w:w="864"/>
-          </w:tcPr>
-          <w:p/>
-        </w:tc>
-        <w:tc>
-          <w:tcPr>
-            <w:tcW w:type="dxa" w:w="864"/>
-          </w:tcPr>
-          <w:p/>
-        </w:tc>
-        <w:tc>
-          <w:tcPr>
-            <w:tcW w:type="dxa" w:w="864"/>
-          </w:tcPr>
-          <w:p/>
-        </w:tc>
-        <w:tc>
-          <w:tcPr>
-            <w:tcW w:type="dxa" w:w="864"/>
-          </w:tcPr>
-          <w:p/>
-        </w:tc>
-      </w:tr>
-      <w:tr>
-        <w:tc>
-          <w:tcPr>
-            <w:tcW w:type="dxa" w:w="864"/>
           </w:tcPr>
           <w:p>
             <w:pPr>
@@ -14094,6 +14024,68 @@
               <w:t>62.4</w:t>
             </w:r>
           </w:p>
+        </w:tc>
+      </w:tr>
+      <w:tr>
+        <w:tc>
+          <w:tcPr>
+            <w:tcW w:type="dxa" w:w="864"/>
+          </w:tcPr>
+          <w:p/>
+        </w:tc>
+        <w:tc>
+          <w:tcPr>
+            <w:tcW w:type="dxa" w:w="864"/>
+          </w:tcPr>
+          <w:p/>
+        </w:tc>
+        <w:tc>
+          <w:tcPr>
+            <w:tcW w:type="dxa" w:w="864"/>
+          </w:tcPr>
+          <w:p/>
+        </w:tc>
+        <w:tc>
+          <w:tcPr>
+            <w:tcW w:type="dxa" w:w="864"/>
+          </w:tcPr>
+          <w:p/>
+        </w:tc>
+        <w:tc>
+          <w:tcPr>
+            <w:tcW w:type="dxa" w:w="864"/>
+          </w:tcPr>
+          <w:p/>
+        </w:tc>
+        <w:tc>
+          <w:tcPr>
+            <w:tcW w:type="dxa" w:w="864"/>
+          </w:tcPr>
+          <w:p/>
+        </w:tc>
+        <w:tc>
+          <w:tcPr>
+            <w:tcW w:type="dxa" w:w="864"/>
+          </w:tcPr>
+          <w:p/>
+        </w:tc>
+        <w:tc>
+          <w:tcPr>
+            <w:tcW w:type="dxa" w:w="864"/>
+          </w:tcPr>
+          <w:p/>
+        </w:tc>
+        <w:tc>
+          <w:tcPr>
+            <w:tcW w:type="dxa" w:w="864"/>
+          </w:tcPr>
+          <w:p/>
+        </w:tc>
+        <w:tc>
+          <w:tcPr>
+            <w:tcW w:type="dxa" w:w="864"/>
+          </w:tcPr>
+          <w:p/>
         </w:tc>
       </w:tr>
     </w:tbl>
@@ -14442,70 +14434,6 @@
         <w:tc>
           <w:tcPr>
             <w:tcW w:type="dxa" w:w="864"/>
-            <w:vMerge/>
-          </w:tcPr>
-          <w:p/>
-        </w:tc>
-        <w:tc>
-          <w:tcPr>
-            <w:tcW w:type="dxa" w:w="864"/>
-            <w:vMerge/>
-          </w:tcPr>
-          <w:p/>
-        </w:tc>
-        <w:tc>
-          <w:tcPr>
-            <w:tcW w:type="dxa" w:w="864"/>
-          </w:tcPr>
-          <w:p/>
-        </w:tc>
-        <w:tc>
-          <w:tcPr>
-            <w:tcW w:type="dxa" w:w="864"/>
-          </w:tcPr>
-          <w:p/>
-        </w:tc>
-        <w:tc>
-          <w:tcPr>
-            <w:tcW w:type="dxa" w:w="864"/>
-          </w:tcPr>
-          <w:p/>
-        </w:tc>
-        <w:tc>
-          <w:tcPr>
-            <w:tcW w:type="dxa" w:w="864"/>
-          </w:tcPr>
-          <w:p/>
-        </w:tc>
-        <w:tc>
-          <w:tcPr>
-            <w:tcW w:type="dxa" w:w="864"/>
-          </w:tcPr>
-          <w:p/>
-        </w:tc>
-        <w:tc>
-          <w:tcPr>
-            <w:tcW w:type="dxa" w:w="864"/>
-          </w:tcPr>
-          <w:p/>
-        </w:tc>
-        <w:tc>
-          <w:tcPr>
-            <w:tcW w:type="dxa" w:w="864"/>
-          </w:tcPr>
-          <w:p/>
-        </w:tc>
-        <w:tc>
-          <w:tcPr>
-            <w:tcW w:type="dxa" w:w="864"/>
-          </w:tcPr>
-          <w:p/>
-        </w:tc>
-      </w:tr>
-      <w:tr>
-        <w:tc>
-          <w:tcPr>
-            <w:tcW w:type="dxa" w:w="864"/>
           </w:tcPr>
           <w:p>
             <w:pPr>
@@ -17617,6 +17545,68 @@
               <w:t>37.4</w:t>
             </w:r>
           </w:p>
+        </w:tc>
+      </w:tr>
+      <w:tr>
+        <w:tc>
+          <w:tcPr>
+            <w:tcW w:type="dxa" w:w="864"/>
+          </w:tcPr>
+          <w:p/>
+        </w:tc>
+        <w:tc>
+          <w:tcPr>
+            <w:tcW w:type="dxa" w:w="864"/>
+          </w:tcPr>
+          <w:p/>
+        </w:tc>
+        <w:tc>
+          <w:tcPr>
+            <w:tcW w:type="dxa" w:w="864"/>
+          </w:tcPr>
+          <w:p/>
+        </w:tc>
+        <w:tc>
+          <w:tcPr>
+            <w:tcW w:type="dxa" w:w="864"/>
+          </w:tcPr>
+          <w:p/>
+        </w:tc>
+        <w:tc>
+          <w:tcPr>
+            <w:tcW w:type="dxa" w:w="864"/>
+          </w:tcPr>
+          <w:p/>
+        </w:tc>
+        <w:tc>
+          <w:tcPr>
+            <w:tcW w:type="dxa" w:w="864"/>
+          </w:tcPr>
+          <w:p/>
+        </w:tc>
+        <w:tc>
+          <w:tcPr>
+            <w:tcW w:type="dxa" w:w="864"/>
+          </w:tcPr>
+          <w:p/>
+        </w:tc>
+        <w:tc>
+          <w:tcPr>
+            <w:tcW w:type="dxa" w:w="864"/>
+          </w:tcPr>
+          <w:p/>
+        </w:tc>
+        <w:tc>
+          <w:tcPr>
+            <w:tcW w:type="dxa" w:w="864"/>
+          </w:tcPr>
+          <w:p/>
+        </w:tc>
+        <w:tc>
+          <w:tcPr>
+            <w:tcW w:type="dxa" w:w="864"/>
+          </w:tcPr>
+          <w:p/>
         </w:tc>
       </w:tr>
     </w:tbl>
@@ -17965,70 +17955,6 @@
         <w:tc>
           <w:tcPr>
             <w:tcW w:type="dxa" w:w="864"/>
-            <w:vMerge/>
-          </w:tcPr>
-          <w:p/>
-        </w:tc>
-        <w:tc>
-          <w:tcPr>
-            <w:tcW w:type="dxa" w:w="864"/>
-            <w:vMerge/>
-          </w:tcPr>
-          <w:p/>
-        </w:tc>
-        <w:tc>
-          <w:tcPr>
-            <w:tcW w:type="dxa" w:w="864"/>
-          </w:tcPr>
-          <w:p/>
-        </w:tc>
-        <w:tc>
-          <w:tcPr>
-            <w:tcW w:type="dxa" w:w="864"/>
-          </w:tcPr>
-          <w:p/>
-        </w:tc>
-        <w:tc>
-          <w:tcPr>
-            <w:tcW w:type="dxa" w:w="864"/>
-          </w:tcPr>
-          <w:p/>
-        </w:tc>
-        <w:tc>
-          <w:tcPr>
-            <w:tcW w:type="dxa" w:w="864"/>
-          </w:tcPr>
-          <w:p/>
-        </w:tc>
-        <w:tc>
-          <w:tcPr>
-            <w:tcW w:type="dxa" w:w="864"/>
-          </w:tcPr>
-          <w:p/>
-        </w:tc>
-        <w:tc>
-          <w:tcPr>
-            <w:tcW w:type="dxa" w:w="864"/>
-          </w:tcPr>
-          <w:p/>
-        </w:tc>
-        <w:tc>
-          <w:tcPr>
-            <w:tcW w:type="dxa" w:w="864"/>
-          </w:tcPr>
-          <w:p/>
-        </w:tc>
-        <w:tc>
-          <w:tcPr>
-            <w:tcW w:type="dxa" w:w="864"/>
-          </w:tcPr>
-          <w:p/>
-        </w:tc>
-      </w:tr>
-      <w:tr>
-        <w:tc>
-          <w:tcPr>
-            <w:tcW w:type="dxa" w:w="864"/>
           </w:tcPr>
           <w:p>
             <w:pPr>
@@ -21140,6 +21066,68 @@
               <w:t>56.3</w:t>
             </w:r>
           </w:p>
+        </w:tc>
+      </w:tr>
+      <w:tr>
+        <w:tc>
+          <w:tcPr>
+            <w:tcW w:type="dxa" w:w="864"/>
+          </w:tcPr>
+          <w:p/>
+        </w:tc>
+        <w:tc>
+          <w:tcPr>
+            <w:tcW w:type="dxa" w:w="864"/>
+          </w:tcPr>
+          <w:p/>
+        </w:tc>
+        <w:tc>
+          <w:tcPr>
+            <w:tcW w:type="dxa" w:w="864"/>
+          </w:tcPr>
+          <w:p/>
+        </w:tc>
+        <w:tc>
+          <w:tcPr>
+            <w:tcW w:type="dxa" w:w="864"/>
+          </w:tcPr>
+          <w:p/>
+        </w:tc>
+        <w:tc>
+          <w:tcPr>
+            <w:tcW w:type="dxa" w:w="864"/>
+          </w:tcPr>
+          <w:p/>
+        </w:tc>
+        <w:tc>
+          <w:tcPr>
+            <w:tcW w:type="dxa" w:w="864"/>
+          </w:tcPr>
+          <w:p/>
+        </w:tc>
+        <w:tc>
+          <w:tcPr>
+            <w:tcW w:type="dxa" w:w="864"/>
+          </w:tcPr>
+          <w:p/>
+        </w:tc>
+        <w:tc>
+          <w:tcPr>
+            <w:tcW w:type="dxa" w:w="864"/>
+          </w:tcPr>
+          <w:p/>
+        </w:tc>
+        <w:tc>
+          <w:tcPr>
+            <w:tcW w:type="dxa" w:w="864"/>
+          </w:tcPr>
+          <w:p/>
+        </w:tc>
+        <w:tc>
+          <w:tcPr>
+            <w:tcW w:type="dxa" w:w="864"/>
+          </w:tcPr>
+          <w:p/>
         </w:tc>
       </w:tr>
     </w:tbl>
@@ -21488,70 +21476,6 @@
         <w:tc>
           <w:tcPr>
             <w:tcW w:type="dxa" w:w="864"/>
-            <w:vMerge/>
-          </w:tcPr>
-          <w:p/>
-        </w:tc>
-        <w:tc>
-          <w:tcPr>
-            <w:tcW w:type="dxa" w:w="864"/>
-            <w:vMerge/>
-          </w:tcPr>
-          <w:p/>
-        </w:tc>
-        <w:tc>
-          <w:tcPr>
-            <w:tcW w:type="dxa" w:w="864"/>
-          </w:tcPr>
-          <w:p/>
-        </w:tc>
-        <w:tc>
-          <w:tcPr>
-            <w:tcW w:type="dxa" w:w="864"/>
-          </w:tcPr>
-          <w:p/>
-        </w:tc>
-        <w:tc>
-          <w:tcPr>
-            <w:tcW w:type="dxa" w:w="864"/>
-          </w:tcPr>
-          <w:p/>
-        </w:tc>
-        <w:tc>
-          <w:tcPr>
-            <w:tcW w:type="dxa" w:w="864"/>
-          </w:tcPr>
-          <w:p/>
-        </w:tc>
-        <w:tc>
-          <w:tcPr>
-            <w:tcW w:type="dxa" w:w="864"/>
-          </w:tcPr>
-          <w:p/>
-        </w:tc>
-        <w:tc>
-          <w:tcPr>
-            <w:tcW w:type="dxa" w:w="864"/>
-          </w:tcPr>
-          <w:p/>
-        </w:tc>
-        <w:tc>
-          <w:tcPr>
-            <w:tcW w:type="dxa" w:w="864"/>
-          </w:tcPr>
-          <w:p/>
-        </w:tc>
-        <w:tc>
-          <w:tcPr>
-            <w:tcW w:type="dxa" w:w="864"/>
-          </w:tcPr>
-          <w:p/>
-        </w:tc>
-      </w:tr>
-      <w:tr>
-        <w:tc>
-          <w:tcPr>
-            <w:tcW w:type="dxa" w:w="864"/>
           </w:tcPr>
           <w:p>
             <w:pPr>
@@ -24663,6 +24587,68 @@
               <w:t>42.8</w:t>
             </w:r>
           </w:p>
+        </w:tc>
+      </w:tr>
+      <w:tr>
+        <w:tc>
+          <w:tcPr>
+            <w:tcW w:type="dxa" w:w="864"/>
+          </w:tcPr>
+          <w:p/>
+        </w:tc>
+        <w:tc>
+          <w:tcPr>
+            <w:tcW w:type="dxa" w:w="864"/>
+          </w:tcPr>
+          <w:p/>
+        </w:tc>
+        <w:tc>
+          <w:tcPr>
+            <w:tcW w:type="dxa" w:w="864"/>
+          </w:tcPr>
+          <w:p/>
+        </w:tc>
+        <w:tc>
+          <w:tcPr>
+            <w:tcW w:type="dxa" w:w="864"/>
+          </w:tcPr>
+          <w:p/>
+        </w:tc>
+        <w:tc>
+          <w:tcPr>
+            <w:tcW w:type="dxa" w:w="864"/>
+          </w:tcPr>
+          <w:p/>
+        </w:tc>
+        <w:tc>
+          <w:tcPr>
+            <w:tcW w:type="dxa" w:w="864"/>
+          </w:tcPr>
+          <w:p/>
+        </w:tc>
+        <w:tc>
+          <w:tcPr>
+            <w:tcW w:type="dxa" w:w="864"/>
+          </w:tcPr>
+          <w:p/>
+        </w:tc>
+        <w:tc>
+          <w:tcPr>
+            <w:tcW w:type="dxa" w:w="864"/>
+          </w:tcPr>
+          <w:p/>
+        </w:tc>
+        <w:tc>
+          <w:tcPr>
+            <w:tcW w:type="dxa" w:w="864"/>
+          </w:tcPr>
+          <w:p/>
+        </w:tc>
+        <w:tc>
+          <w:tcPr>
+            <w:tcW w:type="dxa" w:w="864"/>
+          </w:tcPr>
+          <w:p/>
         </w:tc>
       </w:tr>
     </w:tbl>
@@ -25011,70 +24997,6 @@
         <w:tc>
           <w:tcPr>
             <w:tcW w:type="dxa" w:w="864"/>
-            <w:vMerge/>
-          </w:tcPr>
-          <w:p/>
-        </w:tc>
-        <w:tc>
-          <w:tcPr>
-            <w:tcW w:type="dxa" w:w="864"/>
-            <w:vMerge/>
-          </w:tcPr>
-          <w:p/>
-        </w:tc>
-        <w:tc>
-          <w:tcPr>
-            <w:tcW w:type="dxa" w:w="864"/>
-          </w:tcPr>
-          <w:p/>
-        </w:tc>
-        <w:tc>
-          <w:tcPr>
-            <w:tcW w:type="dxa" w:w="864"/>
-          </w:tcPr>
-          <w:p/>
-        </w:tc>
-        <w:tc>
-          <w:tcPr>
-            <w:tcW w:type="dxa" w:w="864"/>
-          </w:tcPr>
-          <w:p/>
-        </w:tc>
-        <w:tc>
-          <w:tcPr>
-            <w:tcW w:type="dxa" w:w="864"/>
-          </w:tcPr>
-          <w:p/>
-        </w:tc>
-        <w:tc>
-          <w:tcPr>
-            <w:tcW w:type="dxa" w:w="864"/>
-          </w:tcPr>
-          <w:p/>
-        </w:tc>
-        <w:tc>
-          <w:tcPr>
-            <w:tcW w:type="dxa" w:w="864"/>
-          </w:tcPr>
-          <w:p/>
-        </w:tc>
-        <w:tc>
-          <w:tcPr>
-            <w:tcW w:type="dxa" w:w="864"/>
-          </w:tcPr>
-          <w:p/>
-        </w:tc>
-        <w:tc>
-          <w:tcPr>
-            <w:tcW w:type="dxa" w:w="864"/>
-          </w:tcPr>
-          <w:p/>
-        </w:tc>
-      </w:tr>
-      <w:tr>
-        <w:tc>
-          <w:tcPr>
-            <w:tcW w:type="dxa" w:w="864"/>
           </w:tcPr>
           <w:p>
             <w:pPr>
@@ -28186,6 +28108,68 @@
               <w:t>54.3</w:t>
             </w:r>
           </w:p>
+        </w:tc>
+      </w:tr>
+      <w:tr>
+        <w:tc>
+          <w:tcPr>
+            <w:tcW w:type="dxa" w:w="864"/>
+          </w:tcPr>
+          <w:p/>
+        </w:tc>
+        <w:tc>
+          <w:tcPr>
+            <w:tcW w:type="dxa" w:w="864"/>
+          </w:tcPr>
+          <w:p/>
+        </w:tc>
+        <w:tc>
+          <w:tcPr>
+            <w:tcW w:type="dxa" w:w="864"/>
+          </w:tcPr>
+          <w:p/>
+        </w:tc>
+        <w:tc>
+          <w:tcPr>
+            <w:tcW w:type="dxa" w:w="864"/>
+          </w:tcPr>
+          <w:p/>
+        </w:tc>
+        <w:tc>
+          <w:tcPr>
+            <w:tcW w:type="dxa" w:w="864"/>
+          </w:tcPr>
+          <w:p/>
+        </w:tc>
+        <w:tc>
+          <w:tcPr>
+            <w:tcW w:type="dxa" w:w="864"/>
+          </w:tcPr>
+          <w:p/>
+        </w:tc>
+        <w:tc>
+          <w:tcPr>
+            <w:tcW w:type="dxa" w:w="864"/>
+          </w:tcPr>
+          <w:p/>
+        </w:tc>
+        <w:tc>
+          <w:tcPr>
+            <w:tcW w:type="dxa" w:w="864"/>
+          </w:tcPr>
+          <w:p/>
+        </w:tc>
+        <w:tc>
+          <w:tcPr>
+            <w:tcW w:type="dxa" w:w="864"/>
+          </w:tcPr>
+          <w:p/>
+        </w:tc>
+        <w:tc>
+          <w:tcPr>
+            <w:tcW w:type="dxa" w:w="864"/>
+          </w:tcPr>
+          <w:p/>
         </w:tc>
       </w:tr>
     </w:tbl>
@@ -28534,70 +28518,6 @@
         <w:tc>
           <w:tcPr>
             <w:tcW w:type="dxa" w:w="864"/>
-            <w:vMerge/>
-          </w:tcPr>
-          <w:p/>
-        </w:tc>
-        <w:tc>
-          <w:tcPr>
-            <w:tcW w:type="dxa" w:w="864"/>
-            <w:vMerge/>
-          </w:tcPr>
-          <w:p/>
-        </w:tc>
-        <w:tc>
-          <w:tcPr>
-            <w:tcW w:type="dxa" w:w="864"/>
-          </w:tcPr>
-          <w:p/>
-        </w:tc>
-        <w:tc>
-          <w:tcPr>
-            <w:tcW w:type="dxa" w:w="864"/>
-          </w:tcPr>
-          <w:p/>
-        </w:tc>
-        <w:tc>
-          <w:tcPr>
-            <w:tcW w:type="dxa" w:w="864"/>
-          </w:tcPr>
-          <w:p/>
-        </w:tc>
-        <w:tc>
-          <w:tcPr>
-            <w:tcW w:type="dxa" w:w="864"/>
-          </w:tcPr>
-          <w:p/>
-        </w:tc>
-        <w:tc>
-          <w:tcPr>
-            <w:tcW w:type="dxa" w:w="864"/>
-          </w:tcPr>
-          <w:p/>
-        </w:tc>
-        <w:tc>
-          <w:tcPr>
-            <w:tcW w:type="dxa" w:w="864"/>
-          </w:tcPr>
-          <w:p/>
-        </w:tc>
-        <w:tc>
-          <w:tcPr>
-            <w:tcW w:type="dxa" w:w="864"/>
-          </w:tcPr>
-          <w:p/>
-        </w:tc>
-        <w:tc>
-          <w:tcPr>
-            <w:tcW w:type="dxa" w:w="864"/>
-          </w:tcPr>
-          <w:p/>
-        </w:tc>
-      </w:tr>
-      <w:tr>
-        <w:tc>
-          <w:tcPr>
-            <w:tcW w:type="dxa" w:w="864"/>
           </w:tcPr>
           <w:p>
             <w:pPr>
@@ -31709,6 +31629,68 @@
               <w:t>23.7</w:t>
             </w:r>
           </w:p>
+        </w:tc>
+      </w:tr>
+      <w:tr>
+        <w:tc>
+          <w:tcPr>
+            <w:tcW w:type="dxa" w:w="864"/>
+          </w:tcPr>
+          <w:p/>
+        </w:tc>
+        <w:tc>
+          <w:tcPr>
+            <w:tcW w:type="dxa" w:w="864"/>
+          </w:tcPr>
+          <w:p/>
+        </w:tc>
+        <w:tc>
+          <w:tcPr>
+            <w:tcW w:type="dxa" w:w="864"/>
+          </w:tcPr>
+          <w:p/>
+        </w:tc>
+        <w:tc>
+          <w:tcPr>
+            <w:tcW w:type="dxa" w:w="864"/>
+          </w:tcPr>
+          <w:p/>
+        </w:tc>
+        <w:tc>
+          <w:tcPr>
+            <w:tcW w:type="dxa" w:w="864"/>
+          </w:tcPr>
+          <w:p/>
+        </w:tc>
+        <w:tc>
+          <w:tcPr>
+            <w:tcW w:type="dxa" w:w="864"/>
+          </w:tcPr>
+          <w:p/>
+        </w:tc>
+        <w:tc>
+          <w:tcPr>
+            <w:tcW w:type="dxa" w:w="864"/>
+          </w:tcPr>
+          <w:p/>
+        </w:tc>
+        <w:tc>
+          <w:tcPr>
+            <w:tcW w:type="dxa" w:w="864"/>
+          </w:tcPr>
+          <w:p/>
+        </w:tc>
+        <w:tc>
+          <w:tcPr>
+            <w:tcW w:type="dxa" w:w="864"/>
+          </w:tcPr>
+          <w:p/>
+        </w:tc>
+        <w:tc>
+          <w:tcPr>
+            <w:tcW w:type="dxa" w:w="864"/>
+          </w:tcPr>
+          <w:p/>
         </w:tc>
       </w:tr>
     </w:tbl>
@@ -32057,70 +32039,6 @@
         <w:tc>
           <w:tcPr>
             <w:tcW w:type="dxa" w:w="864"/>
-            <w:vMerge/>
-          </w:tcPr>
-          <w:p/>
-        </w:tc>
-        <w:tc>
-          <w:tcPr>
-            <w:tcW w:type="dxa" w:w="864"/>
-            <w:vMerge/>
-          </w:tcPr>
-          <w:p/>
-        </w:tc>
-        <w:tc>
-          <w:tcPr>
-            <w:tcW w:type="dxa" w:w="864"/>
-          </w:tcPr>
-          <w:p/>
-        </w:tc>
-        <w:tc>
-          <w:tcPr>
-            <w:tcW w:type="dxa" w:w="864"/>
-          </w:tcPr>
-          <w:p/>
-        </w:tc>
-        <w:tc>
-          <w:tcPr>
-            <w:tcW w:type="dxa" w:w="864"/>
-          </w:tcPr>
-          <w:p/>
-        </w:tc>
-        <w:tc>
-          <w:tcPr>
-            <w:tcW w:type="dxa" w:w="864"/>
-          </w:tcPr>
-          <w:p/>
-        </w:tc>
-        <w:tc>
-          <w:tcPr>
-            <w:tcW w:type="dxa" w:w="864"/>
-          </w:tcPr>
-          <w:p/>
-        </w:tc>
-        <w:tc>
-          <w:tcPr>
-            <w:tcW w:type="dxa" w:w="864"/>
-          </w:tcPr>
-          <w:p/>
-        </w:tc>
-        <w:tc>
-          <w:tcPr>
-            <w:tcW w:type="dxa" w:w="864"/>
-          </w:tcPr>
-          <w:p/>
-        </w:tc>
-        <w:tc>
-          <w:tcPr>
-            <w:tcW w:type="dxa" w:w="864"/>
-          </w:tcPr>
-          <w:p/>
-        </w:tc>
-      </w:tr>
-      <w:tr>
-        <w:tc>
-          <w:tcPr>
-            <w:tcW w:type="dxa" w:w="864"/>
           </w:tcPr>
           <w:p>
             <w:pPr>
@@ -35232,6 +35150,68 @@
               <w:t>60.8</w:t>
             </w:r>
           </w:p>
+        </w:tc>
+      </w:tr>
+      <w:tr>
+        <w:tc>
+          <w:tcPr>
+            <w:tcW w:type="dxa" w:w="864"/>
+          </w:tcPr>
+          <w:p/>
+        </w:tc>
+        <w:tc>
+          <w:tcPr>
+            <w:tcW w:type="dxa" w:w="864"/>
+          </w:tcPr>
+          <w:p/>
+        </w:tc>
+        <w:tc>
+          <w:tcPr>
+            <w:tcW w:type="dxa" w:w="864"/>
+          </w:tcPr>
+          <w:p/>
+        </w:tc>
+        <w:tc>
+          <w:tcPr>
+            <w:tcW w:type="dxa" w:w="864"/>
+          </w:tcPr>
+          <w:p/>
+        </w:tc>
+        <w:tc>
+          <w:tcPr>
+            <w:tcW w:type="dxa" w:w="864"/>
+          </w:tcPr>
+          <w:p/>
+        </w:tc>
+        <w:tc>
+          <w:tcPr>
+            <w:tcW w:type="dxa" w:w="864"/>
+          </w:tcPr>
+          <w:p/>
+        </w:tc>
+        <w:tc>
+          <w:tcPr>
+            <w:tcW w:type="dxa" w:w="864"/>
+          </w:tcPr>
+          <w:p/>
+        </w:tc>
+        <w:tc>
+          <w:tcPr>
+            <w:tcW w:type="dxa" w:w="864"/>
+          </w:tcPr>
+          <w:p/>
+        </w:tc>
+        <w:tc>
+          <w:tcPr>
+            <w:tcW w:type="dxa" w:w="864"/>
+          </w:tcPr>
+          <w:p/>
+        </w:tc>
+        <w:tc>
+          <w:tcPr>
+            <w:tcW w:type="dxa" w:w="864"/>
+          </w:tcPr>
+          <w:p/>
         </w:tc>
       </w:tr>
     </w:tbl>

</xml_diff>

<commit_message>
perfect balance to the extent of description
</commit_message>
<xml_diff>
--- a/src/steps/docx_output/thesis.docx
+++ b/src/steps/docx_output/thesis.docx
@@ -12,50 +12,18 @@
     </w:p>
     <w:p>
       <w:r>
-        <w:t xml:space="preserve">The table no 1 examines candlestick pattern predictive capabilities in the Banking sector </w:t>
+        <w:t xml:space="preserve">The Table no. 1 examines candlestick pattern predictive capabilities in the Banking sector </w:t>
         <w:br/>
         <w:t xml:space="preserve">during a long-term Bullish market. </w:t>
         <w:br/>
         <w:br/>
-        <w:t>Temporal Performance Dynamics:</w:t>
-        <w:br/>
-        <w:t>High Predictors:</w:t>
-        <w:br/>
-        <w:t>- 2D: Hammer (78.95%)</w:t>
-        <w:br/>
-        <w:t>- 4D: Hammer (67.8%) (-14.1% change from previous horizon)</w:t>
-        <w:br/>
-        <w:t>- 8D: Hammer (68.18%)</w:t>
-        <w:br/>
-        <w:t>Low Predictors:</w:t>
-        <w:br/>
-        <w:t>- 2D: Hammer (71.93%)</w:t>
-        <w:br/>
-        <w:t>- 4D: Hammer (69.49%) (-3.4% change from previous horizon)</w:t>
-        <w:br/>
-        <w:t>- 8D: Hammer (68.18%)</w:t>
-        <w:br/>
-        <w:t>Close Predictors:</w:t>
-        <w:br/>
-        <w:t>- 2D: I. Hammer (57.01%)</w:t>
-        <w:br/>
-        <w:t>- 4D: I. Hammer (62.39%) (+9.4% change from previous horizon)</w:t>
-        <w:br/>
-        <w:t>- 8D: I. Hammer (62.24%)</w:t>
+        <w:t xml:space="preserve">Hammer shows strong performance when High criteria with trend, High criteria regardless of trend, Low criteria with trend, Low criteria regardless of trend is used instead of picking stocks randomly when we want to pick and hold for 2 Days in average. </w:t>
         <w:br/>
         <w:br/>
-        <w:t>Market Context Considerations:</w:t>
-        <w:br/>
-        <w:t>In the observed Bullish market environment:</w:t>
-        <w:br/>
-        <w:t>- Continuation patterns demonstrate enhanced reliability during sustained trends</w:t>
-        <w:br/>
-        <w:t>Sector characteristics (Banking) may influence pattern prevalence, though exact sector-specific effects require further study</w:t>
+        <w:t xml:space="preserve">Furthermore, Shooting Star shows strong performance when High criteria with trend, High criteria regardless of trend is used instead of picking stocks randomly when we want to pick and hold for 2 Days in average. And, Hammer shows strong performance when High criteria regardless of trend is used instead of picking stocks randomly when we want to pick and hold for 4 Days in average. </w:t>
         <w:br/>
         <w:br/>
-        <w:t>Conclusion:</w:t>
-        <w:br/>
-        <w:t>Significant temporal dependence observed in pattern efficacy, with most predictive value concentrated in shorter horizons. Market context and sector dynamics appear to modulate pattern reliability, though controlled studies are needed to quantify these effects.</w:t>
+        <w:t xml:space="preserve">Likewise, Hammer shows strong performance when High criteria with trend, High criteria regardless of trend, Low criteria with trend is used instead of picking stocks randomly when we want to pick and hold for 8 Days in average. </w:t>
       </w:r>
     </w:p>
     <w:tbl>
@@ -2535,55 +2503,29 @@
     </w:tbl>
     <w:p>
       <w:r>
+        <w:rPr>
+          <w:sz w:val="16"/>
+        </w:rPr>
         <w:t>Table 1. Candles Observation for Banking Stocks in Bullish Market</w:t>
       </w:r>
     </w:p>
     <w:p>
       <w:r>
-        <w:t xml:space="preserve">The table no 2 examines candlestick pattern predictive capabilities in the Banking sector </w:t>
+        <w:t xml:space="preserve">The Table no. 2 examines candlestick pattern predictive capabilities in the Banking sector </w:t>
         <w:br/>
         <w:t xml:space="preserve">during a long-term Bearish market. </w:t>
         <w:br/>
         <w:br/>
-        <w:t>Temporal Performance Dynamics:</w:t>
-        <w:br/>
-        <w:t>High Predictors:</w:t>
-        <w:br/>
-        <w:t>- 2D: Hammer (86.96%)</w:t>
-        <w:br/>
-        <w:t>- 4D: Shooting Star (70.0%) (-19.5% change from previous horizon)</w:t>
-        <w:br/>
-        <w:t>- 8D: Shooting Star (64.86%)</w:t>
-        <w:br/>
-        <w:t>Low Predictors:</w:t>
-        <w:br/>
-        <w:t>- 2D: Hammer (80.43%)</w:t>
-        <w:br/>
-        <w:t>- 4D: Shooting Star (72.5%) (-9.9% change from previous horizon)</w:t>
-        <w:br/>
-        <w:t>- 8D: Shooting Star (62.16%)</w:t>
-        <w:br/>
-        <w:t>Close Predictors:</w:t>
-        <w:br/>
-        <w:t>- 2D: Hanging Man (57.61%)</w:t>
-        <w:br/>
-        <w:t>- 4D: Shooting Star (60.0%) (+4.1% change from previous horizon)</w:t>
-        <w:br/>
-        <w:t>- 8D: Hanging Man (56.82%)</w:t>
+        <w:t xml:space="preserve">Hammer shows strong performance when High criteria with trend, High criteria regardless of trend, Low criteria with trend, Low criteria regardless of trend is used instead of picking stocks randomly when we want to pick and hold for 2 Days in average. </w:t>
         <w:br/>
         <w:br/>
-        <w:t>Market Context Considerations:</w:t>
-        <w:br/>
-        <w:t>In the observed Bearish market environment:</w:t>
-        <w:br/>
-        <w:t>- Continuation patterns demonstrate enhanced reliability during sustained trends</w:t>
-        <w:br/>
-        <w:t>Sector characteristics (Banking) may influence pattern prevalence, though exact sector-specific effects require further study</w:t>
+        <w:t xml:space="preserve">Shooting Star shows strong performance when High criteria with trend, Low criteria with trend, Low criteria regardless of trend is used instead of picking stocks randomly when we want to pick and hold for 2 Days in average. Similarly, Hammer shows strong performance when High criteria with trend, High criteria regardless of trend, Low criteria with trend, Low criteria regardless of trend is used instead of picking stocks randomly when we want to pick and hold for 4 Days in average. </w:t>
         <w:br/>
         <w:br/>
-        <w:t>Conclusion:</w:t>
+        <w:t xml:space="preserve">Hanging Man shows strong performance when Close criteria with trend is used instead of picking stocks randomly when we want to pick and hold for 4 Days in average. Likewise, Shooting Star shows strong performance when High criteria with trend, Low criteria with trend, Close criteria with trend is used instead of picking stocks randomly when we want to pick and hold for 4 Days in average. </w:t>
         <w:br/>
-        <w:t>Significant temporal dependence observed in pattern efficacy, with most predictive value concentrated in shorter horizons. Market context and sector dynamics appear to modulate pattern reliability, though controlled studies are needed to quantify these effects.</w:t>
+        <w:br/>
+        <w:t xml:space="preserve">Hanging Man shows strong performance when Low criteria with trend, Close criteria with trend is used instead of picking stocks randomly when we want to pick and hold for 8 Days in average. Additionally, Shooting Star shows strong performance when High criteria with trend, Low criteria with trend is used instead of picking stocks randomly when we want to pick and hold for 8 Days in average. </w:t>
       </w:r>
     </w:p>
     <w:tbl>
@@ -5063,55 +5005,26 @@
     </w:tbl>
     <w:p>
       <w:r>
+        <w:rPr>
+          <w:sz w:val="16"/>
+        </w:rPr>
         <w:t>Table 2. Candles Observation for Banking Stocks in Bearish Market</w:t>
       </w:r>
     </w:p>
     <w:p>
       <w:r>
-        <w:t xml:space="preserve">The table no 3 examines candlestick pattern predictive capabilities in the Hydropower sector </w:t>
+        <w:t xml:space="preserve">The Table no. 3 examines candlestick pattern predictive capabilities in the Hydropower sector </w:t>
         <w:br/>
         <w:t xml:space="preserve">during a long-term Bullish market. </w:t>
         <w:br/>
         <w:br/>
-        <w:t>Temporal Performance Dynamics:</w:t>
-        <w:br/>
-        <w:t>High Predictors:</w:t>
-        <w:br/>
-        <w:t>- 2D: Hammer (84.21%)</w:t>
-        <w:br/>
-        <w:t>- 4D: Hammer (72.97%) (-13.3% change from previous horizon)</w:t>
-        <w:br/>
-        <w:t>- 8D: Hammer (84.38%)</w:t>
-        <w:br/>
-        <w:t>Low Predictors:</w:t>
-        <w:br/>
-        <w:t>- 2D: Shooting Star (83.02%)</w:t>
-        <w:br/>
-        <w:t>- 4D: Shooting Star (74.58%) (-10.2% change from previous horizon)</w:t>
-        <w:br/>
-        <w:t>- 8D: Hammer (81.25%)</w:t>
-        <w:br/>
-        <w:t>Close Predictors:</w:t>
-        <w:br/>
-        <w:t>- 2D: Hanging Man (62.34%)</w:t>
-        <w:br/>
-        <w:t>- 4D: I. Hammer (65.42%) (+4.9% change from previous horizon)</w:t>
-        <w:br/>
-        <w:t>- 8D: Random* (76.02%)</w:t>
+        <w:t xml:space="preserve">Hammer shows strong performance when High criteria with trend, High criteria regardless of trend, Low criteria with trend, Low criteria regardless of trend is used instead of picking stocks randomly when we want to pick and hold for 2 Days in average. </w:t>
         <w:br/>
         <w:br/>
-        <w:t>Market Context Considerations:</w:t>
-        <w:br/>
-        <w:t>In the observed Bullish market environment:</w:t>
-        <w:br/>
-        <w:t>- Continuation patterns demonstrate enhanced reliability during sustained trends</w:t>
-        <w:br/>
-        <w:t>Sector characteristics (Hydropower) may influence pattern prevalence, though exact sector-specific effects require further study</w:t>
+        <w:t xml:space="preserve">Shooting Star shows strong performance when Low criteria with trend, Low criteria regardless of trend is used instead of picking stocks randomly when we want to pick and hold for 2 Days in average. And, Hammer shows strong performance when High criteria with trend, Low criteria with trend is used instead of picking stocks randomly when we want to pick and hold for 4 Days in average. </w:t>
         <w:br/>
         <w:br/>
-        <w:t>Conclusion:</w:t>
-        <w:br/>
-        <w:t>Significant temporal dependence observed in pattern efficacy, with most predictive value concentrated in shorter horizons. Market context and sector dynamics appear to modulate pattern reliability, though controlled studies are needed to quantify these effects.</w:t>
+        <w:t xml:space="preserve">Additionally, Shooting Star shows strong performance when Low criteria regardless of trend is used instead of picking stocks randomly when we want to pick and hold for 4 Days in average. Furthermore, Hammer shows strong performance when High criteria with trend, Low criteria with trend is used instead of picking stocks randomly when we want to pick and hold for 8 Days in average. </w:t>
       </w:r>
     </w:p>
     <w:tbl>
@@ -7591,55 +7504,29 @@
     </w:tbl>
     <w:p>
       <w:r>
+        <w:rPr>
+          <w:sz w:val="16"/>
+        </w:rPr>
         <w:t>Table 3. Candles Observation for Hydropower Stocks in Bullish Market</w:t>
       </w:r>
     </w:p>
     <w:p>
       <w:r>
-        <w:t xml:space="preserve">The table no 4 examines candlestick pattern predictive capabilities in the Hydropower sector </w:t>
+        <w:t xml:space="preserve">The Table no. 4 examines candlestick pattern predictive capabilities in the Hydropower sector </w:t>
         <w:br/>
         <w:t xml:space="preserve">during a long-term Bearish market. </w:t>
         <w:br/>
         <w:br/>
-        <w:t>Temporal Performance Dynamics:</w:t>
-        <w:br/>
-        <w:t>High Predictors:</w:t>
-        <w:br/>
-        <w:t>- 2D: Shooting Star (76.92%)</w:t>
-        <w:br/>
-        <w:t>- 4D: Shooting Star (80.0%) (+4.0% change from previous horizon)</w:t>
-        <w:br/>
-        <w:t>- 8D: Shooting Star (79.55%)</w:t>
-        <w:br/>
-        <w:t>Low Predictors:</w:t>
-        <w:br/>
-        <w:t>- 2D: Shooting Star (74.36%)</w:t>
-        <w:br/>
-        <w:t>- 4D: Shooting Star (82.5%) (+10.9% change from previous horizon)</w:t>
-        <w:br/>
-        <w:t>- 8D: Shooting Star (77.27%)</w:t>
-        <w:br/>
-        <w:t>Close Predictors:</w:t>
-        <w:br/>
-        <w:t>- 2D: Hanging Man (72.0%)</w:t>
-        <w:br/>
-        <w:t>- 4D: Shooting Star (62.5%) (-13.2% change from previous horizon)</w:t>
-        <w:br/>
-        <w:t>- 8D: Shooting Star (77.27%)</w:t>
+        <w:t xml:space="preserve">Hammer shows strong performance when High criteria with trend is used instead of picking stocks randomly when we want to pick and hold for 2 Days in average. </w:t>
         <w:br/>
         <w:br/>
-        <w:t>Market Context Considerations:</w:t>
-        <w:br/>
-        <w:t>In the observed Bearish market environment:</w:t>
-        <w:br/>
-        <w:t>- Continuation patterns demonstrate enhanced reliability during sustained trends</w:t>
-        <w:br/>
-        <w:t>Sector characteristics (Hydropower) may influence pattern prevalence, though exact sector-specific effects require further study</w:t>
+        <w:t xml:space="preserve">Furthermore, Hanging Man shows strong performance when Low criteria with trend, Close criteria with trend is used instead of picking stocks randomly when we want to pick and hold for 2 Days in average. Furthermore, Shooting Star shows strong performance when High criteria with trend, Low criteria with trend, Low criteria regardless of trend, Close criteria with trend is used instead of picking stocks randomly when we want to pick and hold for 2 Days in average. </w:t>
         <w:br/>
         <w:br/>
-        <w:t>Conclusion:</w:t>
+        <w:t xml:space="preserve">Similarly, Hanging Man shows strong performance when Close criteria with trend is used instead of picking stocks randomly when we want to pick and hold for 4 Days in average. And, Shooting Star shows strong performance when High criteria with trend, Low criteria with trend, Low criteria regardless of trend, Close criteria with trend is used instead of picking stocks randomly when we want to pick and hold for 4 Days in average. </w:t>
         <w:br/>
-        <w:t>Significant temporal dependence observed in pattern efficacy, with most predictive value concentrated in shorter horizons. Market context and sector dynamics appear to modulate pattern reliability, though controlled studies are needed to quantify these effects.</w:t>
+        <w:br/>
+        <w:t xml:space="preserve">Hanging Man shows strong performance when High criteria with trend, Low criteria with trend, Close criteria with trend is used instead of picking stocks randomly when we want to pick and hold for 8 Days in average. Similarly, Shooting Star shows strong performance when High criteria with trend, Low criteria with trend, Close criteria with trend is used instead of picking stocks randomly when we want to pick and hold for 8 Days in average. </w:t>
       </w:r>
     </w:p>
     <w:tbl>
@@ -10119,55 +10006,26 @@
     </w:tbl>
     <w:p>
       <w:r>
+        <w:rPr>
+          <w:sz w:val="16"/>
+        </w:rPr>
         <w:t>Table 4. Candles Observation for Hydropower Stocks in Bearish Market</w:t>
       </w:r>
     </w:p>
     <w:p>
       <w:r>
-        <w:t xml:space="preserve">The table no 5 examines candlestick pattern predictive capabilities in the Micro finance sector </w:t>
+        <w:t xml:space="preserve">The Table no. 5 examines candlestick pattern predictive capabilities in the Micro finance sector </w:t>
         <w:br/>
         <w:t xml:space="preserve">during a long-term Bullish market. </w:t>
         <w:br/>
         <w:br/>
-        <w:t>Temporal Performance Dynamics:</w:t>
-        <w:br/>
-        <w:t>High Predictors:</w:t>
-        <w:br/>
-        <w:t>- 2D: Hammer (75.0%)</w:t>
-        <w:br/>
-        <w:t>- 4D: Hammer (72.92%) (-2.8% change from previous horizon)</w:t>
-        <w:br/>
-        <w:t>- 8D: Hammer (71.93%)</w:t>
-        <w:br/>
-        <w:t>Low Predictors:</w:t>
-        <w:br/>
-        <w:t>- 2D: Hammer (71.15%)</w:t>
-        <w:br/>
-        <w:t>- 4D: Hammer (75.0%) (+5.4% change from previous horizon)</w:t>
-        <w:br/>
-        <w:t>- 8D: Hammer (75.44%)</w:t>
-        <w:br/>
-        <w:t>Close Predictors:</w:t>
-        <w:br/>
-        <w:t>- 2D: Random* (64.09%)</w:t>
-        <w:br/>
-        <w:t>- 4D: Random* (59.64%) (-6.9% change from previous horizon)</w:t>
-        <w:br/>
-        <w:t>- 8D: Random* (66.67%)</w:t>
+        <w:t xml:space="preserve">Hammer shows strong performance when High criteria with trend, High criteria regardless of trend, Low criteria with trend, Low criteria regardless of trend is used instead of picking stocks randomly when we want to pick and hold for 2 Days in average. </w:t>
         <w:br/>
         <w:br/>
-        <w:t>Market Context Considerations:</w:t>
-        <w:br/>
-        <w:t>In the observed Bullish market environment:</w:t>
-        <w:br/>
-        <w:t>- Continuation patterns demonstrate enhanced reliability during sustained trends</w:t>
-        <w:br/>
-        <w:t>Sector characteristics (Micro Finance) may influence pattern prevalence, though exact sector-specific effects require further study</w:t>
+        <w:t xml:space="preserve">Shooting Star shows strong performance when Low criteria regardless of trend is used instead of picking stocks randomly when we want to pick and hold for 2 Days in average. Likewise, Hammer shows strong performance when High criteria with trend, High criteria regardless of trend, Low criteria with trend, Low criteria regardless of trend is used instead of picking stocks randomly when we want to pick and hold for 4 Days in average. </w:t>
         <w:br/>
         <w:br/>
-        <w:t>Conclusion:</w:t>
-        <w:br/>
-        <w:t>Significant temporal dependence observed in pattern efficacy, with most predictive value concentrated in shorter horizons. Market context and sector dynamics appear to modulate pattern reliability, though controlled studies are needed to quantify these effects.</w:t>
+        <w:t xml:space="preserve">And, Hammer shows strong performance when High criteria with trend, High criteria regardless of trend, Low criteria with trend, Low criteria regardless of trend is used instead of picking stocks randomly when we want to pick and hold for 8 Days in average. </w:t>
       </w:r>
     </w:p>
     <w:tbl>
@@ -12647,55 +12505,29 @@
     </w:tbl>
     <w:p>
       <w:r>
+        <w:rPr>
+          <w:sz w:val="16"/>
+        </w:rPr>
         <w:t>Table 5. Candles Observation for Micro Finance Stocks in Bullish Market</w:t>
       </w:r>
     </w:p>
     <w:p>
       <w:r>
-        <w:t xml:space="preserve">The table no 6 examines candlestick pattern predictive capabilities in the Micro finance sector </w:t>
+        <w:t xml:space="preserve">The Table no. 6 examines candlestick pattern predictive capabilities in the Micro finance sector </w:t>
         <w:br/>
         <w:t xml:space="preserve">during a long-term Bearish market. </w:t>
         <w:br/>
         <w:br/>
-        <w:t>Temporal Performance Dynamics:</w:t>
-        <w:br/>
-        <w:t>High Predictors:</w:t>
-        <w:br/>
-        <w:t>- 2D: Shooting Star (76.54%)</w:t>
-        <w:br/>
-        <w:t>- 4D: Shooting Star (70.37%) (-8.1% change from previous horizon)</w:t>
-        <w:br/>
-        <w:t>- 8D: Shooting Star (69.77%)</w:t>
-        <w:br/>
-        <w:t>Low Predictors:</w:t>
-        <w:br/>
-        <w:t>- 2D: Shooting Star (86.42%)</w:t>
-        <w:br/>
-        <w:t>- 4D: Shooting Star (71.6%) (-17.1% change from previous horizon)</w:t>
-        <w:br/>
-        <w:t>- 8D: Shooting Star (69.77%)</w:t>
-        <w:br/>
-        <w:t>Close Predictors:</w:t>
-        <w:br/>
-        <w:t>- 2D: Hanging Man (59.84%)</w:t>
-        <w:br/>
-        <w:t>- 4D: Hanging Man (68.13%) (+13.9% change from previous horizon)</w:t>
-        <w:br/>
-        <w:t>- 8D: Shooting Star (56.98%)</w:t>
+        <w:t xml:space="preserve">Hammer shows strong performance when High criteria with trend, High criteria regardless of trend is used instead of picking stocks randomly when we want to pick and hold for 2 Days in average. </w:t>
         <w:br/>
         <w:br/>
-        <w:t>Market Context Considerations:</w:t>
-        <w:br/>
-        <w:t>In the observed Bearish market environment:</w:t>
-        <w:br/>
-        <w:t>- Continuation patterns demonstrate enhanced reliability during sustained trends</w:t>
-        <w:br/>
-        <w:t>Sector characteristics (Micro Finance) may influence pattern prevalence, though exact sector-specific effects require further study</w:t>
+        <w:t xml:space="preserve">Furthermore, Hanging Man shows strong performance when Close criteria with trend is used instead of picking stocks randomly when we want to pick and hold for 2 Days in average. Similarly, Shooting Star shows strong performance when High criteria with trend, Low criteria with trend, Low criteria regardless of trend is used instead of picking stocks randomly when we want to pick and hold for 2 Days in average. </w:t>
         <w:br/>
         <w:br/>
-        <w:t>Conclusion:</w:t>
+        <w:t xml:space="preserve">Likewise, Hanging Man shows strong performance when Close criteria with trend is used instead of picking stocks randomly when we want to pick and hold for 4 Days in average. Furthermore, Shooting Star shows strong performance when High criteria with trend, Low criteria with trend is used instead of picking stocks randomly when we want to pick and hold for 4 Days in average. </w:t>
         <w:br/>
-        <w:t>Significant temporal dependence observed in pattern efficacy, with most predictive value concentrated in shorter horizons. Market context and sector dynamics appear to modulate pattern reliability, though controlled studies are needed to quantify these effects.</w:t>
+        <w:br/>
+        <w:t xml:space="preserve">Additionally, Hanging Man shows strong performance when Close criteria with trend is used instead of picking stocks randomly when we want to pick and hold for 8 Days in average. And, Shooting Star shows strong performance when High criteria with trend, Low criteria with trend, Close criteria with trend is used instead of picking stocks randomly when we want to pick and hold for 8 Days in average. </w:t>
       </w:r>
     </w:p>
     <w:tbl>
@@ -15175,55 +15007,26 @@
     </w:tbl>
     <w:p>
       <w:r>
+        <w:rPr>
+          <w:sz w:val="16"/>
+        </w:rPr>
         <w:t>Table 6. Candles Observation for Micro Finance Stocks in Bearish Market</w:t>
       </w:r>
     </w:p>
     <w:p>
       <w:r>
-        <w:t xml:space="preserve">The table no 7 examines candlestick pattern predictive capabilities in the Expensive stocks sector </w:t>
+        <w:t xml:space="preserve">The Table no. 7 examines candlestick pattern predictive capabilities in the Expensive stocks sector </w:t>
         <w:br/>
         <w:t xml:space="preserve">during a long-term Bullish market. </w:t>
         <w:br/>
         <w:br/>
-        <w:t>Temporal Performance Dynamics:</w:t>
-        <w:br/>
-        <w:t>High Predictors:</w:t>
-        <w:br/>
-        <w:t>- 2D: Hammer (71.43%)</w:t>
-        <w:br/>
-        <w:t>- 4D: Hammer (74.07%) (+3.7% change from previous horizon)</w:t>
-        <w:br/>
-        <w:t>- 8D: Hammer (81.82%)</w:t>
-        <w:br/>
-        <w:t>Low Predictors:</w:t>
-        <w:br/>
-        <w:t>- 2D: Shooting Star (70.42%)</w:t>
-        <w:br/>
-        <w:t>- 4D: Hammer (74.07%) (+5.2% change from previous horizon)</w:t>
-        <w:br/>
-        <w:t>- 8D: Hammer (81.82%)</w:t>
-        <w:br/>
-        <w:t>Close Predictors:</w:t>
-        <w:br/>
-        <w:t>- 2D: Hanging Man (60.98%)</w:t>
-        <w:br/>
-        <w:t>- 4D: Random* (60.37%) (-1.0% change from previous horizon)</w:t>
-        <w:br/>
-        <w:t>- 8D: Random* (64.29%)</w:t>
+        <w:t xml:space="preserve">Hammer shows strong performance when High criteria with trend, High criteria regardless of trend is used instead of picking stocks randomly when we want to pick and hold for 2 Days in average. </w:t>
         <w:br/>
         <w:br/>
-        <w:t>Market Context Considerations:</w:t>
-        <w:br/>
-        <w:t>In the observed Bullish market environment:</w:t>
-        <w:br/>
-        <w:t>- Continuation patterns demonstrate enhanced reliability during sustained trends</w:t>
-        <w:br/>
-        <w:t>Sector characteristics (Expensive Stocks) may influence pattern prevalence, though exact sector-specific effects require further study</w:t>
+        <w:t xml:space="preserve">Furthermore, Shooting Star shows strong performance when High criteria with trend, Low criteria with trend, Low criteria regardless of trend is used instead of picking stocks randomly when we want to pick and hold for 2 Days in average. Likewise, Hammer shows strong performance when High criteria with trend, High criteria regardless of trend, Low criteria with trend is used instead of picking stocks randomly when we want to pick and hold for 4 Days in average. </w:t>
         <w:br/>
         <w:br/>
-        <w:t>Conclusion:</w:t>
-        <w:br/>
-        <w:t>Significant temporal dependence observed in pattern efficacy, with most predictive value concentrated in shorter horizons. Market context and sector dynamics appear to modulate pattern reliability, though controlled studies are needed to quantify these effects.</w:t>
+        <w:t xml:space="preserve">Hammer shows strong performance when High criteria with trend, Low criteria with trend is used instead of picking stocks randomly when we want to pick and hold for 8 Days in average. </w:t>
       </w:r>
     </w:p>
     <w:tbl>
@@ -17703,55 +17506,29 @@
     </w:tbl>
     <w:p>
       <w:r>
+        <w:rPr>
+          <w:sz w:val="16"/>
+        </w:rPr>
         <w:t>Table 7. Candles Observation for Expensive Stocks Stocks in Bullish Market</w:t>
       </w:r>
     </w:p>
     <w:p>
       <w:r>
-        <w:t xml:space="preserve">The table no 8 examines candlestick pattern predictive capabilities in the Expensive stocks sector </w:t>
+        <w:t xml:space="preserve">The Table no. 8 examines candlestick pattern predictive capabilities in the Expensive stocks sector </w:t>
         <w:br/>
         <w:t xml:space="preserve">during a long-term Bearish market. </w:t>
         <w:br/>
         <w:br/>
-        <w:t>Temporal Performance Dynamics:</w:t>
-        <w:br/>
-        <w:t>High Predictors:</w:t>
-        <w:br/>
-        <w:t>- 2D: Shooting Star (78.33%)</w:t>
-        <w:br/>
-        <w:t>- 4D: Shooting Star (71.15%) (-9.2% change from previous horizon)</w:t>
-        <w:br/>
-        <w:t>- 8D: Shooting Star (72.88%)</w:t>
-        <w:br/>
-        <w:t>Low Predictors:</w:t>
-        <w:br/>
-        <w:t>- 2D: Hammer (81.13%)</w:t>
-        <w:br/>
-        <w:t>- 4D: Shooting Star (71.15%) (-12.3% change from previous horizon)</w:t>
-        <w:br/>
-        <w:t>- 8D: Shooting Star (67.8%)</w:t>
-        <w:br/>
-        <w:t>Close Predictors:</w:t>
-        <w:br/>
-        <w:t>- 2D: Hanging Man (58.06%)</w:t>
-        <w:br/>
-        <w:t>- 4D: Hanging Man (60.34%) (+3.9% change from previous horizon)</w:t>
-        <w:br/>
-        <w:t>- 8D: Shooting Star (61.02%)</w:t>
+        <w:t xml:space="preserve">Hammer shows strong performance when High criteria with trend, High criteria regardless of trend, Low criteria with trend, Low criteria regardless of trend is used instead of picking stocks randomly when we want to pick and hold for 2 Days in average. </w:t>
         <w:br/>
         <w:br/>
-        <w:t>Market Context Considerations:</w:t>
-        <w:br/>
-        <w:t>In the observed Bearish market environment:</w:t>
-        <w:br/>
-        <w:t>- Continuation patterns demonstrate enhanced reliability during sustained trends</w:t>
-        <w:br/>
-        <w:t>Sector characteristics (Expensive Stocks) may influence pattern prevalence, though exact sector-specific effects require further study</w:t>
+        <w:t xml:space="preserve">Similarly, Shooting Star shows strong performance when High criteria with trend, Low criteria with trend, Low criteria regardless of trend is used instead of picking stocks randomly when we want to pick and hold for 2 Days in average. Similarly, Hammer shows strong performance when High criteria with trend, High criteria regardless of trend is used instead of picking stocks randomly when we want to pick and hold for 4 Days in average. </w:t>
         <w:br/>
         <w:br/>
-        <w:t>Conclusion:</w:t>
+        <w:t xml:space="preserve">Shooting Star shows strong performance when High criteria with trend, Low criteria with trend is used instead of picking stocks randomly when we want to pick and hold for 4 Days in average. Likewise, Hanging Man shows strong performance when Close criteria with trend is used instead of picking stocks randomly when we want to pick and hold for 8 Days in average. </w:t>
         <w:br/>
-        <w:t>Significant temporal dependence observed in pattern efficacy, with most predictive value concentrated in shorter horizons. Market context and sector dynamics appear to modulate pattern reliability, though controlled studies are needed to quantify these effects.</w:t>
+        <w:br/>
+        <w:t xml:space="preserve">Additionally, Shooting Star shows strong performance when High criteria with trend, Low criteria with trend, Close criteria with trend is used instead of picking stocks randomly when we want to pick and hold for 8 Days in average. </w:t>
       </w:r>
     </w:p>
     <w:tbl>
@@ -20231,55 +20008,26 @@
     </w:tbl>
     <w:p>
       <w:r>
+        <w:rPr>
+          <w:sz w:val="16"/>
+        </w:rPr>
         <w:t>Table 8. Candles Observation for Expensive Stocks Stocks in Bearish Market</w:t>
       </w:r>
     </w:p>
     <w:p>
       <w:r>
-        <w:t xml:space="preserve">The table no 9 examines candlestick pattern predictive capabilities in the Low floating stocks sector </w:t>
+        <w:t xml:space="preserve">The Table no. 9 examines candlestick pattern predictive capabilities in the Low floating stocks sector </w:t>
         <w:br/>
         <w:t xml:space="preserve">during a long-term Bullish market. </w:t>
         <w:br/>
         <w:br/>
-        <w:t>Temporal Performance Dynamics:</w:t>
-        <w:br/>
-        <w:t>High Predictors:</w:t>
-        <w:br/>
-        <w:t>- 2D: Hammer (78.95%)</w:t>
-        <w:br/>
-        <w:t>- 4D: Hammer (72.41%) (-8.3% change from previous horizon)</w:t>
-        <w:br/>
-        <w:t>- 8D: Random* (74.34%)</w:t>
-        <w:br/>
-        <w:t>Low Predictors:</w:t>
-        <w:br/>
-        <w:t>- 2D: Shooting Star (84.62%)</w:t>
-        <w:br/>
-        <w:t>- 4D: Hammer (72.41%) (-14.4% change from previous horizon)</w:t>
-        <w:br/>
-        <w:t>- 8D: Hammer (68.97%)</w:t>
-        <w:br/>
-        <w:t>Close Predictors:</w:t>
-        <w:br/>
-        <w:t>- 2D: I. Hammer (63.01%)</w:t>
-        <w:br/>
-        <w:t>- 4D: I. Hammer (66.1%) (+4.9% change from previous horizon)</w:t>
-        <w:br/>
-        <w:t>- 8D: Random* (72.37%)</w:t>
+        <w:t xml:space="preserve">Hammer shows strong performance when High criteria with trend, Low criteria with trend, Low criteria regardless of trend is used instead of picking stocks randomly when we want to pick and hold for 2 Days in average. </w:t>
         <w:br/>
         <w:br/>
-        <w:t>Market Context Considerations:</w:t>
-        <w:br/>
-        <w:t>In the observed Bullish market environment:</w:t>
-        <w:br/>
-        <w:t>- Continuation patterns demonstrate enhanced reliability during sustained trends</w:t>
-        <w:br/>
-        <w:t>Sector characteristics (Low Floating Stocks) may influence pattern prevalence, though exact sector-specific effects require further study</w:t>
+        <w:t xml:space="preserve">Shooting Star shows strong performance when High criteria with trend, Low criteria with trend, Low criteria regardless of trend is used instead of picking stocks randomly when we want to pick and hold for 2 Days in average. Likewise, Hammer shows strong performance when High criteria with trend, Low criteria with trend is used instead of picking stocks randomly when we want to pick and hold for 4 Days in average. </w:t>
         <w:br/>
         <w:br/>
-        <w:t>Conclusion:</w:t>
-        <w:br/>
-        <w:t>Significant temporal dependence observed in pattern efficacy, with most predictive value concentrated in shorter horizons. Market context and sector dynamics appear to modulate pattern reliability, though controlled studies are needed to quantify these effects.</w:t>
+        <w:t xml:space="preserve">Shooting Star shows strong performance when Low criteria regardless of trend is used instead of picking stocks randomly when we want to pick and hold for 4 Days in average. </w:t>
       </w:r>
     </w:p>
     <w:tbl>
@@ -22759,55 +22507,32 @@
     </w:tbl>
     <w:p>
       <w:r>
+        <w:rPr>
+          <w:sz w:val="16"/>
+        </w:rPr>
         <w:t>Table 9. Candles Observation for Low Floating Stocks Stocks in Bullish Market</w:t>
       </w:r>
     </w:p>
     <w:p>
       <w:r>
-        <w:t xml:space="preserve">The table no 10 examines candlestick pattern predictive capabilities in the Low floating stocks sector </w:t>
+        <w:t xml:space="preserve">The Table no. 10 examines candlestick pattern predictive capabilities in the Low floating stocks sector </w:t>
         <w:br/>
         <w:t xml:space="preserve">during a long-term Bearish market. </w:t>
         <w:br/>
         <w:br/>
-        <w:t>Temporal Performance Dynamics:</w:t>
-        <w:br/>
-        <w:t>High Predictors:</w:t>
-        <w:br/>
-        <w:t>- 2D: Shooting Star (70.0%)</w:t>
-        <w:br/>
-        <w:t>- 4D: Shooting Star (65.52%) (-6.4% change from previous horizon)</w:t>
-        <w:br/>
-        <w:t>- 8D: Shooting Star (73.53%)</w:t>
-        <w:br/>
-        <w:t>Low Predictors:</w:t>
-        <w:br/>
-        <w:t>- 2D: Shooting Star (80.0%)</w:t>
-        <w:br/>
-        <w:t>- 4D: Shooting Star (75.86%) (-5.2% change from previous horizon)</w:t>
-        <w:br/>
-        <w:t>- 8D: Shooting Star (70.59%)</w:t>
-        <w:br/>
-        <w:t>Close Predictors:</w:t>
-        <w:br/>
-        <w:t>- 2D: Hanging Man (61.64%)</w:t>
-        <w:br/>
-        <w:t>- 4D: Hanging Man (61.54%) (-0.2% change from previous horizon)</w:t>
-        <w:br/>
-        <w:t>- 8D: Shooting Star (58.82%)</w:t>
+        <w:t xml:space="preserve">Hammer shows strong performance when Low criteria with trend is used instead of picking stocks randomly when we want to pick and hold for 2 Days in average. </w:t>
         <w:br/>
         <w:br/>
-        <w:t>Market Context Considerations:</w:t>
-        <w:br/>
-        <w:t>In the observed Bearish market environment:</w:t>
-        <w:br/>
-        <w:t>- Continuation patterns demonstrate enhanced reliability during sustained trends</w:t>
-        <w:br/>
-        <w:t>Sector characteristics (Low Floating Stocks) may influence pattern prevalence, though exact sector-specific effects require further study</w:t>
+        <w:t xml:space="preserve">Hanging Man shows strong performance when Close criteria with trend is used instead of picking stocks randomly when we want to pick and hold for 2 Days in average. Furthermore, Shooting Star shows strong performance when High criteria with trend, Low criteria with trend, Low criteria regardless of trend is used instead of picking stocks randomly when we want to pick and hold for 2 Days in average. </w:t>
         <w:br/>
         <w:br/>
-        <w:t>Conclusion:</w:t>
+        <w:t xml:space="preserve">Additionally, Hammer shows strong performance when High criteria with trend, Low criteria with trend is used instead of picking stocks randomly when we want to pick and hold for 4 Days in average. Furthermore, Hanging Man shows strong performance when Close criteria with trend is used instead of picking stocks randomly when we want to pick and hold for 4 Days in average. </w:t>
         <w:br/>
-        <w:t>Significant temporal dependence observed in pattern efficacy, with most predictive value concentrated in shorter horizons. Market context and sector dynamics appear to modulate pattern reliability, though controlled studies are needed to quantify these effects.</w:t>
+        <w:br/>
+        <w:t xml:space="preserve">Shooting Star shows strong performance when High criteria with trend, Low criteria with trend, Low criteria regardless of trend is used instead of picking stocks randomly when we want to pick and hold for 4 Days in average. Similarly, Hanging Man shows strong performance when Close criteria with trend is used instead of picking stocks randomly when we want to pick and hold for 8 Days in average. </w:t>
+        <w:br/>
+        <w:br/>
+        <w:t xml:space="preserve">Similarly, Shooting Star shows strong performance when High criteria with trend, Low criteria with trend, Close criteria with trend is used instead of picking stocks randomly when we want to pick and hold for 8 Days in average. </w:t>
       </w:r>
     </w:p>
     <w:tbl>
@@ -25287,6 +25012,9 @@
     </w:tbl>
     <w:p>
       <w:r>
+        <w:rPr>
+          <w:sz w:val="16"/>
+        </w:rPr>
         <w:t>Table 10. Candles Observation for Low Floating Stocks Stocks in Bearish Market</w:t>
       </w:r>
     </w:p>

</xml_diff>

<commit_message>
now finally, the table is done
</commit_message>
<xml_diff>
--- a/src/steps/docx_output/thesis.docx
+++ b/src/steps/docx_output/thesis.docx
@@ -22,9 +22,7 @@
         <w:tc>
           <w:tcPr>
             <w:tcW w:type="dxa" w:w="1080"/>
-            <w:tcBorders>
-              <w:bottom w:val="nil"/>
-            </w:tcBorders>
+            <w:vMerge w:val="restart"/>
           </w:tcPr>
           <w:p>
             <w:r>
@@ -35,9 +33,7 @@
         <w:tc>
           <w:tcPr>
             <w:tcW w:type="dxa" w:w="1080"/>
-            <w:tcBorders>
-              <w:bottom w:val="nil"/>
-            </w:tcBorders>
+            <w:vMerge w:val="restart"/>
           </w:tcPr>
           <w:p>
             <w:r>
@@ -83,18 +79,16 @@
         <w:tc>
           <w:tcPr>
             <w:tcW w:type="dxa" w:w="1080"/>
-          </w:tcPr>
-          <w:p>
-            <w:r/>
-          </w:p>
-        </w:tc>
-        <w:tc>
-          <w:tcPr>
-            <w:tcW w:type="dxa" w:w="1080"/>
-          </w:tcPr>
-          <w:p>
-            <w:r/>
-          </w:p>
+            <w:vMerge w:val="continue"/>
+          </w:tcPr>
+          <w:p/>
+        </w:tc>
+        <w:tc>
+          <w:tcPr>
+            <w:tcW w:type="dxa" w:w="1080"/>
+            <w:vMerge w:val="continue"/>
+          </w:tcPr>
+          <w:p/>
         </w:tc>
         <w:tc>
           <w:tcPr>
@@ -1386,9 +1380,7 @@
         <w:tc>
           <w:tcPr>
             <w:tcW w:type="dxa" w:w="1080"/>
-            <w:tcBorders>
-              <w:bottom w:val="nil"/>
-            </w:tcBorders>
+            <w:vMerge w:val="restart"/>
           </w:tcPr>
           <w:p>
             <w:r>
@@ -1399,9 +1391,7 @@
         <w:tc>
           <w:tcPr>
             <w:tcW w:type="dxa" w:w="1080"/>
-            <w:tcBorders>
-              <w:bottom w:val="nil"/>
-            </w:tcBorders>
+            <w:vMerge w:val="restart"/>
           </w:tcPr>
           <w:p>
             <w:r>
@@ -1447,18 +1437,16 @@
         <w:tc>
           <w:tcPr>
             <w:tcW w:type="dxa" w:w="1080"/>
-          </w:tcPr>
-          <w:p>
-            <w:r/>
-          </w:p>
-        </w:tc>
-        <w:tc>
-          <w:tcPr>
-            <w:tcW w:type="dxa" w:w="1080"/>
-          </w:tcPr>
-          <w:p>
-            <w:r/>
-          </w:p>
+            <w:vMerge w:val="continue"/>
+          </w:tcPr>
+          <w:p/>
+        </w:tc>
+        <w:tc>
+          <w:tcPr>
+            <w:tcW w:type="dxa" w:w="1080"/>
+            <w:vMerge w:val="continue"/>
+          </w:tcPr>
+          <w:p/>
         </w:tc>
         <w:tc>
           <w:tcPr>
@@ -2750,9 +2738,7 @@
         <w:tc>
           <w:tcPr>
             <w:tcW w:type="dxa" w:w="1080"/>
-            <w:tcBorders>
-              <w:bottom w:val="nil"/>
-            </w:tcBorders>
+            <w:vMerge w:val="restart"/>
           </w:tcPr>
           <w:p>
             <w:r>
@@ -2763,9 +2749,7 @@
         <w:tc>
           <w:tcPr>
             <w:tcW w:type="dxa" w:w="1080"/>
-            <w:tcBorders>
-              <w:bottom w:val="nil"/>
-            </w:tcBorders>
+            <w:vMerge w:val="restart"/>
           </w:tcPr>
           <w:p>
             <w:r>
@@ -2811,18 +2795,16 @@
         <w:tc>
           <w:tcPr>
             <w:tcW w:type="dxa" w:w="1080"/>
-          </w:tcPr>
-          <w:p>
-            <w:r/>
-          </w:p>
-        </w:tc>
-        <w:tc>
-          <w:tcPr>
-            <w:tcW w:type="dxa" w:w="1080"/>
-          </w:tcPr>
-          <w:p>
-            <w:r/>
-          </w:p>
+            <w:vMerge w:val="continue"/>
+          </w:tcPr>
+          <w:p/>
+        </w:tc>
+        <w:tc>
+          <w:tcPr>
+            <w:tcW w:type="dxa" w:w="1080"/>
+            <w:vMerge w:val="continue"/>
+          </w:tcPr>
+          <w:p/>
         </w:tc>
         <w:tc>
           <w:tcPr>
@@ -4114,9 +4096,7 @@
         <w:tc>
           <w:tcPr>
             <w:tcW w:type="dxa" w:w="1080"/>
-            <w:tcBorders>
-              <w:bottom w:val="nil"/>
-            </w:tcBorders>
+            <w:vMerge w:val="restart"/>
           </w:tcPr>
           <w:p>
             <w:r>
@@ -4127,9 +4107,7 @@
         <w:tc>
           <w:tcPr>
             <w:tcW w:type="dxa" w:w="1080"/>
-            <w:tcBorders>
-              <w:bottom w:val="nil"/>
-            </w:tcBorders>
+            <w:vMerge w:val="restart"/>
           </w:tcPr>
           <w:p>
             <w:r>
@@ -4175,18 +4153,16 @@
         <w:tc>
           <w:tcPr>
             <w:tcW w:type="dxa" w:w="1080"/>
-          </w:tcPr>
-          <w:p>
-            <w:r/>
-          </w:p>
-        </w:tc>
-        <w:tc>
-          <w:tcPr>
-            <w:tcW w:type="dxa" w:w="1080"/>
-          </w:tcPr>
-          <w:p>
-            <w:r/>
-          </w:p>
+            <w:vMerge w:val="continue"/>
+          </w:tcPr>
+          <w:p/>
+        </w:tc>
+        <w:tc>
+          <w:tcPr>
+            <w:tcW w:type="dxa" w:w="1080"/>
+            <w:vMerge w:val="continue"/>
+          </w:tcPr>
+          <w:p/>
         </w:tc>
         <w:tc>
           <w:tcPr>
@@ -5478,9 +5454,7 @@
         <w:tc>
           <w:tcPr>
             <w:tcW w:type="dxa" w:w="1080"/>
-            <w:tcBorders>
-              <w:bottom w:val="nil"/>
-            </w:tcBorders>
+            <w:vMerge w:val="restart"/>
           </w:tcPr>
           <w:p>
             <w:r>
@@ -5491,9 +5465,7 @@
         <w:tc>
           <w:tcPr>
             <w:tcW w:type="dxa" w:w="1080"/>
-            <w:tcBorders>
-              <w:bottom w:val="nil"/>
-            </w:tcBorders>
+            <w:vMerge w:val="restart"/>
           </w:tcPr>
           <w:p>
             <w:r>
@@ -5539,18 +5511,16 @@
         <w:tc>
           <w:tcPr>
             <w:tcW w:type="dxa" w:w="1080"/>
-          </w:tcPr>
-          <w:p>
-            <w:r/>
-          </w:p>
-        </w:tc>
-        <w:tc>
-          <w:tcPr>
-            <w:tcW w:type="dxa" w:w="1080"/>
-          </w:tcPr>
-          <w:p>
-            <w:r/>
-          </w:p>
+            <w:vMerge w:val="continue"/>
+          </w:tcPr>
+          <w:p/>
+        </w:tc>
+        <w:tc>
+          <w:tcPr>
+            <w:tcW w:type="dxa" w:w="1080"/>
+            <w:vMerge w:val="continue"/>
+          </w:tcPr>
+          <w:p/>
         </w:tc>
         <w:tc>
           <w:tcPr>
@@ -6842,9 +6812,7 @@
         <w:tc>
           <w:tcPr>
             <w:tcW w:type="dxa" w:w="1080"/>
-            <w:tcBorders>
-              <w:bottom w:val="nil"/>
-            </w:tcBorders>
+            <w:vMerge w:val="restart"/>
           </w:tcPr>
           <w:p>
             <w:r>
@@ -6855,9 +6823,7 @@
         <w:tc>
           <w:tcPr>
             <w:tcW w:type="dxa" w:w="1080"/>
-            <w:tcBorders>
-              <w:bottom w:val="nil"/>
-            </w:tcBorders>
+            <w:vMerge w:val="restart"/>
           </w:tcPr>
           <w:p>
             <w:r>
@@ -6903,18 +6869,16 @@
         <w:tc>
           <w:tcPr>
             <w:tcW w:type="dxa" w:w="1080"/>
-          </w:tcPr>
-          <w:p>
-            <w:r/>
-          </w:p>
-        </w:tc>
-        <w:tc>
-          <w:tcPr>
-            <w:tcW w:type="dxa" w:w="1080"/>
-          </w:tcPr>
-          <w:p>
-            <w:r/>
-          </w:p>
+            <w:vMerge w:val="continue"/>
+          </w:tcPr>
+          <w:p/>
+        </w:tc>
+        <w:tc>
+          <w:tcPr>
+            <w:tcW w:type="dxa" w:w="1080"/>
+            <w:vMerge w:val="continue"/>
+          </w:tcPr>
+          <w:p/>
         </w:tc>
         <w:tc>
           <w:tcPr>
@@ -8206,9 +8170,7 @@
         <w:tc>
           <w:tcPr>
             <w:tcW w:type="dxa" w:w="1080"/>
-            <w:tcBorders>
-              <w:bottom w:val="nil"/>
-            </w:tcBorders>
+            <w:vMerge w:val="restart"/>
           </w:tcPr>
           <w:p>
             <w:r>
@@ -8219,9 +8181,7 @@
         <w:tc>
           <w:tcPr>
             <w:tcW w:type="dxa" w:w="1080"/>
-            <w:tcBorders>
-              <w:bottom w:val="nil"/>
-            </w:tcBorders>
+            <w:vMerge w:val="restart"/>
           </w:tcPr>
           <w:p>
             <w:r>
@@ -8267,18 +8227,16 @@
         <w:tc>
           <w:tcPr>
             <w:tcW w:type="dxa" w:w="1080"/>
-          </w:tcPr>
-          <w:p>
-            <w:r/>
-          </w:p>
-        </w:tc>
-        <w:tc>
-          <w:tcPr>
-            <w:tcW w:type="dxa" w:w="1080"/>
-          </w:tcPr>
-          <w:p>
-            <w:r/>
-          </w:p>
+            <w:vMerge w:val="continue"/>
+          </w:tcPr>
+          <w:p/>
+        </w:tc>
+        <w:tc>
+          <w:tcPr>
+            <w:tcW w:type="dxa" w:w="1080"/>
+            <w:vMerge w:val="continue"/>
+          </w:tcPr>
+          <w:p/>
         </w:tc>
         <w:tc>
           <w:tcPr>
@@ -9570,9 +9528,7 @@
         <w:tc>
           <w:tcPr>
             <w:tcW w:type="dxa" w:w="1080"/>
-            <w:tcBorders>
-              <w:bottom w:val="nil"/>
-            </w:tcBorders>
+            <w:vMerge w:val="restart"/>
           </w:tcPr>
           <w:p>
             <w:r>
@@ -9583,9 +9539,7 @@
         <w:tc>
           <w:tcPr>
             <w:tcW w:type="dxa" w:w="1080"/>
-            <w:tcBorders>
-              <w:bottom w:val="nil"/>
-            </w:tcBorders>
+            <w:vMerge w:val="restart"/>
           </w:tcPr>
           <w:p>
             <w:r>
@@ -9631,18 +9585,16 @@
         <w:tc>
           <w:tcPr>
             <w:tcW w:type="dxa" w:w="1080"/>
-          </w:tcPr>
-          <w:p>
-            <w:r/>
-          </w:p>
-        </w:tc>
-        <w:tc>
-          <w:tcPr>
-            <w:tcW w:type="dxa" w:w="1080"/>
-          </w:tcPr>
-          <w:p>
-            <w:r/>
-          </w:p>
+            <w:vMerge w:val="continue"/>
+          </w:tcPr>
+          <w:p/>
+        </w:tc>
+        <w:tc>
+          <w:tcPr>
+            <w:tcW w:type="dxa" w:w="1080"/>
+            <w:vMerge w:val="continue"/>
+          </w:tcPr>
+          <w:p/>
         </w:tc>
         <w:tc>
           <w:tcPr>
@@ -10934,9 +10886,7 @@
         <w:tc>
           <w:tcPr>
             <w:tcW w:type="dxa" w:w="1080"/>
-            <w:tcBorders>
-              <w:bottom w:val="nil"/>
-            </w:tcBorders>
+            <w:vMerge w:val="restart"/>
           </w:tcPr>
           <w:p>
             <w:r>
@@ -10947,9 +10897,7 @@
         <w:tc>
           <w:tcPr>
             <w:tcW w:type="dxa" w:w="1080"/>
-            <w:tcBorders>
-              <w:bottom w:val="nil"/>
-            </w:tcBorders>
+            <w:vMerge w:val="restart"/>
           </w:tcPr>
           <w:p>
             <w:r>
@@ -10995,18 +10943,16 @@
         <w:tc>
           <w:tcPr>
             <w:tcW w:type="dxa" w:w="1080"/>
-          </w:tcPr>
-          <w:p>
-            <w:r/>
-          </w:p>
-        </w:tc>
-        <w:tc>
-          <w:tcPr>
-            <w:tcW w:type="dxa" w:w="1080"/>
-          </w:tcPr>
-          <w:p>
-            <w:r/>
-          </w:p>
+            <w:vMerge w:val="continue"/>
+          </w:tcPr>
+          <w:p/>
+        </w:tc>
+        <w:tc>
+          <w:tcPr>
+            <w:tcW w:type="dxa" w:w="1080"/>
+            <w:vMerge w:val="continue"/>
+          </w:tcPr>
+          <w:p/>
         </w:tc>
         <w:tc>
           <w:tcPr>
@@ -12298,9 +12244,7 @@
         <w:tc>
           <w:tcPr>
             <w:tcW w:type="dxa" w:w="1080"/>
-            <w:tcBorders>
-              <w:bottom w:val="nil"/>
-            </w:tcBorders>
+            <w:vMerge w:val="restart"/>
           </w:tcPr>
           <w:p>
             <w:r>
@@ -12311,9 +12255,7 @@
         <w:tc>
           <w:tcPr>
             <w:tcW w:type="dxa" w:w="1080"/>
-            <w:tcBorders>
-              <w:bottom w:val="nil"/>
-            </w:tcBorders>
+            <w:vMerge w:val="restart"/>
           </w:tcPr>
           <w:p>
             <w:r>
@@ -12359,18 +12301,16 @@
         <w:tc>
           <w:tcPr>
             <w:tcW w:type="dxa" w:w="1080"/>
-          </w:tcPr>
-          <w:p>
-            <w:r/>
-          </w:p>
-        </w:tc>
-        <w:tc>
-          <w:tcPr>
-            <w:tcW w:type="dxa" w:w="1080"/>
-          </w:tcPr>
-          <w:p>
-            <w:r/>
-          </w:p>
+            <w:vMerge w:val="continue"/>
+          </w:tcPr>
+          <w:p/>
+        </w:tc>
+        <w:tc>
+          <w:tcPr>
+            <w:tcW w:type="dxa" w:w="1080"/>
+            <w:vMerge w:val="continue"/>
+          </w:tcPr>
+          <w:p/>
         </w:tc>
         <w:tc>
           <w:tcPr>

</xml_diff>

<commit_message>
need to separate the data of different duration well
</commit_message>
<xml_diff>
--- a/src/steps/docx_output/thesis.docx
+++ b/src/steps/docx_output/thesis.docx
@@ -21,11 +21,11 @@
         <w:t>during a sustained Bullish market phase.</w:t>
         <w:br/>
         <w:br/>
-        <w:t xml:space="preserve">Hammer shows significantly better results at forecasting Highs for 2 Days when compared to random selection of stocks. It  shows slightly better results at forecasting Lows for 2 Days, Highs, Lows for 4 Days, Highs and Lows for 8 Days when compared to random selection of stocks. </w:t>
+        <w:t xml:space="preserve">Hammer renders significantly better results at forecasting Highs for 2 Days. Moreover, It  renders slightly better results at forecasting Lows for 2 Days Highs, Lows for 4 Days Highs, Lows for 8 Days. </w:t>
         <w:br/>
-        <w:t xml:space="preserve">It  shows worse results  at forecasting Highs and Lows for 2 Days when compared to random selection of stocks. </w:t>
+        <w:t>Hanging Man shows worse results  at forecasting Highs, Lows for 2 Days when compared to random selection of stocks.</w:t>
         <w:br/>
-        <w:t xml:space="preserve">It  shows slightly better results at forecasting Highs, Lows for 2 Days and Lows (following a trend) for 4 Days when compared to random selection of stocks. </w:t>
+        <w:t xml:space="preserve">Shooting Star renders slightly better results at forecasting Highs, Lows for 2 Days Lows (following a trend) for 4 Days. </w:t>
       </w:r>
     </w:p>
     <w:tbl>
@@ -2524,13 +2524,13 @@
         <w:t>during a sustained Bearish market phase.</w:t>
         <w:br/>
         <w:br/>
-        <w:t xml:space="preserve">Hammer shows significantly better results at forecasting Highs, Lows for 2 Days and Highs for 4 Days when compared to random selection of stocks. It  shows slightly better results at forecasting Lows for 4 Days and Highs for 8 Days when compared to random selection of stocks. It  shows worse results  at forecasting Closes(following a trend) for 8 Days when compared to random selection of stocks. </w:t>
+        <w:t>Hammer renders significantly better results at forecasting Highs, Lows for 2 Days Highs for 4 Days. And, It  renders slightly better results at forecasting Lows for 4 Days Highs for 8 Days. Likewise, It renders worse results  at forecasting Closes(following a trend) for 8 Days when compared to random selection of stocks.</w:t>
         <w:br/>
-        <w:t xml:space="preserve">It  shows worse results  at forecasting Lows for 2 Days and Lows (following a trend) for 8 Days when compared to random selection of stocks. </w:t>
+        <w:t>Inverted Hammer displays worse results  at forecasting Lows for 2 Days Lows (following a trend) for 8 Days when compared to random selection of stocks.</w:t>
         <w:br/>
-        <w:t xml:space="preserve">Hanging Man shows significantly better results at forecasting Closes(following a trend) for 4 Days, Highs(following a trend), Lows (following a trend) and Closes(following a trend) for 8 Days when compared to random selection of stocks. It  shows slightly better results at forecasting Closes(following a trend) for 2 Days when compared to random selection of stocks. It  shows worse results  at forecasting Highs and Lows for 2 Days when compared to random selection of stocks. </w:t>
+        <w:t>Hanging Man displays significantly better results at forecasting Closes(following a trend) for 4 Days Highs(following a trend), Lows (following a trend), Closes(following a trend) for 8 Days. Furthermore, It  displays slightly better results at forecasting Closes(following a trend) for 2 Days. Moreover, It displays worse results  at forecasting Highs, Lows for 2 Days when compared to random selection of stocks.</w:t>
         <w:br/>
-        <w:t xml:space="preserve">Shooting Star shows significantly better results at forecasting Highs(following a trend), Lows for 2 Days, Highs(following a trend), Lows (following a trend), Closes(following a trend) for 4 Days, Highs(following a trend) and Lows (following a trend) for 8 Days when compared to random selection of stocks. It  shows slightly better results at forecasting Highs, Closes(following a trend) for 2 Days and Closes(following a trend) for 8 Days when compared to random selection of stocks. </w:t>
+        <w:t xml:space="preserve">Shooting Star displays significantly better results at forecasting Highs(following a trend), Lows for 2 Days Highs(following a trend), Lows (following a trend), Closes(following a trend) for 4 Days Highs(following a trend), Lows (following a trend) for 8 Days. Moreover, It  yields slightly better results at forecasting Highs, Closes(following a trend) for 2 Days Closes(following a trend) for 8 Days. </w:t>
       </w:r>
     </w:p>
     <w:tbl>
@@ -5029,13 +5029,13 @@
         <w:t>during a sustained Bullish market phase.</w:t>
         <w:br/>
         <w:br/>
-        <w:t xml:space="preserve">Hammer shows significantly better results at forecasting Highs(following a trend), Lows (following a trend) for 2 Days and Highs(following a trend) for 8 Days when compared to random selection of stocks. It  shows slightly better results at forecasting Highs, Lows for 2 Days, Highs, Lows (following a trend) for 4 Days and Lows (following a trend) for 8 Days when compared to random selection of stocks. It  shows worse results  at forecasting Closes for 8 Days when compared to random selection of stocks. </w:t>
+        <w:t>Hammer yields significantly better results at forecasting Highs(following a trend), Lows (following a trend) for 2 Days Highs(following a trend) for 8 Days. Moreover, It  displays slightly better results at forecasting Highs, Lows for 2 Days Highs, Lows (following a trend) for 4 Days Lows (following a trend) for 8 Days. Additionally, It yields worse results  at forecasting Closes for 8 Days when compared to random selection of stocks.</w:t>
         <w:br/>
-        <w:t xml:space="preserve">It  shows slightly better results at forecasting Closes(following a trend) for 2 Days and Closes(following a trend) for 8 Days when compared to random selection of stocks. </w:t>
+        <w:t xml:space="preserve">Inverted Hammer shows slightly better results at forecasting Closes(following a trend) for 2 Days Closes(following a trend) for 8 Days. </w:t>
         <w:br/>
-        <w:t xml:space="preserve">It  shows worse results  at forecasting Lows for 2 Days, Highs(following a trend), Lows (following a trend) for 4 Days, Highs(following a trend), Lows (following a trend) and Closes(following a trend) for 8 Days when compared to random selection of stocks. </w:t>
+        <w:t>Hanging Man displays worse results  at forecasting Lows for 2 Days Highs(following a trend), Lows (following a trend) for 4 Days Highs(following a trend), Lows (following a trend), Closes(following a trend) for 8 Days when compared to random selection of stocks.</w:t>
         <w:br/>
-        <w:t xml:space="preserve">Shooting Star shows significantly better results at forecasting Highs(following a trend) and Lows for 2 Days when compared to random selection of stocks. It  shows slightly better results at forecasting Highs for 2 Days, Lows for 4 Days and Lows for 8 Days when compared to random selection of stocks. It  shows worse results  at forecasting Highs(following a trend), Lows (following a trend) and Closes(following a trend) for 8 Days when compared to random selection of stocks. </w:t>
+        <w:t>Shooting Star shows significantly better results at forecasting Highs(following a trend), Lows for 2 Days. Additionally, It  renders slightly better results at forecasting Highs for 2 Days Lows for 4 Days Lows for 8 Days. Moreover, It renders worse results  at forecasting Highs(following a trend), Lows (following a trend), Closes(following a trend) for 8 Days when compared to random selection of stocks.</w:t>
       </w:r>
     </w:p>
     <w:tbl>
@@ -7534,11 +7534,11 @@
         <w:t>during a sustained Bearish market phase.</w:t>
         <w:br/>
         <w:br/>
-        <w:t xml:space="preserve">It  shows slightly better results at forecasting Highs(following a trend) for 2 Days and Highs for 8 Days when compared to random selection of stocks. </w:t>
+        <w:t xml:space="preserve">Hammer displays slightly better results at forecasting Highs(following a trend) for 2 Days Highs for 8 Days. </w:t>
         <w:br/>
-        <w:t xml:space="preserve">Hanging Man shows significantly better results at forecasting Closes(following a trend) for 2 Days and Closes(following a trend) for 8 Days when compared to random selection of stocks. It  shows slightly better results at forecasting Lows (following a trend) for 2 Days, Closes(following a trend) for 4 Days, Highs(following a trend) and Lows (following a trend) for 8 Days when compared to random selection of stocks. It  shows worse results  at forecasting Highs for 2 Days when compared to random selection of stocks. </w:t>
+        <w:t>Hanging Man yields significantly better results at forecasting Closes(following a trend) for 2 Days Closes(following a trend) for 8 Days. Furthermore, It  renders slightly better results at forecasting Lows (following a trend) for 2 Days Closes(following a trend) for 4 Days Highs(following a trend), Lows (following a trend) for 8 Days. Additionally, It shows worse results  at forecasting Highs for 2 Days when compared to random selection of stocks.</w:t>
         <w:br/>
-        <w:t xml:space="preserve">Shooting Star shows significantly better results at forecasting Highs(following a trend), Lows for 2 Days, Highs(following a trend), Lows (following a trend) for 4 Days, Highs(following a trend), Lows (following a trend) and Closes(following a trend) for 8 Days when compared to random selection of stocks. It  shows slightly better results at forecasting Highs, Closes(following a trend) for 2 Days, Lows and Closes(following a trend) for 4 Days when compared to random selection of stocks. </w:t>
+        <w:t xml:space="preserve">Shooting Star shows significantly better results at forecasting Highs(following a trend), Lows for 2 Days Highs(following a trend), Lows (following a trend) for 4 Days Highs(following a trend), Lows (following a trend), Closes(following a trend) for 8 Days. Furthermore, It  yields slightly better results at forecasting Highs, Closes(following a trend) for 2 Days Lows, Closes(following a trend) for 4 Days. </w:t>
       </w:r>
     </w:p>
     <w:tbl>
@@ -10037,11 +10037,11 @@
         <w:t>during a sustained Bullish market phase.</w:t>
         <w:br/>
         <w:br/>
-        <w:t xml:space="preserve">Hammer shows significantly better results at forecasting Lows for 8 Days when compared to random selection of stocks. It  shows slightly better results at forecasting Highs, Lows for 2 Days, Highs, Lows for 4 Days, Highs and Lows (following a trend) for 8 Days when compared to random selection of stocks. </w:t>
+        <w:t xml:space="preserve">Hammer yields significantly better results at forecasting Lows for 8 Days. Importantly, It  displays slightly better results at forecasting Highs, Lows for 2 Days Highs, Lows for 4 Days Highs, Lows (following a trend) for 8 Days. </w:t>
         <w:br/>
-        <w:t xml:space="preserve">It  shows worse results  at forecasting Highs(following a trend), Lows (following a trend), Closes(following a trend) for 2 Days, Highs(following a trend), Lows (following a trend), Closes(following a trend) for 4 Days, Highs, Lows (following a trend) and Closes(following a trend) for 8 Days when compared to random selection of stocks. </w:t>
+        <w:t>Hanging Man shows worse results  at forecasting Highs(following a trend), Lows (following a trend), Closes(following a trend) for 2 Days Highs(following a trend), Lows (following a trend), Closes(following a trend) for 4 Days Highs, Lows (following a trend), Closes(following a trend) for 8 Days when compared to random selection of stocks.</w:t>
         <w:br/>
-        <w:t xml:space="preserve">Shooting Star shows significantly better results at forecasting Lows for 2 Days when compared to random selection of stocks. It  shows slightly better results at forecasting Highs for 2 Days when compared to random selection of stocks. It  shows worse results  at forecasting Closes(following a trend) for 2 Days, Closes(following a trend) for 4 Days, Highs(following a trend), Lows (following a trend) and Closes(following a trend) for 8 Days when compared to random selection of stocks. </w:t>
+        <w:t>Shooting Star displays significantly better results at forecasting Lows for 2 Days. Likewise, It  yields slightly better results at forecasting Highs for 2 Days. Similarly, It displays worse results  at forecasting Closes(following a trend) for 2 Days Closes(following a trend) for 4 Days Highs(following a trend), Lows (following a trend), Closes(following a trend) for 8 Days when compared to random selection of stocks.</w:t>
       </w:r>
     </w:p>
     <w:tbl>
@@ -12540,11 +12540,11 @@
         <w:t>during a sustained Bearish market phase.</w:t>
         <w:br/>
         <w:br/>
-        <w:t xml:space="preserve">Hammer shows significantly better results at forecasting Highs for 2 Days when compared to random selection of stocks. It  shows slightly better results at forecasting Highs(following a trend), Lows for 2 Days and Highs for 4 Days when compared to random selection of stocks. It  shows worse results  at forecasting Closes(following a trend) for 2 Days when compared to random selection of stocks. </w:t>
+        <w:t>Hammer yields significantly better results at forecasting Highs for 2 Days. And, It  renders slightly better results at forecasting Highs(following a trend), Lows for 2 Days Highs for 4 Days. Importantly, It displays worse results  at forecasting Closes(following a trend) for 2 Days when compared to random selection of stocks.</w:t>
         <w:br/>
-        <w:t xml:space="preserve">Hanging Man shows significantly better results at forecasting Closes(following a trend) for 4 Days when compared to random selection of stocks. It  shows slightly better results at forecasting Lows (following a trend), Closes(following a trend) for 2 Days, Highs(following a trend), Lows (following a trend) for 4 Days, Highs(following a trend), Lows (following a trend) and Closes(following a trend) for 8 Days when compared to random selection of stocks. It  shows worse results  at forecasting Highs for 2 Days when compared to random selection of stocks. </w:t>
+        <w:t>Hanging Man displays significantly better results at forecasting Closes(following a trend) for 4 Days. Importantly, It  displays slightly better results at forecasting Lows (following a trend), Closes(following a trend) for 2 Days Highs(following a trend), Lows (following a trend) for 4 Days Highs(following a trend), Lows (following a trend), Closes(following a trend) for 8 Days. Furthermore, It yields worse results  at forecasting Highs for 2 Days when compared to random selection of stocks.</w:t>
         <w:br/>
-        <w:t xml:space="preserve">Shooting Star shows significantly better results at forecasting Highs(following a trend), Lows (following a trend) for 2 Days, Highs(following a trend), Lows (following a trend) for 4 Days, Highs(following a trend), Lows (following a trend) and Closes(following a trend) for 8 Days when compared to random selection of stocks. It  shows slightly better results at forecasting Highs, Lows, Closes(following a trend) for 2 Days and Lows for 4 Days when compared to random selection of stocks. </w:t>
+        <w:t xml:space="preserve">Shooting Star yields significantly better results at forecasting Highs(following a trend), Lows (following a trend) for 2 Days Highs(following a trend), Lows (following a trend) for 4 Days Highs(following a trend), Lows (following a trend), Closes(following a trend) for 8 Days. Furthermore, It  yields slightly better results at forecasting Highs, Lows, Closes(following a trend) for 2 Days Lows for 4 Days. </w:t>
       </w:r>
     </w:p>
     <w:tbl>
@@ -15043,11 +15043,11 @@
         <w:t>during a sustained Bullish market phase.</w:t>
         <w:br/>
         <w:br/>
-        <w:t xml:space="preserve">Hammer shows significantly better results at forecasting Highs(following a trend) for 4 Days, Highs(following a trend) and Lows (following a trend) for 8 Days when compared to random selection of stocks. It  shows slightly better results at forecasting Highs, Lows for 2 Days, Highs, Lows for 4 Days and Highs for 8 Days when compared to random selection of stocks. </w:t>
+        <w:t xml:space="preserve">Hammer shows significantly better results at forecasting Highs(following a trend) for 4 Days Highs(following a trend), Lows (following a trend) for 8 Days. Likewise, It  displays slightly better results at forecasting Highs, Lows for 2 Days Highs, Lows for 4 Days Highs for 8 Days. </w:t>
         <w:br/>
-        <w:t xml:space="preserve">It  shows worse results  at forecasting Highs(following a trend), Lows (following a trend) and Closes(following a trend) for 8 Days when compared to random selection of stocks. </w:t>
+        <w:t>Hanging Man renders worse results  at forecasting Highs(following a trend), Lows (following a trend), Closes(following a trend) for 8 Days when compared to random selection of stocks.</w:t>
         <w:br/>
-        <w:t xml:space="preserve">It  shows slightly better results at forecasting Highs(following a trend) and Lows for 2 Days when compared to random selection of stocks. It  shows worse results  at forecasting Closes(following a trend) for 8 Days when compared to random selection of stocks. </w:t>
+        <w:t>Shooting Star displays slightly better results at forecasting Highs(following a trend), Lows for 2 Days. Moreover, It displays worse results  at forecasting Closes(following a trend) for 8 Days when compared to random selection of stocks.</w:t>
       </w:r>
     </w:p>
     <w:tbl>
@@ -17546,13 +17546,13 @@
         <w:t>during a sustained Bearish market phase.</w:t>
         <w:br/>
         <w:br/>
-        <w:t xml:space="preserve">Hammer shows significantly better results at forecasting Highs and Lows for 2 Days when compared to random selection of stocks. It  shows slightly better results at forecasting Highs and Lows for 4 Days when compared to random selection of stocks. It  shows worse results  at forecasting Closes(following a trend) for 4 Days and Closes(following a trend) for 8 Days when compared to random selection of stocks. </w:t>
+        <w:t>Hammer yields significantly better results at forecasting Highs, Lows for 2 Days. Importantly, It  yields slightly better results at forecasting Highs, Lows for 4 Days. Moreover, It yields worse results  at forecasting Closes(following a trend) for 4 Days Closes(following a trend) for 8 Days when compared to random selection of stocks.</w:t>
         <w:br/>
-        <w:t xml:space="preserve">It  shows worse results  at forecasting Lows (following a trend) for 2 Days, Highs(following a trend), Lows for 4 Days, Highs(following a trend) and Lows (following a trend) for 8 Days when compared to random selection of stocks. </w:t>
+        <w:t>Inverted Hammer yields worse results  at forecasting Lows (following a trend) for 2 Days Highs(following a trend), Lows for 4 Days Highs(following a trend), Lows (following a trend) for 8 Days when compared to random selection of stocks.</w:t>
         <w:br/>
-        <w:t xml:space="preserve">It  shows slightly better results at forecasting Closes(following a trend) for 2 Days, Closes(following a trend) for 4 Days and Closes(following a trend) for 8 Days when compared to random selection of stocks. It  shows worse results  at forecasting Highs for 2 Days when compared to random selection of stocks. </w:t>
+        <w:t>Hanging Man shows slightly better results at forecasting Closes(following a trend) for 2 Days Closes(following a trend) for 4 Days Closes(following a trend) for 8 Days. Likewise, It shows worse results  at forecasting Highs for 2 Days when compared to random selection of stocks.</w:t>
         <w:br/>
-        <w:t xml:space="preserve">Shooting Star shows significantly better results at forecasting Highs(following a trend), Lows (following a trend) for 2 Days, Highs(following a trend), Lows (following a trend) for 4 Days, Highs(following a trend), Lows (following a trend) and Closes(following a trend) for 8 Days when compared to random selection of stocks. It  shows slightly better results at forecasting Lows and Closes(following a trend) for 2 Days when compared to random selection of stocks. </w:t>
+        <w:t xml:space="preserve">Shooting Star shows significantly better results at forecasting Highs(following a trend), Lows (following a trend) for 2 Days Highs(following a trend), Lows (following a trend) for 4 Days Highs(following a trend), Lows (following a trend), Closes(following a trend) for 8 Days. Moreover, It  renders slightly better results at forecasting Lows, Closes(following a trend) for 2 Days. </w:t>
       </w:r>
     </w:p>
     <w:tbl>
@@ -20051,13 +20051,13 @@
         <w:t>during a sustained Bullish market phase.</w:t>
         <w:br/>
         <w:br/>
-        <w:t xml:space="preserve">Hammer shows significantly better results at forecasting Highs(following a trend) for 2 Days when compared to random selection of stocks. It  shows slightly better results at forecasting Highs, Lows for 2 Days, Highs(following a trend), Lows (following a trend) for 4 Days and Lows (following a trend) for 8 Days when compared to random selection of stocks. It  shows worse results  at forecasting Closes for 4 Days and Closes(following a trend) for 8 Days when compared to random selection of stocks. </w:t>
+        <w:t>Hammer displays significantly better results at forecasting Highs(following a trend) for 2 Days. Likewise, It  yields slightly better results at forecasting Highs, Lows for 2 Days Highs(following a trend), Lows (following a trend) for 4 Days Lows (following a trend) for 8 Days. Furthermore, It displays worse results  at forecasting Closes for 4 Days Closes(following a trend) for 8 Days when compared to random selection of stocks.</w:t>
         <w:br/>
-        <w:t xml:space="preserve">It  shows slightly better results at forecasting Closes(following a trend) for 2 Days and Closes(following a trend) for 4 Days when compared to random selection of stocks. It  shows worse results  at forecasting Lows for 2 Days when compared to random selection of stocks. </w:t>
+        <w:t>Inverted Hammer yields slightly better results at forecasting Closes(following a trend) for 2 Days Closes(following a trend) for 4 Days. Additionally, It displays worse results  at forecasting Lows for 2 Days when compared to random selection of stocks.</w:t>
         <w:br/>
-        <w:t xml:space="preserve">It  shows worse results  at forecasting Highs for 2 Days, Highs, Lows (following a trend) for 4 Days, Highs(following a trend), Lows (following a trend) and Closes(following a trend) for 8 Days when compared to random selection of stocks. </w:t>
+        <w:t>Hanging Man shows worse results  at forecasting Highs for 2 Days Highs, Lows (following a trend) for 4 Days Highs(following a trend), Lows (following a trend), Closes(following a trend) for 8 Days when compared to random selection of stocks.</w:t>
         <w:br/>
-        <w:t xml:space="preserve">Shooting Star shows significantly better results at forecasting Lows (following a trend) for 2 Days when compared to random selection of stocks. It  shows slightly better results at forecasting Highs, Lows for 2 Days and Lows for 4 Days when compared to random selection of stocks. It  shows worse results  at forecasting Closes(following a trend) for 4 Days, Highs(following a trend), Lows (following a trend) and Closes for 8 Days when compared to random selection of stocks. </w:t>
+        <w:t>Shooting Star displays significantly better results at forecasting Lows (following a trend) for 2 Days. Importantly, It  renders slightly better results at forecasting Highs, Lows for 2 Days Lows for 4 Days. Furthermore, It yields worse results  at forecasting Closes(following a trend) for 4 Days Highs(following a trend), Lows (following a trend), Closes for 8 Days when compared to random selection of stocks.</w:t>
       </w:r>
     </w:p>
     <w:tbl>
@@ -22556,11 +22556,11 @@
         <w:t>during a sustained Bearish market phase.</w:t>
         <w:br/>
         <w:br/>
-        <w:t xml:space="preserve">Hammer shows significantly better results at forecasting Lows (following a trend) for 2 Days when compared to random selection of stocks. It  shows slightly better results at forecasting Highs(following a trend), Lows for 2 Days, Highs(following a trend), Lows for 4 Days and Lows for 8 Days when compared to random selection of stocks. </w:t>
+        <w:t xml:space="preserve">Hammer displays significantly better results at forecasting Lows (following a trend) for 2 Days. Similarly, It  shows slightly better results at forecasting Highs(following a trend), Lows for 2 Days Highs(following a trend), Lows for 4 Days Lows for 8 Days. </w:t>
         <w:br/>
-        <w:t xml:space="preserve">Hanging Man shows significantly better results at forecasting Closes(following a trend) for 2 Days, Closes(following a trend) for 4 Days and Closes(following a trend) for 8 Days when compared to random selection of stocks. It  shows slightly better results at forecasting Highs(following a trend) for 2 Days, Highs(following a trend) for 4 Days, Highs(following a trend) and Lows (following a trend) for 8 Days when compared to random selection of stocks. </w:t>
+        <w:t xml:space="preserve">Hanging Man displays significantly better results at forecasting Closes(following a trend) for 2 Days Closes(following a trend) for 4 Days Closes(following a trend) for 8 Days. And, It  shows slightly better results at forecasting Highs(following a trend) for 2 Days Highs(following a trend) for 4 Days Highs(following a trend), Lows (following a trend) for 8 Days. </w:t>
         <w:br/>
-        <w:t xml:space="preserve">Shooting Star shows significantly better results at forecasting Highs(following a trend), Lows for 2 Days, Highs(following a trend), Lows (following a trend) for 4 Days, Highs(following a trend), Lows (following a trend) and Closes(following a trend) for 8 Days when compared to random selection of stocks. It  shows slightly better results at forecasting Highs for 2 Days, Lows, Closes(following a trend) for 4 Days and Lows for 8 Days when compared to random selection of stocks. </w:t>
+        <w:t xml:space="preserve">Shooting Star displays significantly better results at forecasting Highs(following a trend), Lows for 2 Days Highs(following a trend), Lows (following a trend) for 4 Days Highs(following a trend), Lows (following a trend), Closes(following a trend) for 8 Days. And, It  yields slightly better results at forecasting Highs for 2 Days Lows, Closes(following a trend) for 4 Days Lows for 8 Days. </w:t>
       </w:r>
     </w:p>
     <w:tbl>

</xml_diff>

<commit_message>
shows boxplot but need to stylize
</commit_message>
<xml_diff>
--- a/src/steps/docx_output/thesis.docx
+++ b/src/steps/docx_output/thesis.docx
@@ -21,13 +21,13 @@
         <w:t>during a sustained Bullish market phase.</w:t>
         <w:br/>
         <w:br/>
-        <w:t xml:space="preserve">Hammer renders significantly better results at forecasting Highs for 2 Days and, Highs for 4 Days. And, It  displays slightly better results at forecasting Lows for 2 Days. Likewise  it displays slightly better at  Highs(following a trend) Lows for 4 Days and Highs Lows for 8 Days. </w:t>
+        <w:t xml:space="preserve">Hammer displays significantly better results at forecasting Highs for 2 Days and, Highs for 4 Days. Moreover, It  renders slightly better results at forecasting Lows for 2 Days. Similarly  it yields slightly better at  Highs(following a trend) Lows for 4 Days and Highs Lows for 8 Days. </w:t>
         <w:br/>
         <w:t xml:space="preserve">Inverted Hammer yields slightly better results at forecasting Closes(following a trend) for 8 Days. </w:t>
         <w:br/>
-        <w:t>Hanging Man shows worse results  at forecasting Highs, Lows for 2 Days And, , Highs, Lows (following a trend) for 4 Days and, Highs(following a trend), Lows (following a trend) for 8 Days when compared to random selection of stocks.</w:t>
+        <w:t>Hanging Man shows worse results  at forecasting Highs, Lows for 2 Days Additionally, , Highs, Lows (following a trend) for 4 Days and, Highs(following a trend), Lows (following a trend) for 8 Days when compared to random selection of stocks.</w:t>
         <w:br/>
-        <w:t xml:space="preserve">Shooting Star yields slightly better results at forecasting Highs Lows for 2 Days. </w:t>
+        <w:t xml:space="preserve">Shooting Star shows slightly better results at forecasting Highs Lows for 2 Days. </w:t>
       </w:r>
     </w:p>
     <w:tbl>
@@ -2526,13 +2526,13 @@
         <w:t>during a sustained Bearish market phase.</w:t>
         <w:br/>
         <w:br/>
-        <w:t xml:space="preserve">Hammer renders significantly better results at forecasting Highs, Lows for 2 Days and, Highs, Lows for 4 Days. Similarly, It  renders slightly better results at forecasting Highs Lows for 8 Days. </w:t>
+        <w:t xml:space="preserve">Hammer displays significantly better results at forecasting Highs, Lows for 2 Days and, Highs, Lows for 4 Days. Furthermore, It  renders slightly better results at forecasting Highs Lows for 8 Days. </w:t>
         <w:br/>
-        <w:t>Inverted Hammer shows worse results  at forecasting Lows (following a trend) for 8 Days when compared to random selection of stocks.</w:t>
+        <w:t>Inverted Hammer yields worse results  at forecasting Lows (following a trend) for 8 Days when compared to random selection of stocks.</w:t>
         <w:br/>
-        <w:t>Hanging Man yields significantly better results at forecasting Closes(following a trend) for 8 Days. Likewise, It  yields slightly better results at forecasting Closes(following a trend) for 4 Days and Highs(following a trend) Lows (following a trend) for 8 Days. Similarly, It yields worse results  at forecasting Highs, Lows for 2 Days and, Lows for 4 Days when compared to random selection of stocks.</w:t>
+        <w:t>Hanging Man shows significantly better results at forecasting Closes(following a trend) for 8 Days. Likewise, It  shows slightly better results at forecasting Closes(following a trend) for 4 Days and Highs(following a trend) Lows (following a trend) for 8 Days. Furthermore, It yields worse results  at forecasting Highs, Lows for 2 Days and, Lows for 4 Days when compared to random selection of stocks.</w:t>
         <w:br/>
-        <w:t xml:space="preserve">Shooting Star displays significantly better results at forecasting Highs(following a trend), Lows (following a trend) for 2 Days. Likewise , Highs(following a trend), Lows (following a trend) for 4 Days and, Highs(following a trend), Lows (following a trend) for 8 Days. Similarly, It  renders slightly better results at forecasting Highs Lows for 2 Days. Moreover  it shows slightly better at  Closes(following a trend) for 4 Days and Closes(following a trend) for 8 Days. </w:t>
+        <w:t xml:space="preserve">Shooting Star displays significantly better results at forecasting Highs(following a trend), Lows (following a trend) for 2 Days. Furthermore , Highs(following a trend), Lows (following a trend) for 4 Days and, Highs(following a trend), Lows (following a trend) for 8 Days. Additionally, It  displays slightly better results at forecasting Highs Lows for 2 Days. Moreover  it renders slightly better at  Closes(following a trend) for 4 Days and Closes(following a trend) for 8 Days. </w:t>
       </w:r>
     </w:p>
     <w:tbl>
@@ -5031,13 +5031,13 @@
         <w:t>during a sustained Bullish market phase.</w:t>
         <w:br/>
         <w:br/>
-        <w:t xml:space="preserve">Hammer shows significantly better results at forecasting Highs(following a trend) for 2 Days and, Highs(following a trend), Lows (following a trend) for 8 Days. Likewise, It  yields slightly better results at forecasting Highs Lows for 2 Days and Highs Lows (following a trend) for 4 Days. </w:t>
+        <w:t xml:space="preserve">Hammer shows significantly better results at forecasting Highs(following a trend) for 2 Days and, Highs(following a trend), Lows (following a trend) for 8 Days. Moreover, It  renders slightly better results at forecasting Highs Lows for 2 Days and Highs Lows (following a trend) for 4 Days. </w:t>
         <w:br/>
-        <w:t xml:space="preserve">Inverted Hammer displays slightly better results at forecasting Closes(following a trend) for 4 Days and Closes(following a trend) for 8 Days. </w:t>
+        <w:t xml:space="preserve">Inverted Hammer yields slightly better results at forecasting Closes(following a trend) for 4 Days and Closes(following a trend) for 8 Days. </w:t>
         <w:br/>
-        <w:t>Hanging Man yields slightly better results at forecasting Closes(following a trend) for 2 Days. And, It yields worse results  at forecasting Highs(following a trend) for 4 Days and, Highs(following a trend), Lows (following a trend), Closes(following a trend) for 8 Days when compared to random selection of stocks.</w:t>
+        <w:t>Hanging Man displays slightly better results at forecasting Closes(following a trend) for 2 Days. Additionally, It displays worse results  at forecasting Highs(following a trend) for 4 Days and, Highs(following a trend), Lows (following a trend), Closes(following a trend) for 8 Days when compared to random selection of stocks.</w:t>
         <w:br/>
-        <w:t>Shooting Star shows significantly better results at forecasting Highs(following a trend), Lows for 2 Days. And, It  yields slightly better results at forecasting Highs for 2 Days. Moreover  it shows slightly better at  Lows for 4 Days and Lows for 8 Days. Likewise, It shows worse results  at forecasting Highs(following a trend), Closes(following a trend) for 8 Days when compared to random selection of stocks.</w:t>
+        <w:t>Shooting Star shows significantly better results at forecasting Highs(following a trend), Lows for 2 Days. Moreover, It  yields slightly better results at forecasting Highs for 2 Days. Likewise  it yields slightly better at  Lows for 4 Days and Lows for 8 Days. Similarly, It displays worse results  at forecasting Highs(following a trend), Closes(following a trend) for 8 Days when compared to random selection of stocks.</w:t>
       </w:r>
     </w:p>
     <w:tbl>
@@ -7536,11 +7536,11 @@
         <w:t>during a sustained Bearish market phase.</w:t>
         <w:br/>
         <w:br/>
-        <w:t xml:space="preserve">Hammer shows significantly better results at forecasting Highs(following a trend) for 2 Days. Likewise, It  yields slightly better results at forecasting Highs Lows (following a trend) for 2 Days. Similarly  it yields slightly better at  Highs for 4 Days and Highs for 8 Days. </w:t>
+        <w:t xml:space="preserve">Hammer displays significantly better results at forecasting Highs(following a trend) for 2 Days. Furthermore, It  displays slightly better results at forecasting Highs Lows (following a trend) for 2 Days. Likewise  it renders slightly better at  Highs for 4 Days and Highs for 8 Days. </w:t>
         <w:br/>
-        <w:t>Hanging Man yields significantly better results at forecasting Closes(following a trend) for 2 Days. Additionally, It  shows slightly better results at forecasting Closes(following a trend) for 4 Days and Lows (following a trend) Closes(following a trend) for 8 Days. Furthermore, It shows worse results  at forecasting Highs for 2 Days and, Highs for 4 Days when compared to random selection of stocks.</w:t>
+        <w:t>Hanging Man renders significantly better results at forecasting Closes(following a trend) for 2 Days. Furthermore, It  displays slightly better results at forecasting Closes(following a trend) for 4 Days and Lows (following a trend) Closes(following a trend) for 8 Days. And, It renders worse results  at forecasting Highs for 2 Days and, Highs for 4 Days when compared to random selection of stocks.</w:t>
         <w:br/>
-        <w:t xml:space="preserve">Shooting Star renders significantly better results at forecasting Highs(following a trend), Lows (following a trend) for 2 Days. And , Highs(following a trend), Lows (following a trend), Closes(following a trend) for 4 Days and, Highs(following a trend), Lows (following a trend), Closes(following a trend) for 8 Days. Likewise, It  yields slightly better results at forecasting Lows Closes(following a trend) for 2 Days and Lows for 4 Days. </w:t>
+        <w:t xml:space="preserve">Shooting Star yields significantly better results at forecasting Highs(following a trend), Lows (following a trend) for 2 Days. Likewise , Highs(following a trend), Lows (following a trend), Closes(following a trend) for 4 Days and, Highs(following a trend), Lows (following a trend), Closes(following a trend) for 8 Days. Additionally, It  displays slightly better results at forecasting Lows Closes(following a trend) for 2 Days and Lows for 4 Days. </w:t>
       </w:r>
     </w:p>
     <w:tbl>
@@ -10039,11 +10039,11 @@
         <w:t>during a sustained Bullish market phase.</w:t>
         <w:br/>
         <w:br/>
-        <w:t xml:space="preserve">Hammer yields significantly better results at forecasting Highs for 2 Days. Additionally, It  yields slightly better results at forecasting Lows for 2 Days. Additionally  it shows slightly better at  Highs Lows for 4 Days and Highs Lows for 8 Days. </w:t>
+        <w:t xml:space="preserve">Hammer shows significantly better results at forecasting Highs for 2 Days. Additionally, It  displays slightly better results at forecasting Lows for 2 Days. And  it shows slightly better at  Highs Lows for 4 Days and Highs Lows for 8 Days. </w:t>
         <w:br/>
-        <w:t>Hanging Man displays worse results  at forecasting Highs(following a trend), Lows (following a trend) for 2 Days Furthermore, , Highs(following a trend), Lows (following a trend), Closes(following a trend) for 4 Days and, Highs(following a trend), Lows (following a trend), Closes(following a trend) for 8 Days when compared to random selection of stocks.</w:t>
+        <w:t>Hanging Man shows worse results  at forecasting Highs(following a trend), Lows (following a trend) for 2 Days Additionally, , Highs(following a trend), Lows (following a trend), Closes(following a trend) for 4 Days and, Highs(following a trend), Lows (following a trend), Closes(following a trend) for 8 Days when compared to random selection of stocks.</w:t>
         <w:br/>
-        <w:t>Shooting Star shows significantly better results at forecasting Lows for 2 Days. Likewise, It  shows slightly better results at forecasting Lows (following a trend) for 2 Days. Additionally, It renders worse results  at forecasting Closes(following a trend) for 4 Days and, Highs(following a trend), Lows (following a trend), Closes(following a trend) for 8 Days when compared to random selection of stocks.</w:t>
+        <w:t>Shooting Star shows significantly better results at forecasting Lows for 2 Days. Moreover, It  displays slightly better results at forecasting Lows (following a trend) for 2 Days. And, It displays worse results  at forecasting Closes(following a trend) for 4 Days and, Highs(following a trend), Lows (following a trend), Closes(following a trend) for 8 Days when compared to random selection of stocks.</w:t>
       </w:r>
     </w:p>
     <w:tbl>
@@ -12542,11 +12542,11 @@
         <w:t>during a sustained Bearish market phase.</w:t>
         <w:br/>
         <w:br/>
-        <w:t>Hammer displays significantly better results at forecasting Highs(following a trend) for 2 Days. Furthermore, It  yields slightly better results at forecasting Highs Lows for 2 Days and Highs for 4 Days. Likewise, It yields worse results  at forecasting Closes(following a trend) for 2 Days when compared to random selection of stocks.</w:t>
+        <w:t>Hammer shows significantly better results at forecasting Highs(following a trend) for 2 Days. Likewise, It  yields slightly better results at forecasting Highs Lows for 2 Days and Highs for 4 Days. Additionally, It renders worse results  at forecasting Closes(following a trend) for 2 Days when compared to random selection of stocks.</w:t>
         <w:br/>
-        <w:t xml:space="preserve">Hanging Man yields significantly better results at forecasting Closes(following a trend) for 4 Days and, Closes(following a trend) for 8 Days. Furthermore, It  renders slightly better results at forecasting Closes(following a trend) for 2 Days. Additionally  it yields slightly better at  Highs(following a trend) for 4 Days and Highs(following a trend) Lows (following a trend) for 8 Days. </w:t>
+        <w:t xml:space="preserve">Hanging Man yields significantly better results at forecasting Closes(following a trend) for 4 Days and, Closes(following a trend) for 8 Days. Additionally, It  displays slightly better results at forecasting Closes(following a trend) for 2 Days. Furthermore  it yields slightly better at  Highs(following a trend) for 4 Days and Highs(following a trend) Lows (following a trend) for 8 Days. </w:t>
         <w:br/>
-        <w:t xml:space="preserve">Shooting Star displays significantly better results at forecasting Highs(following a trend), Lows for 2 Days. Moreover , Highs(following a trend), Lows (following a trend) for 4 Days and, Highs(following a trend), Lows (following a trend), Closes(following a trend) for 8 Days. And, It  shows slightly better results at forecasting Highs for 2 Days and Lows for 4 Days. </w:t>
+        <w:t xml:space="preserve">Shooting Star renders significantly better results at forecasting Highs(following a trend), Lows for 2 Days. And , Highs(following a trend), Lows (following a trend) for 4 Days and, Highs(following a trend), Lows (following a trend), Closes(following a trend) for 8 Days. Likewise, It  renders slightly better results at forecasting Highs for 2 Days and Lows for 4 Days. </w:t>
       </w:r>
     </w:p>
     <w:tbl>
@@ -15045,11 +15045,11 @@
         <w:t>during a sustained Bullish market phase.</w:t>
         <w:br/>
         <w:br/>
-        <w:t xml:space="preserve">Hammer shows significantly better results at forecasting Highs, Lows for 2 Days. Additionally , Highs(following a trend), Lows (following a trend) for 4 Days and, Highs(following a trend), Lows (following a trend) for 8 Days. Furthermore, It  shows slightly better results at forecasting Lows (following a trend) for 2 Days. Additionally  it shows slightly better at  Highs Lows for 4 Days and Highs for 8 Days. </w:t>
+        <w:t xml:space="preserve">Hammer yields significantly better results at forecasting Highs, Lows for 2 Days. And , Highs(following a trend), Lows (following a trend) for 4 Days and, Highs(following a trend), Lows (following a trend) for 8 Days. Moreover, It  renders slightly better results at forecasting Lows (following a trend) for 2 Days. Additionally  it renders slightly better at  Highs Lows for 4 Days and Highs for 8 Days. </w:t>
         <w:br/>
-        <w:t>Hanging Man renders worse results  at forecasting Highs, Lows (following a trend) for 2 Days Similarly, , Highs(following a trend) for 4 Days and, Highs(following a trend), Lows (following a trend), Closes(following a trend) for 8 Days when compared to random selection of stocks.</w:t>
+        <w:t>Hanging Man shows worse results  at forecasting Highs, Lows (following a trend) for 2 Days And, , Highs(following a trend) for 4 Days and, Highs(following a trend), Lows (following a trend), Closes(following a trend) for 8 Days when compared to random selection of stocks.</w:t>
         <w:br/>
-        <w:t>Shooting Star displays slightly better results at forecasting Lows for 2 Days. Likewise, It displays worse results  at forecasting Highs(following a trend), Closes(following a trend) for 8 Days when compared to random selection of stocks.</w:t>
+        <w:t>Shooting Star displays slightly better results at forecasting Lows for 2 Days. Similarly, It displays worse results  at forecasting Highs(following a trend), Closes(following a trend) for 8 Days when compared to random selection of stocks.</w:t>
       </w:r>
     </w:p>
     <w:tbl>
@@ -17548,13 +17548,13 @@
         <w:t>during a sustained Bearish market phase.</w:t>
         <w:br/>
         <w:br/>
-        <w:t>Hammer shows significantly better results at forecasting Highs, Lows for 2 Days. Additionally, It  renders slightly better results at forecasting Highs for 4 Days. Similarly, It shows worse results  at forecasting Closes(following a trend) for 4 Days and, Closes(following a trend) for 8 Days when compared to random selection of stocks.</w:t>
+        <w:t>Hammer displays significantly better results at forecasting Highs, Lows for 2 Days. Similarly, It  renders slightly better results at forecasting Highs for 4 Days. And, It displays worse results  at forecasting Closes(following a trend) for 4 Days and, Closes(following a trend) for 8 Days when compared to random selection of stocks.</w:t>
         <w:br/>
-        <w:t>Inverted Hammer renders worse results  at forecasting Lows (following a trend) for 2 Days And, , Highs(following a trend), Lows for 4 Days and, Highs(following a trend), Lows for 8 Days when compared to random selection of stocks.</w:t>
+        <w:t>Inverted Hammer yields worse results  at forecasting Lows (following a trend) for 2 Days Moreover, , Highs(following a trend), Lows for 4 Days and, Highs(following a trend), Lows for 8 Days when compared to random selection of stocks.</w:t>
         <w:br/>
-        <w:t>Hanging Man displays slightly better results at forecasting Closes(following a trend) for 2 Days. Moreover  it displays slightly better at  Closes(following a trend) for 4 Days and Closes(following a trend) for 8 Days. Additionally, It renders worse results  at forecasting Highs for 2 Days when compared to random selection of stocks.</w:t>
+        <w:t>Hanging Man renders slightly better results at forecasting Closes(following a trend) for 2 Days. Similarly  it renders slightly better at  Closes(following a trend) for 4 Days and Closes(following a trend) for 8 Days. Likewise, It shows worse results  at forecasting Highs for 2 Days when compared to random selection of stocks.</w:t>
         <w:br/>
-        <w:t xml:space="preserve">Shooting Star displays significantly better results at forecasting Highs(following a trend), Lows (following a trend) for 2 Days. Moreover , Highs(following a trend), Lows (following a trend) for 4 Days and, Highs(following a trend), Lows (following a trend), Closes(following a trend) for 8 Days. Additionally, It  shows slightly better results at forecasting Highs Lows Closes(following a trend) for 2 Days. Additionally  it shows slightly better at  Closes(following a trend) for 4 Days and Lows for 8 Days. </w:t>
+        <w:t xml:space="preserve">Shooting Star renders significantly better results at forecasting Highs(following a trend), Lows (following a trend) for 2 Days. Moreover , Highs(following a trend), Lows (following a trend) for 4 Days and, Highs(following a trend), Lows (following a trend), Closes(following a trend) for 8 Days. Moreover, It  renders slightly better results at forecasting Highs Lows Closes(following a trend) for 2 Days. Similarly  it yields slightly better at  Closes(following a trend) for 4 Days and Lows for 8 Days. </w:t>
       </w:r>
     </w:p>
     <w:tbl>
@@ -20053,13 +20053,13 @@
         <w:t>during a sustained Bullish market phase.</w:t>
         <w:br/>
         <w:br/>
-        <w:t>Hammer shows significantly better results at forecasting Highs(following a trend) for 2 Days. And, It  renders slightly better results at forecasting Highs Lows for 2 Days and Highs(following a trend) Lows for 4 Days. Likewise, It yields worse results  at forecasting Closes(following a trend) for 4 Days and, Closes(following a trend) for 8 Days when compared to random selection of stocks.</w:t>
+        <w:t>Hammer yields significantly better results at forecasting Highs(following a trend) for 2 Days. Additionally, It  yields slightly better results at forecasting Highs Lows for 2 Days and Highs(following a trend) Lows for 4 Days. Additionally, It renders worse results  at forecasting Closes(following a trend) for 4 Days and, Closes(following a trend) for 8 Days when compared to random selection of stocks.</w:t>
         <w:br/>
-        <w:t>Inverted Hammer displays slightly better results at forecasting Closes(following a trend) for 2 Days. Additionally, It shows worse results  at forecasting Lows for 2 Days when compared to random selection of stocks.</w:t>
+        <w:t>Inverted Hammer renders slightly better results at forecasting Closes(following a trend) for 2 Days. Likewise, It renders worse results  at forecasting Lows for 2 Days when compared to random selection of stocks.</w:t>
         <w:br/>
-        <w:t>Hanging Man renders worse results  at forecasting Highs, Lows (following a trend) for 2 Days Similarly, , Highs, Lows (following a trend) for 4 Days and, Highs(following a trend), Lows (following a trend), Closes(following a trend) for 8 Days when compared to random selection of stocks.</w:t>
+        <w:t>Hanging Man shows worse results  at forecasting Highs, Lows (following a trend) for 2 Days Likewise, , Highs, Lows (following a trend) for 4 Days and, Highs(following a trend), Lows (following a trend), Closes(following a trend) for 8 Days when compared to random selection of stocks.</w:t>
         <w:br/>
-        <w:t>Shooting Star displays significantly better results at forecasting Lows (following a trend) for 2 Days. Furthermore, It  yields slightly better results at forecasting Lows for 2 Days and Lows for 4 Days. Similarly, It displays worse results  at forecasting Closes(following a trend) for 2 Days And, , Closes(following a trend) for 4 Days and, Highs(following a trend), Lows (following a trend), Closes for 8 Days when compared to random selection of stocks.</w:t>
+        <w:t>Shooting Star yields significantly better results at forecasting Lows (following a trend) for 2 Days. Additionally, It  shows slightly better results at forecasting Lows for 2 Days and Lows for 4 Days. Likewise, It shows worse results  at forecasting Closes(following a trend) for 2 Days Similarly, , Closes(following a trend) for 4 Days and, Highs(following a trend), Lows (following a trend), Closes for 8 Days when compared to random selection of stocks.</w:t>
       </w:r>
     </w:p>
     <w:tbl>
@@ -22558,11 +22558,11 @@
         <w:t>during a sustained Bearish market phase.</w:t>
         <w:br/>
         <w:br/>
-        <w:t xml:space="preserve">Hammer yields significantly better results at forecasting Lows for 2 Days and, Highs(following a trend), Lows (following a trend) for 4 Days. Furthermore, It  shows slightly better results at forecasting Highs for 2 Days. Additionally  it renders slightly better at  Highs Lows for 4 Days and Lows for 8 Days. </w:t>
+        <w:t xml:space="preserve">Hammer displays significantly better results at forecasting Lows for 2 Days and, Highs(following a trend), Lows (following a trend) for 4 Days. Furthermore, It  yields slightly better results at forecasting Highs for 2 Days. Additionally  it shows slightly better at  Highs Lows for 4 Days and Lows for 8 Days. </w:t>
         <w:br/>
-        <w:t>Hanging Man shows significantly better results at forecasting Closes(following a trend) for 8 Days. Likewise, It  renders slightly better results at forecasting Closes(following a trend) for 2 Days. Additionally  it renders slightly better at  Closes(following a trend) for 4 Days and Highs(following a trend) Lows (following a trend) for 8 Days. Moreover, It yields worse results  at forecasting Lows for 2 Days when compared to random selection of stocks.</w:t>
+        <w:t>Hanging Man displays significantly better results at forecasting Closes(following a trend) for 8 Days. Furthermore, It  shows slightly better results at forecasting Closes(following a trend) for 2 Days. And  it shows slightly better at  Closes(following a trend) for 4 Days and Highs(following a trend) Lows (following a trend) for 8 Days. And, It displays worse results  at forecasting Lows for 2 Days when compared to random selection of stocks.</w:t>
         <w:br/>
-        <w:t xml:space="preserve">Shooting Star renders significantly better results at forecasting Lows (following a trend) for 2 Days. Similarly , Lows (following a trend) for 4 Days and, Highs(following a trend), Lows (following a trend), Closes(following a trend) for 8 Days. Additionally, It  displays slightly better results at forecasting Highs Lows for 2 Days and Highs(following a trend) Lows Closes(following a trend) for 4 Days. </w:t>
+        <w:t xml:space="preserve">Shooting Star displays significantly better results at forecasting Lows (following a trend) for 2 Days. Similarly , Lows (following a trend) for 4 Days and, Highs(following a trend), Lows (following a trend), Closes(following a trend) for 8 Days. And, It  yields slightly better results at forecasting Highs Lows for 2 Days and Highs(following a trend) Lows Closes(following a trend) for 4 Days. </w:t>
       </w:r>
     </w:p>
     <w:tbl>
@@ -25061,13 +25061,13 @@
         <w:t>during a sustained Bullish market phase.</w:t>
         <w:br/>
         <w:br/>
-        <w:t>Hammer shows significantly better results at forecasting Highs, Lows for 2 Days. And , Highs, Lows for 4 Days and, Highs, Lows for 8 Days. Moreover, It renders worse results  at forecasting Closes for 2 Days and, Closes(following a trend) for 8 Days when compared to random selection of stocks.</w:t>
+        <w:t>Hammer renders significantly better results at forecasting Highs, Lows for 2 Days. Likewise , Highs, Lows for 4 Days and, Highs, Lows for 8 Days. Furthermore, It shows worse results  at forecasting Closes for 2 Days and, Closes(following a trend) for 8 Days when compared to random selection of stocks.</w:t>
         <w:br/>
-        <w:t>Inverted Hammer renders significantly better results at forecasting Closes(following a trend) for 8 Days. Similarly, It  displays slightly better results at forecasting Closes for 4 Days. Likewise, It renders worse results  at forecasting Closes(following a trend) for 2 Days Likewise, , Highs, Lows for 4 Days and, Highs, Lows for 8 Days when compared to random selection of stocks.</w:t>
+        <w:t>Inverted Hammer shows significantly better results at forecasting Closes(following a trend) for 8 Days. Additionally, It  renders slightly better results at forecasting Closes for 4 Days. Additionally, It displays worse results  at forecasting Closes(following a trend) for 2 Days Likewise, , Highs, Lows for 4 Days and, Highs, Lows for 8 Days when compared to random selection of stocks.</w:t>
         <w:br/>
-        <w:t>Hanging Man shows worse results  at forecasting Closes for 4 Days and, Closes for 8 Days when compared to random selection of stocks.</w:t>
+        <w:t>Hanging Man yields worse results  at forecasting Closes for 4 Days and, Closes for 8 Days when compared to random selection of stocks.</w:t>
         <w:br/>
-        <w:t>Shooting Star yields significantly better results at forecasting Highs, Lows for 2 Days. Similarly, It  displays slightly better results at forecasting Lows (following a trend) for 2 Days and Lows for 4 Days. Moreover, It renders worse results  at forecasting Highs, Lows (following a trend) for 4 Days and, Lows for 8 Days when compared to random selection of stocks.</w:t>
+        <w:t>Shooting Star shows significantly better results at forecasting Highs, Lows for 2 Days. Similarly, It  displays slightly better results at forecasting Lows (following a trend) for 2 Days and Lows for 4 Days. Similarly, It renders worse results  at forecasting Highs, Lows (following a trend) for 4 Days and, Lows for 8 Days when compared to random selection of stocks.</w:t>
       </w:r>
     </w:p>
     <w:tbl>
@@ -26342,13 +26342,13 @@
         <w:t>during a sustained Bearish market phase.</w:t>
         <w:br/>
         <w:br/>
-        <w:t>Hammer shows significantly better results at forecasting Highs, Lows for 2 Days. Moreover , Highs, Lows for 4 Days and, Highs, Lows for 8 Days. Moreover, It  displays slightly better results at forecasting Highs(following a trend) for 8 Days. Likewise, It displays worse results  at forecasting Closes for 2 Days Additionally, , Closes for 4 Days and, Lows (following a trend) for 8 Days when compared to random selection of stocks.</w:t>
+        <w:t>Hammer displays significantly better results at forecasting Highs, Lows for 2 Days. And , Highs, Lows for 4 Days and, Highs, Lows for 8 Days. Furthermore, It  renders slightly better results at forecasting Highs(following a trend) for 8 Days. Similarly, It displays worse results  at forecasting Closes for 2 Days Moreover, , Closes for 4 Days and, Lows (following a trend) for 8 Days when compared to random selection of stocks.</w:t>
         <w:br/>
-        <w:t>Inverted Hammer displays slightly better results at forecasting Closes(following a trend) for 4 Days. Likewise, It renders worse results  at forecasting Closes(following a trend) for 2 Days and, Closes for 4 Days when compared to random selection of stocks.</w:t>
+        <w:t>Inverted Hammer yields slightly better results at forecasting Closes(following a trend) for 4 Days. And, It yields worse results  at forecasting Closes(following a trend) for 2 Days and, Closes for 4 Days when compared to random selection of stocks.</w:t>
         <w:br/>
-        <w:t>Hanging Man shows significantly better results at forecasting Closes(following a trend) for 4 Days and, Highs(following a trend), Lows (following a trend), Closes(following a trend) for 8 Days. Similarly, It  displays slightly better results at forecasting Closes(following a trend) for 2 Days. Additionally, It shows worse results  at forecasting Closes for 2 Days Similarly, , Lows (following a trend), Closes for 4 Days and, Closes for 8 Days when compared to random selection of stocks.</w:t>
+        <w:t>Hanging Man shows significantly better results at forecasting Closes(following a trend) for 4 Days and, Highs(following a trend), Lows (following a trend), Closes(following a trend) for 8 Days. And, It  renders slightly better results at forecasting Closes(following a trend) for 2 Days. Likewise, It displays worse results  at forecasting Closes for 2 Days Additionally, , Lows (following a trend), Closes for 4 Days and, Closes for 8 Days when compared to random selection of stocks.</w:t>
         <w:br/>
-        <w:t>Shooting Star renders significantly better results at forecasting Highs, Lows for 2 Days. Furthermore , Highs(following a trend), Lows (following a trend), Closes(following a trend) for 4 Days and, Highs(following a trend), Lows (following a trend), Closes(following a trend) for 8 Days. Similarly, It  shows slightly better results at forecasting Lows for 4 Days. Furthermore, It displays worse results  at forecasting Closes(following a trend) for 2 Days and, Highs for 8 Days when compared to random selection of stocks.</w:t>
+        <w:t>Shooting Star yields significantly better results at forecasting Highs, Lows for 2 Days. Similarly , Highs(following a trend), Lows (following a trend), Closes(following a trend) for 4 Days and, Highs(following a trend), Lows (following a trend), Closes(following a trend) for 8 Days. Similarly, It  displays slightly better results at forecasting Lows for 4 Days. Additionally, It shows worse results  at forecasting Closes(following a trend) for 2 Days and, Highs for 8 Days when compared to random selection of stocks.</w:t>
       </w:r>
     </w:p>
     <w:tbl>
@@ -27635,13 +27635,13 @@
         <w:t>during a sustained Bullish market phase.</w:t>
         <w:br/>
         <w:br/>
-        <w:t>Hammer yields significantly better results at forecasting Highs, Lows for 2 Days. Moreover , Highs for 4 Days and, Highs(following a trend), Lows (following a trend) for 8 Days. Additionally, It  displays slightly better results at forecasting Lows for 4 Days. And, It displays worse results  at forecasting Lows for 8 Days when compared to random selection of stocks.</w:t>
+        <w:t>Hammer yields significantly better results at forecasting Highs, Lows for 2 Days. Furthermore , Highs for 4 Days and, Highs(following a trend), Lows (following a trend) for 8 Days. Moreover, It  renders slightly better results at forecasting Lows for 4 Days. Similarly, It shows worse results  at forecasting Lows for 8 Days when compared to random selection of stocks.</w:t>
         <w:br/>
-        <w:t>Inverted Hammer shows significantly better results at forecasting Closes for 2 Days. Likewise , Closes for 4 Days and, Closes for 8 Days. Furthermore, It  displays slightly better results at forecasting Closes(following a trend) for 2 Days. And, It shows worse results  at forecasting Highs, Lows (following a trend) for 8 Days when compared to random selection of stocks.</w:t>
+        <w:t>Inverted Hammer displays significantly better results at forecasting Closes for 2 Days. Likewise , Closes for 4 Days and, Closes for 8 Days. And, It  displays slightly better results at forecasting Closes(following a trend) for 2 Days. And, It shows worse results  at forecasting Highs, Lows (following a trend) for 8 Days when compared to random selection of stocks.</w:t>
         <w:br/>
-        <w:t>Hanging Man renders significantly better results at forecasting Closes(following a trend) for 2 Days and, Closes for 8 Days. Additionally, It  yields slightly better results at forecasting Closes for 2 Days. Likewise, It renders worse results  at forecasting Lows (following a trend) for 2 Days and, Closes for 4 Days when compared to random selection of stocks.</w:t>
+        <w:t>Hanging Man shows significantly better results at forecasting Closes(following a trend) for 2 Days and, Closes for 8 Days. Moreover, It  shows slightly better results at forecasting Closes for 2 Days. Likewise, It renders worse results  at forecasting Lows (following a trend) for 2 Days and, Closes for 4 Days when compared to random selection of stocks.</w:t>
         <w:br/>
-        <w:t>Shooting Star renders significantly better results at forecasting Highs, Lows for 2 Days. Moreover , Highs, Lows for 4 Days and, Lows for 8 Days. Furthermore, It  displays slightly better results at forecasting Lows (following a trend) for 4 Days and Highs for 8 Days. Similarly, It renders worse results  at forecasting Closes(following a trend) for 2 Days and, Highs(following a trend) for 4 Days when compared to random selection of stocks.</w:t>
+        <w:t>Shooting Star displays significantly better results at forecasting Highs, Lows for 2 Days. Likewise , Highs, Lows for 4 Days and, Lows for 8 Days. Similarly, It  shows slightly better results at forecasting Lows (following a trend) for 4 Days and Highs for 8 Days. Similarly, It renders worse results  at forecasting Closes(following a trend) for 2 Days and, Highs(following a trend) for 4 Days when compared to random selection of stocks.</w:t>
       </w:r>
     </w:p>
     <w:tbl>
@@ -28910,13 +28910,13 @@
         <w:t>during a sustained Bearish market phase.</w:t>
         <w:br/>
         <w:br/>
-        <w:t>Hammer yields significantly better results at forecasting Highs for 2 Days. Furthermore, It  shows slightly better results at forecasting Lows for 2 Days. Moreover  it displays slightly better at  Highs Lows for 4 Days and Highs Lows for 8 Days. Similarly, It renders worse results  at forecasting Lows (following a trend) for 4 Days and, Lows (following a trend), Closes for 8 Days when compared to random selection of stocks.</w:t>
+        <w:t>Hammer displays significantly better results at forecasting Highs for 2 Days. Similarly, It  shows slightly better results at forecasting Lows for 2 Days. And  it renders slightly better at  Highs Lows for 4 Days and Highs Lows for 8 Days. Additionally, It shows worse results  at forecasting Lows (following a trend) for 4 Days and, Lows (following a trend), Closes for 8 Days when compared to random selection of stocks.</w:t>
         <w:br/>
-        <w:t>Inverted Hammer displays worse results  at forecasting Highs(following a trend), Closes for 2 Days Furthermore, , Closes for 4 Days and, Highs(following a trend), Closes for 8 Days when compared to random selection of stocks.</w:t>
+        <w:t>Inverted Hammer yields worse results  at forecasting Highs(following a trend), Closes for 2 Days Furthermore, , Closes for 4 Days and, Highs(following a trend), Closes for 8 Days when compared to random selection of stocks.</w:t>
         <w:br/>
-        <w:t>Hanging Man yields significantly better results at forecasting Closes(following a trend) for 2 Days and, Closes(following a trend) for 4 Days. Similarly, It  shows slightly better results at forecasting Closes(following a trend) for 8 Days. Likewise, It renders worse results  at forecasting Highs(following a trend), Lows (following a trend), Closes for 2 Days And, , Highs(following a trend) for 4 Days and, Highs(following a trend) for 8 Days when compared to random selection of stocks.</w:t>
+        <w:t>Hanging Man yields significantly better results at forecasting Closes(following a trend) for 2 Days and, Closes(following a trend) for 4 Days. And, It  yields slightly better results at forecasting Closes(following a trend) for 8 Days. And, It displays worse results  at forecasting Highs(following a trend), Lows (following a trend), Closes for 2 Days And, , Highs(following a trend) for 4 Days and, Highs(following a trend) for 8 Days when compared to random selection of stocks.</w:t>
         <w:br/>
-        <w:t>Shooting Star yields significantly better results at forecasting Highs, Lows for 2 Days. Furthermore , Highs(following a trend), Lows, Closes(following a trend) for 4 Days and, Highs(following a trend), Lows, Closes(following a trend) for 8 Days. Likewise, It  yields slightly better results at forecasting Closes(following a trend) for 2 Days. Additionally  it yields slightly better at  Highs for 4 Days and Highs for 8 Days. Similarly, It renders worse results  at forecasting Closes for 2 Days Similarly, , Closes for 4 Days and, Closes for 8 Days when compared to random selection of stocks.</w:t>
+        <w:t>Shooting Star renders significantly better results at forecasting Highs, Lows for 2 Days. And , Highs(following a trend), Lows, Closes(following a trend) for 4 Days and, Highs(following a trend), Lows, Closes(following a trend) for 8 Days. Furthermore, It  displays slightly better results at forecasting Closes(following a trend) for 2 Days. Additionally  it yields slightly better at  Highs for 4 Days and Highs for 8 Days. Additionally, It yields worse results  at forecasting Closes for 2 Days Additionally, , Closes for 4 Days and, Closes for 8 Days when compared to random selection of stocks.</w:t>
       </w:r>
     </w:p>
     <w:tbl>
@@ -30218,13 +30218,13 @@
         <w:t>during a sustained Bullish market phase.</w:t>
         <w:br/>
         <w:br/>
-        <w:t>Hammer displays significantly better results at forecasting Highs, Lows for 2 Days. Additionally , Highs, Lows for 4 Days and, Highs, Lows for 8 Days. Likewise, It  yields slightly better results at forecasting Lows (following a trend) for 2 Days. And, It shows worse results  at forecasting Closes for 4 Days and, Closes for 8 Days when compared to random selection of stocks.</w:t>
+        <w:t>Hammer shows significantly better results at forecasting Highs, Lows for 2 Days. And , Highs, Lows for 4 Days and, Highs, Lows for 8 Days. Furthermore, It  displays slightly better results at forecasting Lows (following a trend) for 2 Days. Furthermore, It displays worse results  at forecasting Closes for 4 Days and, Closes for 8 Days when compared to random selection of stocks.</w:t>
         <w:br/>
-        <w:t>Inverted Hammer yields worse results  at forecasting Closes(following a trend) for 2 Days Furthermore, , Closes for 4 Days and, Highs(following a trend), Lows (following a trend), Closes for 8 Days when compared to random selection of stocks.</w:t>
+        <w:t>Inverted Hammer renders worse results  at forecasting Closes(following a trend) for 2 Days Furthermore, , Closes for 4 Days and, Highs(following a trend), Lows (following a trend), Closes for 8 Days when compared to random selection of stocks.</w:t>
         <w:br/>
-        <w:t>Hanging Man shows worse results  at forecasting Closes for 4 Days when compared to random selection of stocks.</w:t>
+        <w:t>Hanging Man renders worse results  at forecasting Closes for 4 Days when compared to random selection of stocks.</w:t>
         <w:br/>
-        <w:t>Shooting Star yields significantly better results at forecasting Highs, Lows for 2 Days and, Highs, Lows for 4 Days. Moreover, It renders worse results  at forecasting Closes for 2 Days when compared to random selection of stocks.</w:t>
+        <w:t>Shooting Star shows significantly better results at forecasting Highs, Lows for 2 Days and, Highs, Lows for 4 Days. And, It yields worse results  at forecasting Closes for 2 Days when compared to random selection of stocks.</w:t>
       </w:r>
     </w:p>
     <w:tbl>
@@ -31481,13 +31481,13 @@
         <w:t>during a sustained Bearish market phase.</w:t>
         <w:br/>
         <w:br/>
-        <w:t>Hammer displays significantly better results at forecasting Highs, Lows for 2 Days and, Highs for 4 Days. Moreover, It  yields slightly better results at forecasting Lows for 4 Days and Highs for 8 Days. And, It shows worse results  at forecasting Highs(following a trend) for 8 Days when compared to random selection of stocks.</w:t>
+        <w:t>Hammer displays significantly better results at forecasting Highs, Lows for 2 Days and, Highs for 4 Days. And, It  renders slightly better results at forecasting Lows for 4 Days and Highs for 8 Days. Additionally, It renders worse results  at forecasting Highs(following a trend) for 8 Days when compared to random selection of stocks.</w:t>
         <w:br/>
-        <w:t>Inverted Hammer renders worse results  at forecasting Closes for 2 Days Similarly, , Highs(following a trend), Closes for 4 Days and, Highs, Closes for 8 Days when compared to random selection of stocks.</w:t>
+        <w:t>Inverted Hammer displays worse results  at forecasting Closes for 2 Days Additionally, , Highs(following a trend), Closes for 4 Days and, Highs, Closes for 8 Days when compared to random selection of stocks.</w:t>
         <w:br/>
-        <w:t>Hanging Man yields significantly better results at forecasting Closes(following a trend) for 2 Days. Additionally , Highs(following a trend), Closes(following a trend) for 4 Days and, Highs(following a trend), Lows (following a trend), Closes(following a trend) for 8 Days. Moreover, It  renders slightly better results at forecasting Closes for 2 Days and Lows (following a trend) for 4 Days. Furthermore, It shows worse results  at forecasting Highs(following a trend), Lows (following a trend) for 2 Days when compared to random selection of stocks.</w:t>
+        <w:t>Hanging Man shows significantly better results at forecasting Closes(following a trend) for 2 Days. And , Highs(following a trend), Closes(following a trend) for 4 Days and, Highs(following a trend), Lows (following a trend), Closes(following a trend) for 8 Days. And, It  renders slightly better results at forecasting Closes for 2 Days and Lows (following a trend) for 4 Days. Likewise, It renders worse results  at forecasting Highs(following a trend), Lows (following a trend) for 2 Days when compared to random selection of stocks.</w:t>
         <w:br/>
-        <w:t>Shooting Star renders significantly better results at forecasting Highs, Lows for 2 Days. Likewise , Highs, Lows for 4 Days and, Highs(following a trend), Lows, Closes(following a trend) for 8 Days. And, It  yields slightly better results at forecasting Closes(following a trend) for 2 Days. Moreover, It yields worse results  at forecasting Closes(following a trend) for 4 Days and, Highs for 8 Days when compared to random selection of stocks.</w:t>
+        <w:t>Shooting Star displays significantly better results at forecasting Highs, Lows for 2 Days. Additionally , Highs, Lows for 4 Days and, Highs(following a trend), Lows, Closes(following a trend) for 8 Days. Furthermore, It  displays slightly better results at forecasting Closes(following a trend) for 2 Days. Furthermore, It shows worse results  at forecasting Closes(following a trend) for 4 Days and, Highs for 8 Days when compared to random selection of stocks.</w:t>
       </w:r>
     </w:p>
     <w:tbl>
@@ -32777,13 +32777,13 @@
         <w:t>during a sustained Bullish market phase.</w:t>
         <w:br/>
         <w:br/>
-        <w:t>Hammer displays significantly better results at forecasting Highs, Lows for 2 Days. Additionally , Highs, Lows for 4 Days and, Highs, Lows (following a trend) for 8 Days. Furthermore, It  renders slightly better results at forecasting Lows (following a trend) for 2 Days and Lows for 8 Days. Moreover, It yields worse results  at forecasting Closes for 2 Days Furthermore, , Closes(following a trend) for 4 Days and, Closes(following a trend) for 8 Days when compared to random selection of stocks.</w:t>
+        <w:t>Hammer yields significantly better results at forecasting Highs, Lows for 2 Days. Similarly , Highs, Lows for 4 Days and, Highs, Lows (following a trend) for 8 Days. Furthermore, It  renders slightly better results at forecasting Lows (following a trend) for 2 Days and Lows for 8 Days. Similarly, It renders worse results  at forecasting Closes for 2 Days Additionally, , Closes(following a trend) for 4 Days and, Closes(following a trend) for 8 Days when compared to random selection of stocks.</w:t>
         <w:br/>
-        <w:t>Inverted Hammer yields worse results  at forecasting Closes for 2 Days Likewise, , Closes for 4 Days and, Highs(following a trend), Closes for 8 Days when compared to random selection of stocks.</w:t>
+        <w:t>Inverted Hammer renders worse results  at forecasting Closes for 2 Days And, , Closes for 4 Days and, Highs(following a trend), Closes for 8 Days when compared to random selection of stocks.</w:t>
         <w:br/>
-        <w:t>Hanging Man yields slightly better results at forecasting Closes for 4 Days. Moreover, It renders worse results  at forecasting Closes for 2 Days when compared to random selection of stocks.</w:t>
+        <w:t>Hanging Man displays slightly better results at forecasting Closes for 4 Days. Additionally, It renders worse results  at forecasting Closes for 2 Days when compared to random selection of stocks.</w:t>
         <w:br/>
-        <w:t>Shooting Star renders significantly better results at forecasting Lows for 2 Days and, Lows for 8 Days. Moreover, It  displays slightly better results at forecasting Lows (following a trend) for 2 Days and Lows for 4 Days. Furthermore, It yields worse results  at forecasting Highs(following a trend), Lows (following a trend) for 4 Days when compared to random selection of stocks.</w:t>
+        <w:t>Shooting Star yields significantly better results at forecasting Lows for 2 Days and, Lows for 8 Days. And, It  shows slightly better results at forecasting Lows (following a trend) for 2 Days and Lows for 4 Days. Additionally, It yields worse results  at forecasting Highs(following a trend), Lows (following a trend) for 4 Days when compared to random selection of stocks.</w:t>
       </w:r>
     </w:p>
     <w:tbl>
@@ -34052,11 +34052,11 @@
         <w:t>during a sustained Bearish market phase.</w:t>
         <w:br/>
         <w:br/>
-        <w:t>Hammer displays significantly better results at forecasting Highs, Lows for 2 Days and, Highs, Lows for 4 Days. Additionally, It  yields slightly better results at forecasting Highs(following a trend) for 4 Days and Highs for 8 Days. Likewise, It yields worse results  at forecasting Closes(following a trend) for 2 Days Additionally, , Lows (following a trend) for 4 Days and, Highs(following a trend), Lows for 8 Days when compared to random selection of stocks.</w:t>
+        <w:t>Hammer displays significantly better results at forecasting Highs, Lows for 2 Days and, Highs, Lows for 4 Days. Moreover, It  yields slightly better results at forecasting Highs(following a trend) for 4 Days and Highs for 8 Days. Furthermore, It yields worse results  at forecasting Closes(following a trend) for 2 Days Furthermore, , Lows (following a trend) for 4 Days and, Highs(following a trend), Lows for 8 Days when compared to random selection of stocks.</w:t>
         <w:br/>
-        <w:t>Hanging Man displays significantly better results at forecasting Closes(following a trend) for 2 Days and, Closes(following a trend) for 4 Days. Similarly, It  renders slightly better results at forecasting Closes for 2 Days. Furthermore  it renders slightly better at  Lows (following a trend) for 4 Days and Closes(following a trend) for 8 Days. Moreover, It displays worse results  at forecasting Lows (following a trend) for 2 Days And, , Highs(following a trend), Closes for 4 Days and, Highs(following a trend), Lows (following a trend) for 8 Days when compared to random selection of stocks.</w:t>
+        <w:t>Hanging Man shows significantly better results at forecasting Closes(following a trend) for 2 Days and, Closes(following a trend) for 4 Days. Similarly, It  shows slightly better results at forecasting Closes for 2 Days. Similarly  it shows slightly better at  Lows (following a trend) for 4 Days and Closes(following a trend) for 8 Days. Moreover, It shows worse results  at forecasting Lows (following a trend) for 2 Days Furthermore, , Highs(following a trend), Closes for 4 Days and, Highs(following a trend), Lows (following a trend) for 8 Days when compared to random selection of stocks.</w:t>
         <w:br/>
-        <w:t>Shooting Star yields significantly better results at forecasting Highs, Lows, Closes(following a trend) for 2 Days. Moreover , Highs, Lows for 4 Days and, Highs, Lows, Closes(following a trend) for 8 Days. Similarly, It  shows slightly better results at forecasting Closes(following a trend) for 4 Days. Moreover, It yields worse results  at forecasting Closes for 8 Days when compared to random selection of stocks.</w:t>
+        <w:t>Shooting Star displays significantly better results at forecasting Highs, Lows, Closes(following a trend) for 2 Days. And , Highs, Lows for 4 Days and, Highs, Lows, Closes(following a trend) for 8 Days. Likewise, It  displays slightly better results at forecasting Closes(following a trend) for 4 Days. Similarly, It yields worse results  at forecasting Closes for 8 Days when compared to random selection of stocks.</w:t>
       </w:r>
     </w:p>
     <w:tbl>
@@ -35334,13 +35334,13 @@
         <w:t>during a sustained Bullish market phase.</w:t>
         <w:br/>
         <w:br/>
-        <w:t>Hammer shows significantly better results at forecasting Highs, Lows for 2 Days and, Lows for 4 Days. Likewise, It  renders slightly better results at forecasting Highs Lows (following a trend) for 4 Days and Highs for 8 Days. Furthermore, It renders worse results  at forecasting Highs(following a trend) for 4 Days and, Highs(following a trend), Lows (following a trend) for 8 Days when compared to random selection of stocks.</w:t>
+        <w:t>Hammer yields significantly better results at forecasting Highs, Lows for 2 Days and, Lows for 4 Days. Likewise, It  renders slightly better results at forecasting Highs Lows (following a trend) for 4 Days and Highs for 8 Days. Similarly, It yields worse results  at forecasting Highs(following a trend) for 4 Days and, Highs(following a trend), Lows (following a trend) for 8 Days when compared to random selection of stocks.</w:t>
         <w:br/>
-        <w:t>Inverted Hammer yields slightly better results at forecasting Closes(following a trend) for 2 Days. Furthermore, It displays worse results  at forecasting Highs(following a trend), Closes for 2 Days Furthermore, , Lows (following a trend), Closes for 4 Days and, Highs(following a trend), Closes(following a trend) for 8 Days when compared to random selection of stocks.</w:t>
+        <w:t>Inverted Hammer renders slightly better results at forecasting Closes(following a trend) for 2 Days. Similarly, It displays worse results  at forecasting Highs(following a trend), Closes for 2 Days Moreover, , Lows (following a trend), Closes for 4 Days and, Highs(following a trend), Closes(following a trend) for 8 Days when compared to random selection of stocks.</w:t>
         <w:br/>
         <w:t>Hanging Man yields worse results  at forecasting Closes for 4 Days when compared to random selection of stocks.</w:t>
         <w:br/>
-        <w:t>Shooting Star renders significantly better results at forecasting Lows for 2 Days and, Lows for 4 Days. Additionally, It  renders slightly better results at forecasting Highs for 2 Days. Similarly, It displays worse results  at forecasting Highs(following a trend) for 2 Days Additionally, , Highs, Lows (following a trend) for 4 Days and, Highs, Lows for 8 Days when compared to random selection of stocks.</w:t>
+        <w:t>Shooting Star displays significantly better results at forecasting Lows for 2 Days and, Lows for 4 Days. Similarly, It  shows slightly better results at forecasting Highs for 2 Days. Furthermore, It yields worse results  at forecasting Highs(following a trend) for 2 Days Likewise, , Highs, Lows (following a trend) for 4 Days and, Highs, Lows for 8 Days when compared to random selection of stocks.</w:t>
       </w:r>
     </w:p>
     <w:tbl>
@@ -36594,13 +36594,13 @@
         <w:t>during a sustained Bearish market phase.</w:t>
         <w:br/>
         <w:br/>
-        <w:t>Hammer yields significantly better results at forecasting Highs, Lows for 2 Days. Moreover , Highs, Lows for 4 Days and, Highs, Lows for 8 Days. And, It displays worse results  at forecasting Closes for 4 Days and, Highs(following a trend), Lows (following a trend) for 8 Days when compared to random selection of stocks.</w:t>
+        <w:t>Hammer shows significantly better results at forecasting Highs, Lows for 2 Days. Similarly , Highs, Lows for 4 Days and, Highs, Lows for 8 Days. Likewise, It renders worse results  at forecasting Closes for 4 Days and, Highs(following a trend), Lows (following a trend) for 8 Days when compared to random selection of stocks.</w:t>
         <w:br/>
-        <w:t>Inverted Hammer yields significantly better results at forecasting Closes for 2 Days and, Closes for 4 Days. Moreover, It shows worse results  at forecasting Closes(following a trend) for 2 Days And, , Highs for 4 Days and, Highs, Closes for 8 Days when compared to random selection of stocks.</w:t>
+        <w:t>Inverted Hammer renders significantly better results at forecasting Closes for 2 Days and, Closes for 4 Days. Similarly, It yields worse results  at forecasting Closes(following a trend) for 2 Days Additionally, , Highs for 4 Days and, Highs, Closes for 8 Days when compared to random selection of stocks.</w:t>
         <w:br/>
-        <w:t>Hanging Man displays significantly better results at forecasting Closes(following a trend) for 2 Days. And , Closes(following a trend) for 4 Days and, Closes(following a trend) for 8 Days. Likewise, It  shows slightly better results at forecasting Highs(following a trend) Lows (following a trend) for 8 Days. And, It displays worse results  at forecasting Highs(following a trend), Closes for 2 Days And, , Highs(following a trend), Lows (following a trend), Closes for 4 Days and, Closes for 8 Days when compared to random selection of stocks.</w:t>
+        <w:t>Hanging Man displays significantly better results at forecasting Closes(following a trend) for 2 Days. Furthermore , Closes(following a trend) for 4 Days and, Closes(following a trend) for 8 Days. And, It  yields slightly better results at forecasting Highs(following a trend) Lows (following a trend) for 8 Days. Additionally, It shows worse results  at forecasting Highs(following a trend), Closes for 2 Days And, , Highs(following a trend), Lows (following a trend), Closes for 4 Days and, Closes for 8 Days when compared to random selection of stocks.</w:t>
         <w:br/>
-        <w:t>Shooting Star displays significantly better results at forecasting Highs, Lows for 2 Days. Moreover , Lows for 4 Days and, Highs(following a trend), Lows (following a trend), Closes(following a trend) for 8 Days. Likewise, It  shows slightly better results at forecasting Highs(following a trend) for 2 Days. Additionally  it yields slightly better at  Highs(following a trend) for 4 Days and Lows for 8 Days. Similarly, It shows worse results  at forecasting Closes(following a trend) for 2 Days Moreover, , Highs, Closes(following a trend) for 4 Days and, Closes for 8 Days when compared to random selection of stocks.</w:t>
+        <w:t>Shooting Star displays significantly better results at forecasting Highs, Lows for 2 Days. Furthermore , Lows for 4 Days and, Highs(following a trend), Lows (following a trend), Closes(following a trend) for 8 Days. Additionally, It  yields slightly better results at forecasting Highs(following a trend) for 2 Days. Furthermore  it yields slightly better at  Highs(following a trend) for 4 Days and Lows for 8 Days. Moreover, It renders worse results  at forecasting Closes(following a trend) for 2 Days Additionally, , Highs, Closes(following a trend) for 4 Days and, Closes for 8 Days when compared to random selection of stocks.</w:t>
       </w:r>
     </w:p>
     <w:tbl>

</xml_diff>

<commit_message>
fix all the candle's whisker chat
</commit_message>
<xml_diff>
--- a/src/steps/docx_output/thesis.docx
+++ b/src/steps/docx_output/thesis.docx
@@ -21,13 +21,13 @@
         <w:t>during a sustained Bullish market phase.</w:t>
         <w:br/>
         <w:br/>
-        <w:t xml:space="preserve">Hammer yields significantly better results at forecasting Highs for 2 Days and, Highs for 4 Days. Likewise, It  displays slightly better results at forecasting Lows for 2 Days. Additionally  it yields slightly better at  Highs(following a trend) Lows for 4 Days and Highs Lows for 8 Days. </w:t>
+        <w:t xml:space="preserve">Hammer shows significantly better results at forecasting Highs for 2 Days and, Highs for 4 Days. Likewise, It  shows slightly better results at forecasting Lows for 2 Days. Additionally  it renders slightly better at  Highs(following a trend) Lows for 4 Days and Highs Lows for 8 Days. </w:t>
         <w:br/>
-        <w:t xml:space="preserve">Inverted Hammer renders slightly better results at forecasting Closes(following a trend) for 8 Days. </w:t>
+        <w:t xml:space="preserve">Inverted Hammer yields slightly better results at forecasting Closes(following a trend) for 8 Days. </w:t>
         <w:br/>
-        <w:t>Hanging Man renders worse results  at forecasting Highs, Lows for 2 Days And, , Highs, Lows (following a trend) for 4 Days and, Highs(following a trend), Lows (following a trend) for 8 Days when compared to random selection of stocks.</w:t>
+        <w:t>Hanging Man yields worse results  at forecasting Highs, Lows for 2 Days And, , Highs, Lows (following a trend) for 4 Days and, Highs(following a trend), Lows (following a trend) for 8 Days when compared to random selection of stocks.</w:t>
         <w:br/>
-        <w:t xml:space="preserve">Shooting Star shows slightly better results at forecasting Highs Lows for 2 Days. </w:t>
+        <w:t xml:space="preserve">Shooting Star renders slightly better results at forecasting Highs Lows for 2 Days. </w:t>
       </w:r>
     </w:p>
     <w:tbl>
@@ -2526,13 +2526,13 @@
         <w:t>during a sustained Bearish market phase.</w:t>
         <w:br/>
         <w:br/>
-        <w:t xml:space="preserve">Hammer displays significantly better results at forecasting Highs, Lows for 2 Days and, Highs, Lows for 4 Days. And, It  displays slightly better results at forecasting Highs Lows for 8 Days. </w:t>
+        <w:t xml:space="preserve">Hammer renders significantly better results at forecasting Highs, Lows for 2 Days and, Highs, Lows for 4 Days. Likewise, It  yields slightly better results at forecasting Highs Lows for 8 Days. </w:t>
         <w:br/>
-        <w:t>Inverted Hammer displays worse results  at forecasting Lows (following a trend) for 8 Days when compared to random selection of stocks.</w:t>
+        <w:t>Inverted Hammer renders worse results  at forecasting Lows (following a trend) for 8 Days when compared to random selection of stocks.</w:t>
         <w:br/>
-        <w:t>Hanging Man displays significantly better results at forecasting Closes(following a trend) for 8 Days. Additionally, It  displays slightly better results at forecasting Closes(following a trend) for 4 Days and Highs(following a trend) Lows (following a trend) for 8 Days. Moreover, It renders worse results  at forecasting Highs, Lows for 2 Days and, Lows for 4 Days when compared to random selection of stocks.</w:t>
+        <w:t>Hanging Man shows significantly better results at forecasting Closes(following a trend) for 8 Days. Furthermore, It  renders slightly better results at forecasting Closes(following a trend) for 4 Days and Highs(following a trend) Lows (following a trend) for 8 Days. Moreover, It shows worse results  at forecasting Highs, Lows for 2 Days and, Lows for 4 Days when compared to random selection of stocks.</w:t>
         <w:br/>
-        <w:t xml:space="preserve">Shooting Star shows significantly better results at forecasting Highs(following a trend), Lows (following a trend) for 2 Days. Likewise , Highs(following a trend), Lows (following a trend) for 4 Days and, Highs(following a trend), Lows (following a trend) for 8 Days. Furthermore, It  shows slightly better results at forecasting Highs Lows for 2 Days. Likewise  it renders slightly better at  Closes(following a trend) for 4 Days and Closes(following a trend) for 8 Days. </w:t>
+        <w:t xml:space="preserve">Shooting Star shows significantly better results at forecasting Highs(following a trend), Lows (following a trend) for 2 Days. Furthermore , Highs(following a trend), Lows (following a trend) for 4 Days and, Highs(following a trend), Lows (following a trend) for 8 Days. Similarly, It  displays slightly better results at forecasting Highs Lows for 2 Days. Furthermore  it yields slightly better at  Closes(following a trend) for 4 Days and Closes(following a trend) for 8 Days. </w:t>
       </w:r>
     </w:p>
     <w:tbl>
@@ -5031,13 +5031,13 @@
         <w:t>during a sustained Bullish market phase.</w:t>
         <w:br/>
         <w:br/>
-        <w:t xml:space="preserve">Hammer renders significantly better results at forecasting Highs(following a trend) for 2 Days and, Highs(following a trend), Lows (following a trend) for 8 Days. Furthermore, It  renders slightly better results at forecasting Highs Lows for 2 Days and Highs Lows (following a trend) for 4 Days. </w:t>
+        <w:t xml:space="preserve">Hammer shows significantly better results at forecasting Highs(following a trend) for 2 Days and, Highs(following a trend), Lows (following a trend) for 8 Days. Additionally, It  renders slightly better results at forecasting Highs Lows for 2 Days and Highs Lows (following a trend) for 4 Days. </w:t>
         <w:br/>
-        <w:t xml:space="preserve">Inverted Hammer shows slightly better results at forecasting Closes(following a trend) for 4 Days and Closes(following a trend) for 8 Days. </w:t>
+        <w:t xml:space="preserve">Inverted Hammer displays slightly better results at forecasting Closes(following a trend) for 4 Days and Closes(following a trend) for 8 Days. </w:t>
         <w:br/>
-        <w:t>Hanging Man renders slightly better results at forecasting Closes(following a trend) for 2 Days. Furthermore, It shows worse results  at forecasting Highs(following a trend) for 4 Days and, Highs(following a trend), Lows (following a trend), Closes(following a trend) for 8 Days when compared to random selection of stocks.</w:t>
+        <w:t>Hanging Man yields slightly better results at forecasting Closes(following a trend) for 2 Days. And, It yields worse results  at forecasting Highs(following a trend) for 4 Days and, Highs(following a trend), Lows (following a trend), Closes(following a trend) for 8 Days when compared to random selection of stocks.</w:t>
         <w:br/>
-        <w:t>Shooting Star shows significantly better results at forecasting Highs(following a trend), Lows for 2 Days. And, It  displays slightly better results at forecasting Highs for 2 Days. And  it renders slightly better at  Lows for 4 Days and Lows for 8 Days. Similarly, It displays worse results  at forecasting Highs(following a trend), Closes(following a trend) for 8 Days when compared to random selection of stocks.</w:t>
+        <w:t>Shooting Star displays significantly better results at forecasting Highs(following a trend), Lows for 2 Days. Likewise, It  renders slightly better results at forecasting Highs for 2 Days. Furthermore  it renders slightly better at  Lows for 4 Days and Lows for 8 Days. Similarly, It yields worse results  at forecasting Highs(following a trend), Closes(following a trend) for 8 Days when compared to random selection of stocks.</w:t>
       </w:r>
     </w:p>
     <w:tbl>
@@ -7536,11 +7536,11 @@
         <w:t>during a sustained Bearish market phase.</w:t>
         <w:br/>
         <w:br/>
-        <w:t xml:space="preserve">Hammer displays significantly better results at forecasting Highs(following a trend) for 2 Days. Likewise, It  renders slightly better results at forecasting Highs Lows (following a trend) for 2 Days. Furthermore  it renders slightly better at  Highs for 4 Days and Highs for 8 Days. </w:t>
+        <w:t xml:space="preserve">Hammer yields significantly better results at forecasting Highs(following a trend) for 2 Days. Similarly, It  renders slightly better results at forecasting Highs Lows (following a trend) for 2 Days. Likewise  it shows slightly better at  Highs for 4 Days and Highs for 8 Days. </w:t>
         <w:br/>
-        <w:t>Hanging Man yields significantly better results at forecasting Closes(following a trend) for 2 Days. Likewise, It  yields slightly better results at forecasting Closes(following a trend) for 4 Days and Lows (following a trend) Closes(following a trend) for 8 Days. Moreover, It renders worse results  at forecasting Highs for 2 Days and, Highs for 4 Days when compared to random selection of stocks.</w:t>
+        <w:t>Hanging Man yields significantly better results at forecasting Closes(following a trend) for 2 Days. And, It  displays slightly better results at forecasting Closes(following a trend) for 4 Days and Lows (following a trend) Closes(following a trend) for 8 Days. Likewise, It displays worse results  at forecasting Highs for 2 Days and, Highs for 4 Days when compared to random selection of stocks.</w:t>
         <w:br/>
-        <w:t xml:space="preserve">Shooting Star shows significantly better results at forecasting Highs(following a trend), Lows (following a trend) for 2 Days. Moreover , Highs(following a trend), Lows (following a trend), Closes(following a trend) for 4 Days and, Highs(following a trend), Lows (following a trend), Closes(following a trend) for 8 Days. Additionally, It  shows slightly better results at forecasting Lows Closes(following a trend) for 2 Days and Lows for 4 Days. </w:t>
+        <w:t xml:space="preserve">Shooting Star renders significantly better results at forecasting Highs(following a trend), Lows (following a trend) for 2 Days. And , Highs(following a trend), Lows (following a trend), Closes(following a trend) for 4 Days and, Highs(following a trend), Lows (following a trend), Closes(following a trend) for 8 Days. Moreover, It  yields slightly better results at forecasting Lows Closes(following a trend) for 2 Days and Lows for 4 Days. </w:t>
       </w:r>
     </w:p>
     <w:tbl>
@@ -10039,11 +10039,11 @@
         <w:t>during a sustained Bullish market phase.</w:t>
         <w:br/>
         <w:br/>
-        <w:t xml:space="preserve">Hammer yields significantly better results at forecasting Highs for 2 Days. Moreover, It  renders slightly better results at forecasting Lows for 2 Days. Moreover  it shows slightly better at  Highs Lows for 4 Days and Highs Lows for 8 Days. </w:t>
+        <w:t xml:space="preserve">Hammer yields significantly better results at forecasting Highs for 2 Days. Similarly, It  shows slightly better results at forecasting Lows for 2 Days. Likewise  it displays slightly better at  Highs Lows for 4 Days and Highs Lows for 8 Days. </w:t>
         <w:br/>
-        <w:t>Hanging Man yields worse results  at forecasting Highs(following a trend), Lows (following a trend) for 2 Days Additionally, , Highs(following a trend), Lows (following a trend), Closes(following a trend) for 4 Days and, Highs(following a trend), Lows (following a trend), Closes(following a trend) for 8 Days when compared to random selection of stocks.</w:t>
+        <w:t>Hanging Man yields worse results  at forecasting Highs(following a trend), Lows (following a trend) for 2 Days Moreover, , Highs(following a trend), Lows (following a trend), Closes(following a trend) for 4 Days and, Highs(following a trend), Lows (following a trend), Closes(following a trend) for 8 Days when compared to random selection of stocks.</w:t>
         <w:br/>
-        <w:t>Shooting Star yields significantly better results at forecasting Lows for 2 Days. Likewise, It  shows slightly better results at forecasting Lows (following a trend) for 2 Days. Moreover, It displays worse results  at forecasting Closes(following a trend) for 4 Days and, Highs(following a trend), Lows (following a trend), Closes(following a trend) for 8 Days when compared to random selection of stocks.</w:t>
+        <w:t>Shooting Star renders significantly better results at forecasting Lows for 2 Days. Likewise, It  yields slightly better results at forecasting Lows (following a trend) for 2 Days. Moreover, It displays worse results  at forecasting Closes(following a trend) for 4 Days and, Highs(following a trend), Lows (following a trend), Closes(following a trend) for 8 Days when compared to random selection of stocks.</w:t>
       </w:r>
     </w:p>
     <w:tbl>
@@ -12542,11 +12542,11 @@
         <w:t>during a sustained Bearish market phase.</w:t>
         <w:br/>
         <w:br/>
-        <w:t>Hammer yields significantly better results at forecasting Highs(following a trend) for 2 Days. Additionally, It  shows slightly better results at forecasting Highs Lows for 2 Days and Highs for 4 Days. Likewise, It renders worse results  at forecasting Closes(following a trend) for 2 Days when compared to random selection of stocks.</w:t>
+        <w:t>Hammer renders significantly better results at forecasting Highs(following a trend) for 2 Days. Additionally, It  shows slightly better results at forecasting Highs Lows for 2 Days and Highs for 4 Days. Additionally, It displays worse results  at forecasting Closes(following a trend) for 2 Days when compared to random selection of stocks.</w:t>
         <w:br/>
-        <w:t xml:space="preserve">Hanging Man shows significantly better results at forecasting Closes(following a trend) for 4 Days and, Closes(following a trend) for 8 Days. Additionally, It  yields slightly better results at forecasting Closes(following a trend) for 2 Days. Additionally  it shows slightly better at  Highs(following a trend) for 4 Days and Highs(following a trend) Lows (following a trend) for 8 Days. </w:t>
+        <w:t xml:space="preserve">Hanging Man shows significantly better results at forecasting Closes(following a trend) for 4 Days and, Closes(following a trend) for 8 Days. Similarly, It  yields slightly better results at forecasting Closes(following a trend) for 2 Days. And  it yields slightly better at  Highs(following a trend) for 4 Days and Highs(following a trend) Lows (following a trend) for 8 Days. </w:t>
         <w:br/>
-        <w:t xml:space="preserve">Shooting Star displays significantly better results at forecasting Highs(following a trend), Lows for 2 Days. Furthermore , Highs(following a trend), Lows (following a trend) for 4 Days and, Highs(following a trend), Lows (following a trend), Closes(following a trend) for 8 Days. Additionally, It  displays slightly better results at forecasting Highs for 2 Days and Lows for 4 Days. </w:t>
+        <w:t xml:space="preserve">Shooting Star renders significantly better results at forecasting Highs(following a trend), Lows for 2 Days. And , Highs(following a trend), Lows (following a trend) for 4 Days and, Highs(following a trend), Lows (following a trend), Closes(following a trend) for 8 Days. And, It  displays slightly better results at forecasting Highs for 2 Days and Lows for 4 Days. </w:t>
       </w:r>
     </w:p>
     <w:tbl>
@@ -15045,11 +15045,11 @@
         <w:t>during a sustained Bullish market phase.</w:t>
         <w:br/>
         <w:br/>
-        <w:t xml:space="preserve">Hammer displays significantly better results at forecasting Highs, Lows for 2 Days. Similarly , Highs(following a trend), Lows (following a trend) for 4 Days and, Highs(following a trend), Lows (following a trend) for 8 Days. Additionally, It  yields slightly better results at forecasting Lows (following a trend) for 2 Days. And  it displays slightly better at  Highs Lows for 4 Days and Highs for 8 Days. </w:t>
+        <w:t xml:space="preserve">Hammer displays significantly better results at forecasting Highs, Lows for 2 Days. Moreover , Highs(following a trend), Lows (following a trend) for 4 Days and, Highs(following a trend), Lows (following a trend) for 8 Days. Additionally, It  displays slightly better results at forecasting Lows (following a trend) for 2 Days. Furthermore  it renders slightly better at  Highs Lows for 4 Days and Highs for 8 Days. </w:t>
         <w:br/>
-        <w:t>Hanging Man yields worse results  at forecasting Highs, Lows (following a trend) for 2 Days Likewise, , Highs(following a trend) for 4 Days and, Highs(following a trend), Lows (following a trend), Closes(following a trend) for 8 Days when compared to random selection of stocks.</w:t>
+        <w:t>Hanging Man shows worse results  at forecasting Highs, Lows (following a trend) for 2 Days And, , Highs(following a trend) for 4 Days and, Highs(following a trend), Lows (following a trend), Closes(following a trend) for 8 Days when compared to random selection of stocks.</w:t>
         <w:br/>
-        <w:t>Shooting Star shows slightly better results at forecasting Lows for 2 Days. Likewise, It yields worse results  at forecasting Highs(following a trend), Closes(following a trend) for 8 Days when compared to random selection of stocks.</w:t>
+        <w:t>Shooting Star shows slightly better results at forecasting Lows for 2 Days. Moreover, It displays worse results  at forecasting Highs(following a trend), Closes(following a trend) for 8 Days when compared to random selection of stocks.</w:t>
       </w:r>
     </w:p>
     <w:tbl>
@@ -17548,13 +17548,13 @@
         <w:t>during a sustained Bearish market phase.</w:t>
         <w:br/>
         <w:br/>
-        <w:t>Hammer renders significantly better results at forecasting Highs, Lows for 2 Days. Likewise, It  yields slightly better results at forecasting Highs for 4 Days. And, It renders worse results  at forecasting Closes(following a trend) for 4 Days and, Closes(following a trend) for 8 Days when compared to random selection of stocks.</w:t>
+        <w:t>Hammer shows significantly better results at forecasting Highs, Lows for 2 Days. And, It  yields slightly better results at forecasting Highs for 4 Days. And, It shows worse results  at forecasting Closes(following a trend) for 4 Days and, Closes(following a trend) for 8 Days when compared to random selection of stocks.</w:t>
         <w:br/>
-        <w:t>Inverted Hammer displays worse results  at forecasting Lows (following a trend) for 2 Days Likewise, , Highs(following a trend), Lows for 4 Days and, Highs(following a trend), Lows for 8 Days when compared to random selection of stocks.</w:t>
+        <w:t>Inverted Hammer renders worse results  at forecasting Lows (following a trend) for 2 Days Additionally, , Highs(following a trend), Lows for 4 Days and, Highs(following a trend), Lows for 8 Days when compared to random selection of stocks.</w:t>
         <w:br/>
-        <w:t>Hanging Man displays slightly better results at forecasting Closes(following a trend) for 2 Days. Additionally  it shows slightly better at  Closes(following a trend) for 4 Days and Closes(following a trend) for 8 Days. Likewise, It shows worse results  at forecasting Highs for 2 Days when compared to random selection of stocks.</w:t>
+        <w:t>Hanging Man displays slightly better results at forecasting Closes(following a trend) for 2 Days. And  it renders slightly better at  Closes(following a trend) for 4 Days and Closes(following a trend) for 8 Days. Similarly, It displays worse results  at forecasting Highs for 2 Days when compared to random selection of stocks.</w:t>
         <w:br/>
-        <w:t xml:space="preserve">Shooting Star yields significantly better results at forecasting Highs(following a trend), Lows (following a trend) for 2 Days. Additionally , Highs(following a trend), Lows (following a trend) for 4 Days and, Highs(following a trend), Lows (following a trend), Closes(following a trend) for 8 Days. Similarly, It  yields slightly better results at forecasting Highs Lows Closes(following a trend) for 2 Days. Likewise  it displays slightly better at  Closes(following a trend) for 4 Days and Lows for 8 Days. </w:t>
+        <w:t xml:space="preserve">Shooting Star yields significantly better results at forecasting Highs(following a trend), Lows (following a trend) for 2 Days. Furthermore , Highs(following a trend), Lows (following a trend) for 4 Days and, Highs(following a trend), Lows (following a trend), Closes(following a trend) for 8 Days. Additionally, It  renders slightly better results at forecasting Highs Lows Closes(following a trend) for 2 Days. Additionally  it displays slightly better at  Closes(following a trend) for 4 Days and Lows for 8 Days. </w:t>
       </w:r>
     </w:p>
     <w:tbl>
@@ -20053,13 +20053,13 @@
         <w:t>during a sustained Bullish market phase.</w:t>
         <w:br/>
         <w:br/>
-        <w:t>Hammer shows significantly better results at forecasting Highs(following a trend) for 2 Days. Furthermore, It  shows slightly better results at forecasting Highs Lows for 2 Days and Highs(following a trend) Lows for 4 Days. Likewise, It shows worse results  at forecasting Closes(following a trend) for 4 Days and, Closes(following a trend) for 8 Days when compared to random selection of stocks.</w:t>
+        <w:t>Hammer yields significantly better results at forecasting Highs(following a trend) for 2 Days. Furthermore, It  shows slightly better results at forecasting Highs Lows for 2 Days and Highs(following a trend) Lows for 4 Days. Moreover, It renders worse results  at forecasting Closes(following a trend) for 4 Days and, Closes(following a trend) for 8 Days when compared to random selection of stocks.</w:t>
         <w:br/>
-        <w:t>Inverted Hammer yields slightly better results at forecasting Closes(following a trend) for 2 Days. Furthermore, It yields worse results  at forecasting Lows for 2 Days when compared to random selection of stocks.</w:t>
+        <w:t>Inverted Hammer shows slightly better results at forecasting Closes(following a trend) for 2 Days. And, It yields worse results  at forecasting Lows for 2 Days when compared to random selection of stocks.</w:t>
         <w:br/>
-        <w:t>Hanging Man renders worse results  at forecasting Highs, Lows (following a trend) for 2 Days Likewise, , Highs, Lows (following a trend) for 4 Days and, Highs(following a trend), Lows (following a trend), Closes(following a trend) for 8 Days when compared to random selection of stocks.</w:t>
+        <w:t>Hanging Man displays worse results  at forecasting Highs, Lows (following a trend) for 2 Days Additionally, , Highs, Lows (following a trend) for 4 Days and, Highs(following a trend), Lows (following a trend), Closes(following a trend) for 8 Days when compared to random selection of stocks.</w:t>
         <w:br/>
-        <w:t>Shooting Star shows significantly better results at forecasting Lows (following a trend) for 2 Days. Likewise, It  renders slightly better results at forecasting Lows for 2 Days and Lows for 4 Days. And, It renders worse results  at forecasting Closes(following a trend) for 2 Days And, , Closes(following a trend) for 4 Days and, Highs(following a trend), Lows (following a trend), Closes for 8 Days when compared to random selection of stocks.</w:t>
+        <w:t>Shooting Star displays significantly better results at forecasting Lows (following a trend) for 2 Days. Additionally, It  shows slightly better results at forecasting Lows for 2 Days and Lows for 4 Days. Likewise, It displays worse results  at forecasting Closes(following a trend) for 2 Days And, , Closes(following a trend) for 4 Days and, Highs(following a trend), Lows (following a trend), Closes for 8 Days when compared to random selection of stocks.</w:t>
       </w:r>
     </w:p>
     <w:tbl>
@@ -22558,11 +22558,11 @@
         <w:t>during a sustained Bearish market phase.</w:t>
         <w:br/>
         <w:br/>
-        <w:t xml:space="preserve">Hammer shows significantly better results at forecasting Lows for 2 Days and, Highs(following a trend), Lows (following a trend) for 4 Days. And, It  displays slightly better results at forecasting Highs for 2 Days. And  it yields slightly better at  Highs Lows for 4 Days and Lows for 8 Days. </w:t>
+        <w:t xml:space="preserve">Hammer shows significantly better results at forecasting Lows for 2 Days and, Highs(following a trend), Lows (following a trend) for 4 Days. Additionally, It  renders slightly better results at forecasting Highs for 2 Days. Furthermore  it displays slightly better at  Highs Lows for 4 Days and Lows for 8 Days. </w:t>
         <w:br/>
-        <w:t>Hanging Man renders significantly better results at forecasting Closes(following a trend) for 8 Days. Additionally, It  renders slightly better results at forecasting Closes(following a trend) for 2 Days. Likewise  it renders slightly better at  Closes(following a trend) for 4 Days and Highs(following a trend) Lows (following a trend) for 8 Days. Moreover, It displays worse results  at forecasting Lows for 2 Days when compared to random selection of stocks.</w:t>
+        <w:t>Hanging Man displays significantly better results at forecasting Closes(following a trend) for 8 Days. Additionally, It  renders slightly better results at forecasting Closes(following a trend) for 2 Days. Furthermore  it displays slightly better at  Closes(following a trend) for 4 Days and Highs(following a trend) Lows (following a trend) for 8 Days. Likewise, It yields worse results  at forecasting Lows for 2 Days when compared to random selection of stocks.</w:t>
         <w:br/>
-        <w:t xml:space="preserve">Shooting Star displays significantly better results at forecasting Lows (following a trend) for 2 Days. Additionally , Lows (following a trend) for 4 Days and, Highs(following a trend), Lows (following a trend), Closes(following a trend) for 8 Days. And, It  renders slightly better results at forecasting Highs Lows for 2 Days and Highs(following a trend) Lows Closes(following a trend) for 4 Days. </w:t>
+        <w:t xml:space="preserve">Shooting Star shows significantly better results at forecasting Lows (following a trend) for 2 Days. And , Lows (following a trend) for 4 Days and, Highs(following a trend), Lows (following a trend), Closes(following a trend) for 8 Days. Additionally, It  displays slightly better results at forecasting Highs Lows for 2 Days and Highs(following a trend) Lows Closes(following a trend) for 4 Days. </w:t>
       </w:r>
     </w:p>
     <w:tbl>
@@ -25061,13 +25061,13 @@
         <w:t>during a sustained Bullish market phase.</w:t>
         <w:br/>
         <w:br/>
-        <w:t>Hammer displays significantly better results at forecasting Highs, Lows for 2 Days. And , Highs, Lows for 4 Days and, Highs, Lows for 8 Days. Similarly, It shows worse results  at forecasting Closes for 2 Days and, Closes(following a trend) for 8 Days when compared to random selection of stocks.</w:t>
+        <w:t>Hammer shows significantly better results at forecasting Highs, Lows for 2 Days. Furthermore , Highs, Lows for 4 Days and, Highs, Lows for 8 Days. Additionally, It yields worse results  at forecasting Closes for 2 Days and, Closes(following a trend) for 8 Days when compared to random selection of stocks.</w:t>
         <w:br/>
-        <w:t>Inverted Hammer yields significantly better results at forecasting Closes(following a trend) for 8 Days. Similarly, It  shows slightly better results at forecasting Closes for 4 Days. Similarly, It shows worse results  at forecasting Closes(following a trend) for 2 Days Moreover, , Highs, Lows for 4 Days and, Highs, Lows for 8 Days when compared to random selection of stocks.</w:t>
+        <w:t>Inverted Hammer displays significantly better results at forecasting Closes(following a trend) for 8 Days. Likewise, It  yields slightly better results at forecasting Closes for 4 Days. Similarly, It shows worse results  at forecasting Closes(following a trend) for 2 Days Additionally, , Highs, Lows for 4 Days and, Highs, Lows for 8 Days when compared to random selection of stocks.</w:t>
         <w:br/>
-        <w:t>Hanging Man renders worse results  at forecasting Closes for 4 Days and, Closes for 8 Days when compared to random selection of stocks.</w:t>
+        <w:t>Hanging Man shows worse results  at forecasting Closes for 4 Days and, Closes for 8 Days when compared to random selection of stocks.</w:t>
         <w:br/>
-        <w:t>Shooting Star shows significantly better results at forecasting Highs, Lows for 2 Days. Additionally, It  shows slightly better results at forecasting Lows (following a trend) for 2 Days and Lows for 4 Days. Additionally, It shows worse results  at forecasting Highs, Lows (following a trend) for 4 Days and, Lows for 8 Days when compared to random selection of stocks.</w:t>
+        <w:t>Shooting Star displays significantly better results at forecasting Highs, Lows for 2 Days. Similarly, It  renders slightly better results at forecasting Lows (following a trend) for 2 Days and Lows for 4 Days. Likewise, It shows worse results  at forecasting Highs, Lows (following a trend) for 4 Days and, Lows for 8 Days when compared to random selection of stocks.</w:t>
       </w:r>
     </w:p>
     <w:tbl>
@@ -26342,13 +26342,13 @@
         <w:t>during a sustained Bearish market phase.</w:t>
         <w:br/>
         <w:br/>
-        <w:t>Hammer renders significantly better results at forecasting Highs, Lows for 2 Days. Additionally , Highs, Lows for 4 Days and, Highs, Lows for 8 Days. And, It  shows slightly better results at forecasting Highs(following a trend) for 8 Days. Likewise, It displays worse results  at forecasting Closes for 2 Days And, , Closes for 4 Days and, Lows (following a trend) for 8 Days when compared to random selection of stocks.</w:t>
+        <w:t>Hammer yields significantly better results at forecasting Highs, Lows for 2 Days. Moreover , Highs, Lows for 4 Days and, Highs, Lows for 8 Days. Additionally, It  shows slightly better results at forecasting Highs(following a trend) for 8 Days. Additionally, It displays worse results  at forecasting Closes for 2 Days And, , Closes for 4 Days and, Lows (following a trend) for 8 Days when compared to random selection of stocks.</w:t>
         <w:br/>
-        <w:t>Inverted Hammer yields slightly better results at forecasting Closes(following a trend) for 4 Days. Furthermore, It displays worse results  at forecasting Closes(following a trend) for 2 Days and, Closes for 4 Days when compared to random selection of stocks.</w:t>
+        <w:t>Inverted Hammer displays slightly better results at forecasting Closes(following a trend) for 4 Days. Moreover, It yields worse results  at forecasting Closes(following a trend) for 2 Days and, Closes for 4 Days when compared to random selection of stocks.</w:t>
         <w:br/>
-        <w:t>Hanging Man renders significantly better results at forecasting Closes(following a trend) for 4 Days and, Highs(following a trend), Lows (following a trend), Closes(following a trend) for 8 Days. Similarly, It  displays slightly better results at forecasting Closes(following a trend) for 2 Days. And, It displays worse results  at forecasting Closes for 2 Days Similarly, , Lows (following a trend), Closes for 4 Days and, Closes for 8 Days when compared to random selection of stocks.</w:t>
+        <w:t>Hanging Man yields significantly better results at forecasting Closes(following a trend) for 4 Days and, Highs(following a trend), Lows (following a trend), Closes(following a trend) for 8 Days. Additionally, It  yields slightly better results at forecasting Closes(following a trend) for 2 Days. Similarly, It renders worse results  at forecasting Closes for 2 Days Similarly, , Lows (following a trend), Closes for 4 Days and, Closes for 8 Days when compared to random selection of stocks.</w:t>
         <w:br/>
-        <w:t>Shooting Star renders significantly better results at forecasting Highs, Lows for 2 Days. Likewise , Highs(following a trend), Lows (following a trend), Closes(following a trend) for 4 Days and, Highs(following a trend), Lows (following a trend), Closes(following a trend) for 8 Days. And, It  yields slightly better results at forecasting Lows for 4 Days. And, It renders worse results  at forecasting Closes(following a trend) for 2 Days and, Highs for 8 Days when compared to random selection of stocks.</w:t>
+        <w:t>Shooting Star yields significantly better results at forecasting Highs, Lows for 2 Days. And , Highs(following a trend), Lows (following a trend), Closes(following a trend) for 4 Days and, Highs(following a trend), Lows (following a trend), Closes(following a trend) for 8 Days. And, It  displays slightly better results at forecasting Lows for 4 Days. Likewise, It displays worse results  at forecasting Closes(following a trend) for 2 Days and, Highs for 8 Days when compared to random selection of stocks.</w:t>
       </w:r>
     </w:p>
     <w:tbl>
@@ -27635,13 +27635,13 @@
         <w:t>during a sustained Bullish market phase.</w:t>
         <w:br/>
         <w:br/>
-        <w:t>Hammer shows significantly better results at forecasting Highs, Lows for 2 Days. Likewise , Highs for 4 Days and, Highs(following a trend), Lows (following a trend) for 8 Days. And, It  shows slightly better results at forecasting Lows for 4 Days. Moreover, It yields worse results  at forecasting Lows for 8 Days when compared to random selection of stocks.</w:t>
+        <w:t>Hammer renders significantly better results at forecasting Highs, Lows for 2 Days. Moreover , Highs for 4 Days and, Highs(following a trend), Lows (following a trend) for 8 Days. And, It  renders slightly better results at forecasting Lows for 4 Days. Similarly, It shows worse results  at forecasting Lows for 8 Days when compared to random selection of stocks.</w:t>
         <w:br/>
-        <w:t>Inverted Hammer shows significantly better results at forecasting Closes for 2 Days. Likewise , Closes for 4 Days and, Closes for 8 Days. And, It  yields slightly better results at forecasting Closes(following a trend) for 2 Days. And, It displays worse results  at forecasting Highs, Lows (following a trend) for 8 Days when compared to random selection of stocks.</w:t>
+        <w:t>Inverted Hammer displays significantly better results at forecasting Closes for 2 Days. And , Closes for 4 Days and, Closes for 8 Days. Similarly, It  yields slightly better results at forecasting Closes(following a trend) for 2 Days. Similarly, It shows worse results  at forecasting Highs, Lows (following a trend) for 8 Days when compared to random selection of stocks.</w:t>
         <w:br/>
-        <w:t>Hanging Man renders significantly better results at forecasting Closes(following a trend) for 2 Days and, Closes for 8 Days. Additionally, It  renders slightly better results at forecasting Closes for 2 Days. Additionally, It displays worse results  at forecasting Lows (following a trend) for 2 Days and, Closes for 4 Days when compared to random selection of stocks.</w:t>
+        <w:t>Hanging Man shows significantly better results at forecasting Closes(following a trend) for 2 Days and, Closes for 8 Days. And, It  renders slightly better results at forecasting Closes for 2 Days. Moreover, It renders worse results  at forecasting Lows (following a trend) for 2 Days and, Closes for 4 Days when compared to random selection of stocks.</w:t>
         <w:br/>
-        <w:t>Shooting Star yields significantly better results at forecasting Highs, Lows for 2 Days. Similarly , Highs, Lows for 4 Days and, Lows for 8 Days. Likewise, It  renders slightly better results at forecasting Lows (following a trend) for 4 Days and Highs for 8 Days. Furthermore, It yields worse results  at forecasting Closes(following a trend) for 2 Days and, Highs(following a trend) for 4 Days when compared to random selection of stocks.</w:t>
+        <w:t>Shooting Star yields significantly better results at forecasting Highs, Lows for 2 Days. Moreover , Highs, Lows for 4 Days and, Lows for 8 Days. Moreover, It  displays slightly better results at forecasting Lows (following a trend) for 4 Days and Highs for 8 Days. And, It renders worse results  at forecasting Closes(following a trend) for 2 Days and, Highs(following a trend) for 4 Days when compared to random selection of stocks.</w:t>
       </w:r>
     </w:p>
     <w:tbl>
@@ -28910,13 +28910,13 @@
         <w:t>during a sustained Bearish market phase.</w:t>
         <w:br/>
         <w:br/>
-        <w:t>Hammer yields significantly better results at forecasting Highs for 2 Days. Additionally, It  displays slightly better results at forecasting Lows for 2 Days. Moreover  it yields slightly better at  Highs Lows for 4 Days and Highs Lows for 8 Days. Similarly, It displays worse results  at forecasting Lows (following a trend) for 4 Days and, Lows (following a trend), Closes for 8 Days when compared to random selection of stocks.</w:t>
+        <w:t>Hammer yields significantly better results at forecasting Highs for 2 Days. Additionally, It  shows slightly better results at forecasting Lows for 2 Days. And  it displays slightly better at  Highs Lows for 4 Days and Highs Lows for 8 Days. And, It shows worse results  at forecasting Lows (following a trend) for 4 Days and, Lows (following a trend), Closes for 8 Days when compared to random selection of stocks.</w:t>
         <w:br/>
-        <w:t>Inverted Hammer renders worse results  at forecasting Highs(following a trend), Closes for 2 Days Likewise, , Closes for 4 Days and, Highs(following a trend), Closes for 8 Days when compared to random selection of stocks.</w:t>
+        <w:t>Inverted Hammer renders worse results  at forecasting Highs(following a trend), Closes for 2 Days And, , Closes for 4 Days and, Highs(following a trend), Closes for 8 Days when compared to random selection of stocks.</w:t>
         <w:br/>
-        <w:t>Hanging Man yields significantly better results at forecasting Closes(following a trend) for 2 Days and, Closes(following a trend) for 4 Days. Moreover, It  displays slightly better results at forecasting Closes(following a trend) for 8 Days. Moreover, It renders worse results  at forecasting Highs(following a trend), Lows (following a trend), Closes for 2 Days Furthermore, , Highs(following a trend) for 4 Days and, Highs(following a trend) for 8 Days when compared to random selection of stocks.</w:t>
+        <w:t>Hanging Man shows significantly better results at forecasting Closes(following a trend) for 2 Days and, Closes(following a trend) for 4 Days. Moreover, It  yields slightly better results at forecasting Closes(following a trend) for 8 Days. Additionally, It renders worse results  at forecasting Highs(following a trend), Lows (following a trend), Closes for 2 Days Additionally, , Highs(following a trend) for 4 Days and, Highs(following a trend) for 8 Days when compared to random selection of stocks.</w:t>
         <w:br/>
-        <w:t>Shooting Star renders significantly better results at forecasting Highs, Lows for 2 Days. Moreover , Highs(following a trend), Lows, Closes(following a trend) for 4 Days and, Highs(following a trend), Lows, Closes(following a trend) for 8 Days. Similarly, It  displays slightly better results at forecasting Closes(following a trend) for 2 Days. Furthermore  it displays slightly better at  Highs for 4 Days and Highs for 8 Days. Moreover, It renders worse results  at forecasting Closes for 2 Days Likewise, , Closes for 4 Days and, Closes for 8 Days when compared to random selection of stocks.</w:t>
+        <w:t>Shooting Star displays significantly better results at forecasting Highs, Lows for 2 Days. Likewise , Highs(following a trend), Lows, Closes(following a trend) for 4 Days and, Highs(following a trend), Lows, Closes(following a trend) for 8 Days. And, It  shows slightly better results at forecasting Closes(following a trend) for 2 Days. Likewise  it renders slightly better at  Highs for 4 Days and Highs for 8 Days. Additionally, It renders worse results  at forecasting Closes for 2 Days Moreover, , Closes for 4 Days and, Closes for 8 Days when compared to random selection of stocks.</w:t>
       </w:r>
     </w:p>
     <w:tbl>
@@ -30218,13 +30218,13 @@
         <w:t>during a sustained Bullish market phase.</w:t>
         <w:br/>
         <w:br/>
-        <w:t>Hammer renders significantly better results at forecasting Highs, Lows for 2 Days. And , Highs, Lows for 4 Days and, Highs, Lows for 8 Days. Furthermore, It  shows slightly better results at forecasting Lows (following a trend) for 2 Days. Likewise, It renders worse results  at forecasting Closes for 4 Days and, Closes for 8 Days when compared to random selection of stocks.</w:t>
+        <w:t>Hammer displays significantly better results at forecasting Highs, Lows for 2 Days. And , Highs, Lows for 4 Days and, Highs, Lows for 8 Days. Furthermore, It  yields slightly better results at forecasting Lows (following a trend) for 2 Days. Moreover, It renders worse results  at forecasting Closes for 4 Days and, Closes for 8 Days when compared to random selection of stocks.</w:t>
         <w:br/>
-        <w:t>Inverted Hammer displays worse results  at forecasting Closes(following a trend) for 2 Days Similarly, , Closes for 4 Days and, Highs(following a trend), Lows (following a trend), Closes for 8 Days when compared to random selection of stocks.</w:t>
+        <w:t>Inverted Hammer renders worse results  at forecasting Closes(following a trend) for 2 Days And, , Closes for 4 Days and, Highs(following a trend), Lows (following a trend), Closes for 8 Days when compared to random selection of stocks.</w:t>
         <w:br/>
         <w:t>Hanging Man shows worse results  at forecasting Closes for 4 Days when compared to random selection of stocks.</w:t>
         <w:br/>
-        <w:t>Shooting Star displays significantly better results at forecasting Highs, Lows for 2 Days and, Highs, Lows for 4 Days. Similarly, It displays worse results  at forecasting Closes for 2 Days when compared to random selection of stocks.</w:t>
+        <w:t>Shooting Star renders significantly better results at forecasting Highs, Lows for 2 Days and, Highs, Lows for 4 Days. Additionally, It displays worse results  at forecasting Closes for 2 Days when compared to random selection of stocks.</w:t>
       </w:r>
     </w:p>
     <w:tbl>
@@ -31481,13 +31481,13 @@
         <w:t>during a sustained Bearish market phase.</w:t>
         <w:br/>
         <w:br/>
-        <w:t>Hammer yields significantly better results at forecasting Highs, Lows for 2 Days and, Highs for 4 Days. Additionally, It  renders slightly better results at forecasting Lows for 4 Days and Highs for 8 Days. Moreover, It yields worse results  at forecasting Highs(following a trend) for 8 Days when compared to random selection of stocks.</w:t>
+        <w:t>Hammer yields significantly better results at forecasting Highs, Lows for 2 Days and, Highs for 4 Days. Additionally, It  shows slightly better results at forecasting Lows for 4 Days and Highs for 8 Days. Similarly, It yields worse results  at forecasting Highs(following a trend) for 8 Days when compared to random selection of stocks.</w:t>
         <w:br/>
-        <w:t>Inverted Hammer yields worse results  at forecasting Closes for 2 Days Likewise, , Highs(following a trend), Closes for 4 Days and, Highs, Closes for 8 Days when compared to random selection of stocks.</w:t>
+        <w:t>Inverted Hammer displays worse results  at forecasting Closes for 2 Days Furthermore, , Highs(following a trend), Closes for 4 Days and, Highs, Closes for 8 Days when compared to random selection of stocks.</w:t>
         <w:br/>
-        <w:t>Hanging Man displays significantly better results at forecasting Closes(following a trend) for 2 Days. Additionally , Highs(following a trend), Closes(following a trend) for 4 Days and, Highs(following a trend), Lows (following a trend), Closes(following a trend) for 8 Days. And, It  shows slightly better results at forecasting Closes for 2 Days and Lows (following a trend) for 4 Days. Similarly, It displays worse results  at forecasting Highs(following a trend), Lows (following a trend) for 2 Days when compared to random selection of stocks.</w:t>
+        <w:t>Hanging Man shows significantly better results at forecasting Closes(following a trend) for 2 Days. And , Highs(following a trend), Closes(following a trend) for 4 Days and, Highs(following a trend), Lows (following a trend), Closes(following a trend) for 8 Days. Likewise, It  shows slightly better results at forecasting Closes for 2 Days and Lows (following a trend) for 4 Days. Furthermore, It renders worse results  at forecasting Highs(following a trend), Lows (following a trend) for 2 Days when compared to random selection of stocks.</w:t>
         <w:br/>
-        <w:t>Shooting Star renders significantly better results at forecasting Highs, Lows for 2 Days. Furthermore , Highs, Lows for 4 Days and, Highs(following a trend), Lows, Closes(following a trend) for 8 Days. Likewise, It  displays slightly better results at forecasting Closes(following a trend) for 2 Days. Additionally, It yields worse results  at forecasting Closes(following a trend) for 4 Days and, Highs for 8 Days when compared to random selection of stocks.</w:t>
+        <w:t>Shooting Star renders significantly better results at forecasting Highs, Lows for 2 Days. Additionally , Highs, Lows for 4 Days and, Highs(following a trend), Lows, Closes(following a trend) for 8 Days. Moreover, It  shows slightly better results at forecasting Closes(following a trend) for 2 Days. Additionally, It renders worse results  at forecasting Closes(following a trend) for 4 Days and, Highs for 8 Days when compared to random selection of stocks.</w:t>
       </w:r>
     </w:p>
     <w:tbl>
@@ -32777,13 +32777,13 @@
         <w:t>during a sustained Bullish market phase.</w:t>
         <w:br/>
         <w:br/>
-        <w:t>Hammer displays significantly better results at forecasting Highs, Lows for 2 Days. Moreover , Highs, Lows for 4 Days and, Highs, Lows (following a trend) for 8 Days. Similarly, It  displays slightly better results at forecasting Lows (following a trend) for 2 Days and Lows for 8 Days. Likewise, It displays worse results  at forecasting Closes for 2 Days Additionally, , Closes(following a trend) for 4 Days and, Closes(following a trend) for 8 Days when compared to random selection of stocks.</w:t>
+        <w:t>Hammer yields significantly better results at forecasting Highs, Lows for 2 Days. Additionally , Highs, Lows for 4 Days and, Highs, Lows (following a trend) for 8 Days. Additionally, It  yields slightly better results at forecasting Lows (following a trend) for 2 Days and Lows for 8 Days. Moreover, It shows worse results  at forecasting Closes for 2 Days Furthermore, , Closes(following a trend) for 4 Days and, Closes(following a trend) for 8 Days when compared to random selection of stocks.</w:t>
         <w:br/>
-        <w:t>Inverted Hammer displays worse results  at forecasting Closes for 2 Days Moreover, , Closes for 4 Days and, Highs(following a trend), Closes for 8 Days when compared to random selection of stocks.</w:t>
+        <w:t>Inverted Hammer yields worse results  at forecasting Closes for 2 Days Moreover, , Closes for 4 Days and, Highs(following a trend), Closes for 8 Days when compared to random selection of stocks.</w:t>
         <w:br/>
-        <w:t>Hanging Man displays slightly better results at forecasting Closes for 4 Days. And, It shows worse results  at forecasting Closes for 2 Days when compared to random selection of stocks.</w:t>
+        <w:t>Hanging Man displays slightly better results at forecasting Closes for 4 Days. Similarly, It renders worse results  at forecasting Closes for 2 Days when compared to random selection of stocks.</w:t>
         <w:br/>
-        <w:t>Shooting Star renders significantly better results at forecasting Lows for 2 Days and, Lows for 8 Days. Moreover, It  renders slightly better results at forecasting Lows (following a trend) for 2 Days and Lows for 4 Days. And, It renders worse results  at forecasting Highs(following a trend), Lows (following a trend) for 4 Days when compared to random selection of stocks.</w:t>
+        <w:t>Shooting Star renders significantly better results at forecasting Lows for 2 Days and, Lows for 8 Days. Similarly, It  shows slightly better results at forecasting Lows (following a trend) for 2 Days and Lows for 4 Days. Similarly, It renders worse results  at forecasting Highs(following a trend), Lows (following a trend) for 4 Days when compared to random selection of stocks.</w:t>
       </w:r>
     </w:p>
     <w:tbl>
@@ -34052,11 +34052,11 @@
         <w:t>during a sustained Bearish market phase.</w:t>
         <w:br/>
         <w:br/>
-        <w:t>Hammer renders significantly better results at forecasting Highs, Lows for 2 Days and, Highs, Lows for 4 Days. Furthermore, It  renders slightly better results at forecasting Highs(following a trend) for 4 Days and Highs for 8 Days. Additionally, It shows worse results  at forecasting Closes(following a trend) for 2 Days Additionally, , Lows (following a trend) for 4 Days and, Highs(following a trend), Lows for 8 Days when compared to random selection of stocks.</w:t>
+        <w:t>Hammer shows significantly better results at forecasting Highs, Lows for 2 Days and, Highs, Lows for 4 Days. Moreover, It  displays slightly better results at forecasting Highs(following a trend) for 4 Days and Highs for 8 Days. Likewise, It shows worse results  at forecasting Closes(following a trend) for 2 Days Furthermore, , Lows (following a trend) for 4 Days and, Highs(following a trend), Lows for 8 Days when compared to random selection of stocks.</w:t>
         <w:br/>
-        <w:t>Hanging Man shows significantly better results at forecasting Closes(following a trend) for 2 Days and, Closes(following a trend) for 4 Days. Moreover, It  shows slightly better results at forecasting Closes for 2 Days. Moreover  it displays slightly better at  Lows (following a trend) for 4 Days and Closes(following a trend) for 8 Days. Additionally, It displays worse results  at forecasting Lows (following a trend) for 2 Days Likewise, , Highs(following a trend), Closes for 4 Days and, Highs(following a trend), Lows (following a trend) for 8 Days when compared to random selection of stocks.</w:t>
+        <w:t>Hanging Man yields significantly better results at forecasting Closes(following a trend) for 2 Days and, Closes(following a trend) for 4 Days. Likewise, It  yields slightly better results at forecasting Closes for 2 Days. Similarly  it displays slightly better at  Lows (following a trend) for 4 Days and Closes(following a trend) for 8 Days. Similarly, It renders worse results  at forecasting Lows (following a trend) for 2 Days Moreover, , Highs(following a trend), Closes for 4 Days and, Highs(following a trend), Lows (following a trend) for 8 Days when compared to random selection of stocks.</w:t>
         <w:br/>
-        <w:t>Shooting Star yields significantly better results at forecasting Highs, Lows, Closes(following a trend) for 2 Days. Furthermore , Highs, Lows for 4 Days and, Highs, Lows, Closes(following a trend) for 8 Days. Furthermore, It  renders slightly better results at forecasting Closes(following a trend) for 4 Days. Furthermore, It shows worse results  at forecasting Closes for 8 Days when compared to random selection of stocks.</w:t>
+        <w:t>Shooting Star yields significantly better results at forecasting Highs, Lows, Closes(following a trend) for 2 Days. Furthermore , Highs, Lows for 4 Days and, Highs, Lows, Closes(following a trend) for 8 Days. Additionally, It  yields slightly better results at forecasting Closes(following a trend) for 4 Days. Additionally, It renders worse results  at forecasting Closes for 8 Days when compared to random selection of stocks.</w:t>
       </w:r>
     </w:p>
     <w:tbl>
@@ -35334,13 +35334,13 @@
         <w:t>during a sustained Bullish market phase.</w:t>
         <w:br/>
         <w:br/>
-        <w:t>Hammer yields significantly better results at forecasting Highs, Lows for 2 Days and, Lows for 4 Days. Likewise, It  renders slightly better results at forecasting Highs Lows (following a trend) for 4 Days and Highs for 8 Days. Similarly, It shows worse results  at forecasting Highs(following a trend) for 4 Days and, Highs(following a trend), Lows (following a trend) for 8 Days when compared to random selection of stocks.</w:t>
+        <w:t>Hammer renders significantly better results at forecasting Highs, Lows for 2 Days and, Lows for 4 Days. And, It  shows slightly better results at forecasting Highs Lows (following a trend) for 4 Days and Highs for 8 Days. And, It displays worse results  at forecasting Highs(following a trend) for 4 Days and, Highs(following a trend), Lows (following a trend) for 8 Days when compared to random selection of stocks.</w:t>
         <w:br/>
-        <w:t>Inverted Hammer yields slightly better results at forecasting Closes(following a trend) for 2 Days. And, It renders worse results  at forecasting Highs(following a trend), Closes for 2 Days Similarly, , Lows (following a trend), Closes for 4 Days and, Highs(following a trend), Closes(following a trend) for 8 Days when compared to random selection of stocks.</w:t>
+        <w:t>Inverted Hammer shows slightly better results at forecasting Closes(following a trend) for 2 Days. Likewise, It displays worse results  at forecasting Highs(following a trend), Closes for 2 Days Moreover, , Lows (following a trend), Closes for 4 Days and, Highs(following a trend), Closes(following a trend) for 8 Days when compared to random selection of stocks.</w:t>
         <w:br/>
         <w:t>Hanging Man renders worse results  at forecasting Closes for 4 Days when compared to random selection of stocks.</w:t>
         <w:br/>
-        <w:t>Shooting Star shows significantly better results at forecasting Lows for 2 Days and, Lows for 4 Days. Moreover, It  yields slightly better results at forecasting Highs for 2 Days. Furthermore, It renders worse results  at forecasting Highs(following a trend) for 2 Days Similarly, , Highs, Lows (following a trend) for 4 Days and, Highs, Lows for 8 Days when compared to random selection of stocks.</w:t>
+        <w:t>Shooting Star shows significantly better results at forecasting Lows for 2 Days and, Lows for 4 Days. And, It  yields slightly better results at forecasting Highs for 2 Days. Similarly, It shows worse results  at forecasting Highs(following a trend) for 2 Days And, , Highs, Lows (following a trend) for 4 Days and, Highs, Lows for 8 Days when compared to random selection of stocks.</w:t>
       </w:r>
     </w:p>
     <w:tbl>
@@ -36594,13 +36594,13 @@
         <w:t>during a sustained Bearish market phase.</w:t>
         <w:br/>
         <w:br/>
-        <w:t>Hammer yields significantly better results at forecasting Highs, Lows for 2 Days. Similarly , Highs, Lows for 4 Days and, Highs, Lows for 8 Days. Furthermore, It displays worse results  at forecasting Closes for 4 Days and, Highs(following a trend), Lows (following a trend) for 8 Days when compared to random selection of stocks.</w:t>
+        <w:t>Hammer yields significantly better results at forecasting Highs, Lows for 2 Days. Moreover , Highs, Lows for 4 Days and, Highs, Lows for 8 Days. And, It yields worse results  at forecasting Closes for 4 Days and, Highs(following a trend), Lows (following a trend) for 8 Days when compared to random selection of stocks.</w:t>
         <w:br/>
-        <w:t>Inverted Hammer displays significantly better results at forecasting Closes for 2 Days and, Closes for 4 Days. Similarly, It displays worse results  at forecasting Closes(following a trend) for 2 Days And, , Highs for 4 Days and, Highs, Closes for 8 Days when compared to random selection of stocks.</w:t>
+        <w:t>Inverted Hammer renders significantly better results at forecasting Closes for 2 Days and, Closes for 4 Days. Moreover, It displays worse results  at forecasting Closes(following a trend) for 2 Days Furthermore, , Highs for 4 Days and, Highs, Closes for 8 Days when compared to random selection of stocks.</w:t>
         <w:br/>
-        <w:t>Hanging Man shows significantly better results at forecasting Closes(following a trend) for 2 Days. Likewise , Closes(following a trend) for 4 Days and, Closes(following a trend) for 8 Days. Moreover, It  displays slightly better results at forecasting Highs(following a trend) Lows (following a trend) for 8 Days. And, It renders worse results  at forecasting Highs(following a trend), Closes for 2 Days And, , Highs(following a trend), Lows (following a trend), Closes for 4 Days and, Closes for 8 Days when compared to random selection of stocks.</w:t>
+        <w:t>Hanging Man shows significantly better results at forecasting Closes(following a trend) for 2 Days. Moreover , Closes(following a trend) for 4 Days and, Closes(following a trend) for 8 Days. Likewise, It  displays slightly better results at forecasting Highs(following a trend) Lows (following a trend) for 8 Days. Additionally, It shows worse results  at forecasting Highs(following a trend), Closes for 2 Days Likewise, , Highs(following a trend), Lows (following a trend), Closes for 4 Days and, Closes for 8 Days when compared to random selection of stocks.</w:t>
         <w:br/>
-        <w:t>Shooting Star yields significantly better results at forecasting Highs, Lows for 2 Days. Similarly , Lows for 4 Days and, Highs(following a trend), Lows (following a trend), Closes(following a trend) for 8 Days. Moreover, It  displays slightly better results at forecasting Highs(following a trend) for 2 Days. Furthermore  it renders slightly better at  Highs(following a trend) for 4 Days and Lows for 8 Days. And, It shows worse results  at forecasting Closes(following a trend) for 2 Days Furthermore, , Highs, Closes(following a trend) for 4 Days and, Closes for 8 Days when compared to random selection of stocks.</w:t>
+        <w:t>Shooting Star renders significantly better results at forecasting Highs, Lows for 2 Days. Additionally , Lows for 4 Days and, Highs(following a trend), Lows (following a trend), Closes(following a trend) for 8 Days. Furthermore, It  yields slightly better results at forecasting Highs(following a trend) for 2 Days. And  it renders slightly better at  Highs(following a trend) for 4 Days and Lows for 8 Days. And, It yields worse results  at forecasting Closes(following a trend) for 2 Days Moreover, , Highs, Closes(following a trend) for 4 Days and, Closes for 8 Days when compared to random selection of stocks.</w:t>
       </w:r>
     </w:p>
     <w:tbl>

</xml_diff>